<commit_message>
Update generated reports with Rule 11/12 dismissal analysis output
https://claude.ai/code/session_01MXWhfSvCBpAktBnEa2jg5f
</commit_message>
<xml_diff>
--- a/output/analysis_report.docx
+++ b/output/analysis_report.docx
@@ -76,7 +76,7 @@
         <w:rPr>
           <w:sz w:val="24"/>
         </w:rPr>
-        <w:t>Report Date: April 07, 2026</w:t>
+        <w:t>Report Date: April 09, 2026</w:t>
       </w:r>
     </w:p>
     <w:p/>
@@ -165,7 +165,7 @@
         <w:t xml:space="preserve">Report Date: </w:t>
       </w:r>
       <w:r>
-        <w:t>2026-04-07 05:03</w:t>
+        <w:t>2026-04-09 01:26</w:t>
       </w:r>
     </w:p>
     <w:p>
@@ -176,7 +176,7 @@
         <w:t xml:space="preserve">Data Sources: </w:t>
       </w:r>
       <w:r>
-        <w:t>8</w:t>
+        <w:t>20</w:t>
       </w:r>
     </w:p>
     <w:p>
@@ -217,7 +217,7 @@
         <w:t xml:space="preserve">Most Recent Filing: </w:t>
       </w:r>
       <w:r>
-        <w:t>2022-02-04</w:t>
+        <w:t>2022-10-26</w:t>
       </w:r>
     </w:p>
     <w:p>
@@ -228,7 +228,7 @@
         <w:t xml:space="preserve">Duration Days: </w:t>
       </w:r>
       <w:r>
-        <w:t>9310</w:t>
+        <w:t>9574</w:t>
       </w:r>
     </w:p>
     <w:p>
@@ -239,7 +239,7 @@
         <w:t xml:space="preserve">Duration Months: </w:t>
       </w:r>
       <w:r>
-        <w:t>305.8</w:t>
+        <w:t>314.5</w:t>
       </w:r>
     </w:p>
     <w:p>
@@ -250,7 +250,7 @@
         <w:t xml:space="preserve">Duration Years: </w:t>
       </w:r>
       <w:r>
-        <w:t>25.49</w:t>
+        <w:t>26.21</w:t>
       </w:r>
     </w:p>
     <w:p>
@@ -261,7 +261,7 @@
         <w:t xml:space="preserve">Total Filings: </w:t>
       </w:r>
       <w:r>
-        <w:t>12</w:t>
+        <w:t>139</w:t>
       </w:r>
     </w:p>
     <w:p>
@@ -272,7 +272,7 @@
         <w:t xml:space="preserve">Filings Per Month: </w:t>
       </w:r>
       <w:r>
-        <w:t>0.04</w:t>
+        <w:t>0.44</w:t>
       </w:r>
     </w:p>
     <w:p>
@@ -324,7 +324,7 @@
         <w:t xml:space="preserve">Case Outcome Score: </w:t>
       </w:r>
       <w:r>
-        <w:t>50.9/100 (MODERATE risk)</w:t>
+        <w:t>41.1/100 (HIGH risk)</w:t>
       </w:r>
     </w:p>
     <w:p>
@@ -335,7 +335,7 @@
         <w:t xml:space="preserve">Violations Found: </w:t>
       </w:r>
       <w:r>
-        <w:t>1</w:t>
+        <w:t>2</w:t>
       </w:r>
     </w:p>
     <w:p>
@@ -346,7 +346,7 @@
         <w:t xml:space="preserve">Officials Tracked: </w:t>
       </w:r>
       <w:r>
-        <w:t>12</w:t>
+        <w:t>32</w:t>
       </w:r>
     </w:p>
     <w:p>
@@ -357,7 +357,7 @@
         <w:t xml:space="preserve">Connections Found: </w:t>
       </w:r>
       <w:r>
-        <w:t>10</w:t>
+        <w:t>6</w:t>
       </w:r>
     </w:p>
     <w:p>
@@ -13996,7 +13996,7 @@
         <w:t xml:space="preserve">Most Recent Filing: </w:t>
       </w:r>
       <w:r>
-        <w:t>2022-02-04</w:t>
+        <w:t>2022-10-26</w:t>
       </w:r>
     </w:p>
     <w:p>
@@ -14007,7 +14007,7 @@
         <w:t xml:space="preserve">Duration Days: </w:t>
       </w:r>
       <w:r>
-        <w:t>9310</w:t>
+        <w:t>9574</w:t>
       </w:r>
     </w:p>
     <w:p>
@@ -14018,7 +14018,7 @@
         <w:t xml:space="preserve">Duration Months: </w:t>
       </w:r>
       <w:r>
-        <w:t>305.8</w:t>
+        <w:t>314.5</w:t>
       </w:r>
     </w:p>
     <w:p>
@@ -14029,7 +14029,7 @@
         <w:t xml:space="preserve">Duration Years: </w:t>
       </w:r>
       <w:r>
-        <w:t>25.49</w:t>
+        <w:t>26.21</w:t>
       </w:r>
     </w:p>
     <w:p>
@@ -14040,7 +14040,7 @@
         <w:t xml:space="preserve">Total Filings: </w:t>
       </w:r>
       <w:r>
-        <w:t>12</w:t>
+        <w:t>139</w:t>
       </w:r>
     </w:p>
     <w:p>
@@ -14051,7 +14051,7 @@
         <w:t xml:space="preserve">Filings Per Month: </w:t>
       </w:r>
       <w:r>
-        <w:t>0.04</w:t>
+        <w:t>0.44</w:t>
       </w:r>
     </w:p>
     <w:p>
@@ -14067,10 +14067,21 @@
         <w:rPr>
           <w:b/>
         </w:rPr>
+        <w:t xml:space="preserve">Filings By Party: </w:t>
+      </w:r>
+      <w:r>
+        <w:t>{}</w:t>
+      </w:r>
+    </w:p>
+    <w:p>
+      <w:r>
+        <w:rPr>
+          <w:b/>
+        </w:rPr>
         <w:t xml:space="preserve">Filings By Year: </w:t>
       </w:r>
       <w:r>
-        <w:t>{1996: 2, 2001: 1, 2011: 2, 2014: 1, 2020: 2, 2021: 1, 2022: 1}</w:t>
+        <w:t>{1996: 2, 2001: 1, 2011: 2, 2014: 1, 2020: 21, 2021: 10, 2022: 100}</w:t>
       </w:r>
     </w:p>
     <w:p>
@@ -14081,7 +14092,7 @@
         <w:t xml:space="preserve">Filings By Month: </w:t>
       </w:r>
       <w:r>
-        <w:t>{'November': 2, 'July': 2, 'December': 2, 'June': 1, 'February': 1, 'August': 1, 'September': 1}</w:t>
+        <w:t>{'July': 32, 'April': 18, 'March': 15, 'December': 15, 'August': 13, 'January': 10, 'June': 9, 'November': 8, 'September': 5, 'May': 5, 'February': 4, 'October': 3}</w:t>
       </w:r>
     </w:p>
     <w:p>
@@ -14092,7 +14103,7 @@
         <w:t xml:space="preserve">Avg Days Between Filings: </w:t>
       </w:r>
       <w:r>
-        <w:t>1034.4</w:t>
+        <w:t>70.1</w:t>
       </w:r>
     </w:p>
     <w:p>
@@ -14103,7 +14114,7 @@
         <w:t xml:space="preserve">Min Days Between Filings: </w:t>
       </w:r>
       <w:r>
-        <w:t>13</w:t>
+        <w:t>0</w:t>
       </w:r>
     </w:p>
     <w:p>
@@ -14114,7 +14125,7 @@
         <w:t xml:space="preserve">Rapid Filings Count: </w:t>
       </w:r>
       <w:r>
-        <w:t>0</w:t>
+        <w:t>110</w:t>
       </w:r>
     </w:p>
     <w:p>
@@ -14125,7 +14136,7 @@
         <w:t xml:space="preserve">Rapid Filing Ratio: </w:t>
       </w:r>
       <w:r>
-        <w:t>0.0</w:t>
+        <w:t>0.809</w:t>
       </w:r>
     </w:p>
     <w:p>
@@ -14240,7 +14251,7 @@
               <w:rPr>
                 <w:sz w:val="18"/>
               </w:rPr>
-              <w:t>Hon. Tonya Newton</w:t>
+              <w:t>NaT</w:t>
             </w:r>
           </w:p>
         </w:tc>
@@ -14253,7 +14264,7 @@
               <w:rPr>
                 <w:sz w:val="18"/>
               </w:rPr>
-              <w:t>Judge</w:t>
+              <w:t>filed_by</w:t>
             </w:r>
           </w:p>
         </w:tc>
@@ -14266,7 +14277,7 @@
               <w:rPr>
                 <w:sz w:val="18"/>
               </w:rPr>
-              <w:t>0</w:t>
+              <w:t>139</w:t>
             </w:r>
           </w:p>
         </w:tc>
@@ -14279,7 +14290,7 @@
               <w:rPr>
                 <w:sz w:val="18"/>
               </w:rPr>
-              <w:t>0</w:t>
+              <w:t>139</w:t>
             </w:r>
           </w:p>
         </w:tc>
@@ -14292,7 +14303,7 @@
               <w:rPr>
                 <w:sz w:val="18"/>
               </w:rPr>
-              <w:t>0</w:t>
+              <w:t>139</w:t>
             </w:r>
           </w:p>
         </w:tc>
@@ -14307,7 +14318,7 @@
               <w:rPr>
                 <w:sz w:val="18"/>
               </w:rPr>
-              <w:t>Hon. Donna Seigler Crouch</w:t>
+              <w:t>Crouch</w:t>
             </w:r>
           </w:p>
         </w:tc>
@@ -14320,7 +14331,7 @@
               <w:rPr>
                 <w:sz w:val="18"/>
               </w:rPr>
-              <w:t>Judge</w:t>
+              <w:t>judge</w:t>
             </w:r>
           </w:p>
         </w:tc>
@@ -14333,7 +14344,7 @@
               <w:rPr>
                 <w:sz w:val="18"/>
               </w:rPr>
-              <w:t>0</w:t>
+              <w:t>10</w:t>
             </w:r>
           </w:p>
         </w:tc>
@@ -14346,7 +14357,7 @@
               <w:rPr>
                 <w:sz w:val="18"/>
               </w:rPr>
-              <w:t>0</w:t>
+              <w:t>10</w:t>
             </w:r>
           </w:p>
         </w:tc>
@@ -14359,7 +14370,7 @@
               <w:rPr>
                 <w:sz w:val="18"/>
               </w:rPr>
-              <w:t>0</w:t>
+              <w:t>10</w:t>
             </w:r>
           </w:p>
         </w:tc>
@@ -14374,7 +14385,7 @@
               <w:rPr>
                 <w:sz w:val="18"/>
               </w:rPr>
-              <w:t>Hon. Seigler</w:t>
+              <w:t>Newton</w:t>
             </w:r>
           </w:p>
         </w:tc>
@@ -14387,7 +14398,7 @@
               <w:rPr>
                 <w:sz w:val="18"/>
               </w:rPr>
-              <w:t>Judge</w:t>
+              <w:t>judge</w:t>
             </w:r>
           </w:p>
         </w:tc>
@@ -14400,7 +14411,7 @@
               <w:rPr>
                 <w:sz w:val="18"/>
               </w:rPr>
-              <w:t>0</w:t>
+              <w:t>1</w:t>
             </w:r>
           </w:p>
         </w:tc>
@@ -14413,7 +14424,7 @@
               <w:rPr>
                 <w:sz w:val="18"/>
               </w:rPr>
-              <w:t>0</w:t>
+              <w:t>1</w:t>
             </w:r>
           </w:p>
         </w:tc>
@@ -14426,7 +14437,7 @@
               <w:rPr>
                 <w:sz w:val="18"/>
               </w:rPr>
-              <w:t>0</w:t>
+              <w:t>1</w:t>
             </w:r>
           </w:p>
         </w:tc>
@@ -14441,7 +14452,7 @@
               <w:rPr>
                 <w:sz w:val="18"/>
               </w:rPr>
-              <w:t>Hon. Zimmerman</w:t>
+              <w:t>Robert Kent Cales IV</w:t>
             </w:r>
           </w:p>
         </w:tc>
@@ -14454,7 +14465,7 @@
               <w:rPr>
                 <w:sz w:val="18"/>
               </w:rPr>
-              <w:t>Judge</w:t>
+              <w:t>Defendant</w:t>
             </w:r>
           </w:p>
         </w:tc>
@@ -14508,7 +14519,7 @@
               <w:rPr>
                 <w:sz w:val="18"/>
               </w:rPr>
-              <w:t>Hon. Hurley</w:t>
+              <w:t>Johnny Alton McManus</w:t>
             </w:r>
           </w:p>
         </w:tc>
@@ -14521,7 +14532,7 @@
               <w:rPr>
                 <w:sz w:val="18"/>
               </w:rPr>
-              <w:t>Judge</w:t>
+              <w:t>Stepfather (Defendant)</w:t>
             </w:r>
           </w:p>
         </w:tc>
@@ -14575,7 +14586,7 @@
               <w:rPr>
                 <w:sz w:val="18"/>
               </w:rPr>
-              <w:t>Suzanne L. Hawkins</w:t>
+              <w:t>Megan Cales</w:t>
             </w:r>
           </w:p>
         </w:tc>
@@ -14588,7 +14599,7 @@
               <w:rPr>
                 <w:sz w:val="18"/>
               </w:rPr>
-              <w:t>Attorney (Plaintiff)</w:t>
+              <w:t>Plaintiff</w:t>
             </w:r>
           </w:p>
         </w:tc>
@@ -14642,7 +14653,7 @@
               <w:rPr>
                 <w:sz w:val="18"/>
               </w:rPr>
-              <w:t>Lawrence Dale Turner</w:t>
+              <w:t>Robert Kent Cales III</w:t>
             </w:r>
           </w:p>
         </w:tc>
@@ -14655,7 +14666,7 @@
               <w:rPr>
                 <w:sz w:val="18"/>
               </w:rPr>
-              <w:t>Attorney (Plaintiff)</w:t>
+              <w:t>Family (Defendant)</w:t>
             </w:r>
           </w:p>
         </w:tc>
@@ -14709,7 +14720,7 @@
               <w:rPr>
                 <w:sz w:val="18"/>
               </w:rPr>
-              <w:t>Joshua Edwin Noah Pozsik</w:t>
+              <w:t>Jane Grugan McManus</w:t>
             </w:r>
           </w:p>
         </w:tc>
@@ -14722,7 +14733,7 @@
               <w:rPr>
                 <w:sz w:val="18"/>
               </w:rPr>
-              <w:t>Attorney (Defendant)</w:t>
+              <w:t>Family (Defendant)</w:t>
             </w:r>
           </w:p>
         </w:tc>
@@ -14776,7 +14787,7 @@
               <w:rPr>
                 <w:sz w:val="18"/>
               </w:rPr>
-              <w:t>Patricia Morr</w:t>
+              <w:t>Chief Magistrate Judge Matthew Johnson</w:t>
             </w:r>
           </w:p>
         </w:tc>
@@ -14789,7 +14800,7 @@
               <w:rPr>
                 <w:sz w:val="18"/>
               </w:rPr>
-              <w:t>Attorney (3rd Party)</w:t>
+              <w:t>Magistrate Judge</w:t>
             </w:r>
           </w:p>
         </w:tc>
@@ -14843,7 +14854,7 @@
               <w:rPr>
                 <w:sz w:val="18"/>
               </w:rPr>
-              <w:t>Amanda Smith Mueller</w:t>
+              <w:t>Judge Greg Seigler</w:t>
             </w:r>
           </w:p>
         </w:tc>
@@ -14856,7 +14867,7 @@
               <w:rPr>
                 <w:sz w:val="18"/>
               </w:rPr>
-              <w:t>Attorney (3rd Party)</w:t>
+              <w:t>Judge</w:t>
             </w:r>
           </w:p>
         </w:tc>
@@ -14910,6 +14921,609 @@
               <w:rPr>
                 <w:sz w:val="18"/>
               </w:rPr>
+              <w:t>Judge Huntley Crouch</w:t>
+            </w:r>
+          </w:p>
+        </w:tc>
+        <w:tc>
+          <w:tcPr>
+            <w:tcW w:type="dxa" w:w="1728"/>
+          </w:tcPr>
+          <w:p>
+            <w:r>
+              <w:rPr>
+                <w:sz w:val="18"/>
+              </w:rPr>
+              <w:t>Judge</w:t>
+            </w:r>
+          </w:p>
+        </w:tc>
+        <w:tc>
+          <w:tcPr>
+            <w:tcW w:type="dxa" w:w="1728"/>
+          </w:tcPr>
+          <w:p>
+            <w:r>
+              <w:rPr>
+                <w:sz w:val="18"/>
+              </w:rPr>
+              <w:t>0</w:t>
+            </w:r>
+          </w:p>
+        </w:tc>
+        <w:tc>
+          <w:tcPr>
+            <w:tcW w:type="dxa" w:w="1728"/>
+          </w:tcPr>
+          <w:p>
+            <w:r>
+              <w:rPr>
+                <w:sz w:val="18"/>
+              </w:rPr>
+              <w:t>0</w:t>
+            </w:r>
+          </w:p>
+        </w:tc>
+        <w:tc>
+          <w:tcPr>
+            <w:tcW w:type="dxa" w:w="1728"/>
+          </w:tcPr>
+          <w:p>
+            <w:r>
+              <w:rPr>
+                <w:sz w:val="18"/>
+              </w:rPr>
+              <w:t>0</w:t>
+            </w:r>
+          </w:p>
+        </w:tc>
+      </w:tr>
+      <w:tr>
+        <w:tc>
+          <w:tcPr>
+            <w:tcW w:type="dxa" w:w="1728"/>
+          </w:tcPr>
+          <w:p>
+            <w:r>
+              <w:rPr>
+                <w:sz w:val="18"/>
+              </w:rPr>
+              <w:t>Judge Robert Newton</w:t>
+            </w:r>
+          </w:p>
+        </w:tc>
+        <w:tc>
+          <w:tcPr>
+            <w:tcW w:type="dxa" w:w="1728"/>
+          </w:tcPr>
+          <w:p>
+            <w:r>
+              <w:rPr>
+                <w:sz w:val="18"/>
+              </w:rPr>
+              <w:t>Judge</w:t>
+            </w:r>
+          </w:p>
+        </w:tc>
+        <w:tc>
+          <w:tcPr>
+            <w:tcW w:type="dxa" w:w="1728"/>
+          </w:tcPr>
+          <w:p>
+            <w:r>
+              <w:rPr>
+                <w:sz w:val="18"/>
+              </w:rPr>
+              <w:t>0</w:t>
+            </w:r>
+          </w:p>
+        </w:tc>
+        <w:tc>
+          <w:tcPr>
+            <w:tcW w:type="dxa" w:w="1728"/>
+          </w:tcPr>
+          <w:p>
+            <w:r>
+              <w:rPr>
+                <w:sz w:val="18"/>
+              </w:rPr>
+              <w:t>0</w:t>
+            </w:r>
+          </w:p>
+        </w:tc>
+        <w:tc>
+          <w:tcPr>
+            <w:tcW w:type="dxa" w:w="1728"/>
+          </w:tcPr>
+          <w:p>
+            <w:r>
+              <w:rPr>
+                <w:sz w:val="18"/>
+              </w:rPr>
+              <w:t>0</w:t>
+            </w:r>
+          </w:p>
+        </w:tc>
+      </w:tr>
+      <w:tr>
+        <w:tc>
+          <w:tcPr>
+            <w:tcW w:type="dxa" w:w="1728"/>
+          </w:tcPr>
+          <w:p>
+            <w:r>
+              <w:rPr>
+                <w:sz w:val="18"/>
+              </w:rPr>
+              <w:t>Joshua Edwin Noah Pozsik</w:t>
+            </w:r>
+          </w:p>
+        </w:tc>
+        <w:tc>
+          <w:tcPr>
+            <w:tcW w:type="dxa" w:w="1728"/>
+          </w:tcPr>
+          <w:p>
+            <w:r>
+              <w:rPr>
+                <w:sz w:val="18"/>
+              </w:rPr>
+              <w:t>Attorney (Defendant)</w:t>
+            </w:r>
+          </w:p>
+        </w:tc>
+        <w:tc>
+          <w:tcPr>
+            <w:tcW w:type="dxa" w:w="1728"/>
+          </w:tcPr>
+          <w:p>
+            <w:r>
+              <w:rPr>
+                <w:sz w:val="18"/>
+              </w:rPr>
+              <w:t>0</w:t>
+            </w:r>
+          </w:p>
+        </w:tc>
+        <w:tc>
+          <w:tcPr>
+            <w:tcW w:type="dxa" w:w="1728"/>
+          </w:tcPr>
+          <w:p>
+            <w:r>
+              <w:rPr>
+                <w:sz w:val="18"/>
+              </w:rPr>
+              <w:t>0</w:t>
+            </w:r>
+          </w:p>
+        </w:tc>
+        <w:tc>
+          <w:tcPr>
+            <w:tcW w:type="dxa" w:w="1728"/>
+          </w:tcPr>
+          <w:p>
+            <w:r>
+              <w:rPr>
+                <w:sz w:val="18"/>
+              </w:rPr>
+              <w:t>0</w:t>
+            </w:r>
+          </w:p>
+        </w:tc>
+      </w:tr>
+      <w:tr>
+        <w:tc>
+          <w:tcPr>
+            <w:tcW w:type="dxa" w:w="1728"/>
+          </w:tcPr>
+          <w:p>
+            <w:r>
+              <w:rPr>
+                <w:sz w:val="18"/>
+              </w:rPr>
+              <w:t>Kerri Cales</w:t>
+            </w:r>
+          </w:p>
+        </w:tc>
+        <w:tc>
+          <w:tcPr>
+            <w:tcW w:type="dxa" w:w="1728"/>
+          </w:tcPr>
+          <w:p>
+            <w:r>
+              <w:rPr>
+                <w:sz w:val="18"/>
+              </w:rPr>
+              <w:t>Family (Defendant)</w:t>
+            </w:r>
+          </w:p>
+        </w:tc>
+        <w:tc>
+          <w:tcPr>
+            <w:tcW w:type="dxa" w:w="1728"/>
+          </w:tcPr>
+          <w:p>
+            <w:r>
+              <w:rPr>
+                <w:sz w:val="18"/>
+              </w:rPr>
+              <w:t>0</w:t>
+            </w:r>
+          </w:p>
+        </w:tc>
+        <w:tc>
+          <w:tcPr>
+            <w:tcW w:type="dxa" w:w="1728"/>
+          </w:tcPr>
+          <w:p>
+            <w:r>
+              <w:rPr>
+                <w:sz w:val="18"/>
+              </w:rPr>
+              <w:t>0</w:t>
+            </w:r>
+          </w:p>
+        </w:tc>
+        <w:tc>
+          <w:tcPr>
+            <w:tcW w:type="dxa" w:w="1728"/>
+          </w:tcPr>
+          <w:p>
+            <w:r>
+              <w:rPr>
+                <w:sz w:val="18"/>
+              </w:rPr>
+              <w:t>0</w:t>
+            </w:r>
+          </w:p>
+        </w:tc>
+      </w:tr>
+      <w:tr>
+        <w:tc>
+          <w:tcPr>
+            <w:tcW w:type="dxa" w:w="1728"/>
+          </w:tcPr>
+          <w:p>
+            <w:r>
+              <w:rPr>
+                <w:sz w:val="18"/>
+              </w:rPr>
+              <w:t>AnnMarie McManus</w:t>
+            </w:r>
+          </w:p>
+        </w:tc>
+        <w:tc>
+          <w:tcPr>
+            <w:tcW w:type="dxa" w:w="1728"/>
+          </w:tcPr>
+          <w:p>
+            <w:r>
+              <w:rPr>
+                <w:sz w:val="18"/>
+              </w:rPr>
+              <w:t>Family (Defendant)</w:t>
+            </w:r>
+          </w:p>
+        </w:tc>
+        <w:tc>
+          <w:tcPr>
+            <w:tcW w:type="dxa" w:w="1728"/>
+          </w:tcPr>
+          <w:p>
+            <w:r>
+              <w:rPr>
+                <w:sz w:val="18"/>
+              </w:rPr>
+              <w:t>0</w:t>
+            </w:r>
+          </w:p>
+        </w:tc>
+        <w:tc>
+          <w:tcPr>
+            <w:tcW w:type="dxa" w:w="1728"/>
+          </w:tcPr>
+          <w:p>
+            <w:r>
+              <w:rPr>
+                <w:sz w:val="18"/>
+              </w:rPr>
+              <w:t>0</w:t>
+            </w:r>
+          </w:p>
+        </w:tc>
+        <w:tc>
+          <w:tcPr>
+            <w:tcW w:type="dxa" w:w="1728"/>
+          </w:tcPr>
+          <w:p>
+            <w:r>
+              <w:rPr>
+                <w:sz w:val="18"/>
+              </w:rPr>
+              <w:t>0</w:t>
+            </w:r>
+          </w:p>
+        </w:tc>
+      </w:tr>
+      <w:tr>
+        <w:tc>
+          <w:tcPr>
+            <w:tcW w:type="dxa" w:w="1728"/>
+          </w:tcPr>
+          <w:p>
+            <w:r>
+              <w:rPr>
+                <w:sz w:val="18"/>
+              </w:rPr>
+              <w:t>Jaxson Cales</w:t>
+            </w:r>
+          </w:p>
+        </w:tc>
+        <w:tc>
+          <w:tcPr>
+            <w:tcW w:type="dxa" w:w="1728"/>
+          </w:tcPr>
+          <w:p>
+            <w:r>
+              <w:rPr>
+                <w:sz w:val="18"/>
+              </w:rPr>
+              <w:t>Family (Defendant)</w:t>
+            </w:r>
+          </w:p>
+        </w:tc>
+        <w:tc>
+          <w:tcPr>
+            <w:tcW w:type="dxa" w:w="1728"/>
+          </w:tcPr>
+          <w:p>
+            <w:r>
+              <w:rPr>
+                <w:sz w:val="18"/>
+              </w:rPr>
+              <w:t>0</w:t>
+            </w:r>
+          </w:p>
+        </w:tc>
+        <w:tc>
+          <w:tcPr>
+            <w:tcW w:type="dxa" w:w="1728"/>
+          </w:tcPr>
+          <w:p>
+            <w:r>
+              <w:rPr>
+                <w:sz w:val="18"/>
+              </w:rPr>
+              <w:t>0</w:t>
+            </w:r>
+          </w:p>
+        </w:tc>
+        <w:tc>
+          <w:tcPr>
+            <w:tcW w:type="dxa" w:w="1728"/>
+          </w:tcPr>
+          <w:p>
+            <w:r>
+              <w:rPr>
+                <w:sz w:val="18"/>
+              </w:rPr>
+              <w:t>0</w:t>
+            </w:r>
+          </w:p>
+        </w:tc>
+      </w:tr>
+      <w:tr>
+        <w:tc>
+          <w:tcPr>
+            <w:tcW w:type="dxa" w:w="1728"/>
+          </w:tcPr>
+          <w:p>
+            <w:r>
+              <w:rPr>
+                <w:sz w:val="18"/>
+              </w:rPr>
+              <w:t>Patricia Morr</w:t>
+            </w:r>
+          </w:p>
+        </w:tc>
+        <w:tc>
+          <w:tcPr>
+            <w:tcW w:type="dxa" w:w="1728"/>
+          </w:tcPr>
+          <w:p>
+            <w:r>
+              <w:rPr>
+                <w:sz w:val="18"/>
+              </w:rPr>
+              <w:t>Attorney (3rd Party)</w:t>
+            </w:r>
+          </w:p>
+        </w:tc>
+        <w:tc>
+          <w:tcPr>
+            <w:tcW w:type="dxa" w:w="1728"/>
+          </w:tcPr>
+          <w:p>
+            <w:r>
+              <w:rPr>
+                <w:sz w:val="18"/>
+              </w:rPr>
+              <w:t>0</w:t>
+            </w:r>
+          </w:p>
+        </w:tc>
+        <w:tc>
+          <w:tcPr>
+            <w:tcW w:type="dxa" w:w="1728"/>
+          </w:tcPr>
+          <w:p>
+            <w:r>
+              <w:rPr>
+                <w:sz w:val="18"/>
+              </w:rPr>
+              <w:t>0</w:t>
+            </w:r>
+          </w:p>
+        </w:tc>
+        <w:tc>
+          <w:tcPr>
+            <w:tcW w:type="dxa" w:w="1728"/>
+          </w:tcPr>
+          <w:p>
+            <w:r>
+              <w:rPr>
+                <w:sz w:val="18"/>
+              </w:rPr>
+              <w:t>0</w:t>
+            </w:r>
+          </w:p>
+        </w:tc>
+      </w:tr>
+      <w:tr>
+        <w:tc>
+          <w:tcPr>
+            <w:tcW w:type="dxa" w:w="1728"/>
+          </w:tcPr>
+          <w:p>
+            <w:r>
+              <w:rPr>
+                <w:sz w:val="18"/>
+              </w:rPr>
+              <w:t>Amanda Smith Mueller</w:t>
+            </w:r>
+          </w:p>
+        </w:tc>
+        <w:tc>
+          <w:tcPr>
+            <w:tcW w:type="dxa" w:w="1728"/>
+          </w:tcPr>
+          <w:p>
+            <w:r>
+              <w:rPr>
+                <w:sz w:val="18"/>
+              </w:rPr>
+              <w:t>Attorney (3rd Party)</w:t>
+            </w:r>
+          </w:p>
+        </w:tc>
+        <w:tc>
+          <w:tcPr>
+            <w:tcW w:type="dxa" w:w="1728"/>
+          </w:tcPr>
+          <w:p>
+            <w:r>
+              <w:rPr>
+                <w:sz w:val="18"/>
+              </w:rPr>
+              <w:t>0</w:t>
+            </w:r>
+          </w:p>
+        </w:tc>
+        <w:tc>
+          <w:tcPr>
+            <w:tcW w:type="dxa" w:w="1728"/>
+          </w:tcPr>
+          <w:p>
+            <w:r>
+              <w:rPr>
+                <w:sz w:val="18"/>
+              </w:rPr>
+              <w:t>0</w:t>
+            </w:r>
+          </w:p>
+        </w:tc>
+        <w:tc>
+          <w:tcPr>
+            <w:tcW w:type="dxa" w:w="1728"/>
+          </w:tcPr>
+          <w:p>
+            <w:r>
+              <w:rPr>
+                <w:sz w:val="18"/>
+              </w:rPr>
+              <w:t>0</w:t>
+            </w:r>
+          </w:p>
+        </w:tc>
+      </w:tr>
+      <w:tr>
+        <w:tc>
+          <w:tcPr>
+            <w:tcW w:type="dxa" w:w="1728"/>
+          </w:tcPr>
+          <w:p>
+            <w:r>
+              <w:rPr>
+                <w:sz w:val="18"/>
+              </w:rPr>
+              <w:t>Linda Carpenter</w:t>
+            </w:r>
+          </w:p>
+        </w:tc>
+        <w:tc>
+          <w:tcPr>
+            <w:tcW w:type="dxa" w:w="1728"/>
+          </w:tcPr>
+          <w:p>
+            <w:r>
+              <w:rPr>
+                <w:sz w:val="18"/>
+              </w:rPr>
+              <w:t>Attorney</w:t>
+            </w:r>
+          </w:p>
+        </w:tc>
+        <w:tc>
+          <w:tcPr>
+            <w:tcW w:type="dxa" w:w="1728"/>
+          </w:tcPr>
+          <w:p>
+            <w:r>
+              <w:rPr>
+                <w:sz w:val="18"/>
+              </w:rPr>
+              <w:t>0</w:t>
+            </w:r>
+          </w:p>
+        </w:tc>
+        <w:tc>
+          <w:tcPr>
+            <w:tcW w:type="dxa" w:w="1728"/>
+          </w:tcPr>
+          <w:p>
+            <w:r>
+              <w:rPr>
+                <w:sz w:val="18"/>
+              </w:rPr>
+              <w:t>0</w:t>
+            </w:r>
+          </w:p>
+        </w:tc>
+        <w:tc>
+          <w:tcPr>
+            <w:tcW w:type="dxa" w:w="1728"/>
+          </w:tcPr>
+          <w:p>
+            <w:r>
+              <w:rPr>
+                <w:sz w:val="18"/>
+              </w:rPr>
+              <w:t>0</w:t>
+            </w:r>
+          </w:p>
+        </w:tc>
+      </w:tr>
+      <w:tr>
+        <w:tc>
+          <w:tcPr>
+            <w:tcW w:type="dxa" w:w="1728"/>
+          </w:tcPr>
+          <w:p>
+            <w:r>
+              <w:rPr>
+                <w:sz w:val="18"/>
+              </w:rPr>
               <w:t>Emily Hinson</w:t>
             </w:r>
           </w:p>
@@ -14924,6 +15538,743 @@
                 <w:sz w:val="18"/>
               </w:rPr>
               <w:t>Guardian Ad Litem</w:t>
+            </w:r>
+          </w:p>
+        </w:tc>
+        <w:tc>
+          <w:tcPr>
+            <w:tcW w:type="dxa" w:w="1728"/>
+          </w:tcPr>
+          <w:p>
+            <w:r>
+              <w:rPr>
+                <w:sz w:val="18"/>
+              </w:rPr>
+              <w:t>0</w:t>
+            </w:r>
+          </w:p>
+        </w:tc>
+        <w:tc>
+          <w:tcPr>
+            <w:tcW w:type="dxa" w:w="1728"/>
+          </w:tcPr>
+          <w:p>
+            <w:r>
+              <w:rPr>
+                <w:sz w:val="18"/>
+              </w:rPr>
+              <w:t>0</w:t>
+            </w:r>
+          </w:p>
+        </w:tc>
+        <w:tc>
+          <w:tcPr>
+            <w:tcW w:type="dxa" w:w="1728"/>
+          </w:tcPr>
+          <w:p>
+            <w:r>
+              <w:rPr>
+                <w:sz w:val="18"/>
+              </w:rPr>
+              <w:t>0</w:t>
+            </w:r>
+          </w:p>
+        </w:tc>
+      </w:tr>
+      <w:tr>
+        <w:tc>
+          <w:tcPr>
+            <w:tcW w:type="dxa" w:w="1728"/>
+          </w:tcPr>
+          <w:p>
+            <w:r>
+              <w:rPr>
+                <w:sz w:val="18"/>
+              </w:rPr>
+              <w:t>Gary Paul Pozsik</w:t>
+            </w:r>
+          </w:p>
+        </w:tc>
+        <w:tc>
+          <w:tcPr>
+            <w:tcW w:type="dxa" w:w="1728"/>
+          </w:tcPr>
+          <w:p>
+            <w:r>
+              <w:rPr>
+                <w:sz w:val="18"/>
+              </w:rPr>
+              <w:t>Notary</w:t>
+            </w:r>
+          </w:p>
+        </w:tc>
+        <w:tc>
+          <w:tcPr>
+            <w:tcW w:type="dxa" w:w="1728"/>
+          </w:tcPr>
+          <w:p>
+            <w:r>
+              <w:rPr>
+                <w:sz w:val="18"/>
+              </w:rPr>
+              <w:t>0</w:t>
+            </w:r>
+          </w:p>
+        </w:tc>
+        <w:tc>
+          <w:tcPr>
+            <w:tcW w:type="dxa" w:w="1728"/>
+          </w:tcPr>
+          <w:p>
+            <w:r>
+              <w:rPr>
+                <w:sz w:val="18"/>
+              </w:rPr>
+              <w:t>0</w:t>
+            </w:r>
+          </w:p>
+        </w:tc>
+        <w:tc>
+          <w:tcPr>
+            <w:tcW w:type="dxa" w:w="1728"/>
+          </w:tcPr>
+          <w:p>
+            <w:r>
+              <w:rPr>
+                <w:sz w:val="18"/>
+              </w:rPr>
+              <w:t>0</w:t>
+            </w:r>
+          </w:p>
+        </w:tc>
+      </w:tr>
+      <w:tr>
+        <w:tc>
+          <w:tcPr>
+            <w:tcW w:type="dxa" w:w="1728"/>
+          </w:tcPr>
+          <w:p>
+            <w:r>
+              <w:rPr>
+                <w:sz w:val="18"/>
+              </w:rPr>
+              <w:t>Suzanne Lorraine Hawkins</w:t>
+            </w:r>
+          </w:p>
+        </w:tc>
+        <w:tc>
+          <w:tcPr>
+            <w:tcW w:type="dxa" w:w="1728"/>
+          </w:tcPr>
+          <w:p>
+            <w:r>
+              <w:rPr>
+                <w:sz w:val="18"/>
+              </w:rPr>
+              <w:t>Attorney (Plaintiff)</w:t>
+            </w:r>
+          </w:p>
+        </w:tc>
+        <w:tc>
+          <w:tcPr>
+            <w:tcW w:type="dxa" w:w="1728"/>
+          </w:tcPr>
+          <w:p>
+            <w:r>
+              <w:rPr>
+                <w:sz w:val="18"/>
+              </w:rPr>
+              <w:t>0</w:t>
+            </w:r>
+          </w:p>
+        </w:tc>
+        <w:tc>
+          <w:tcPr>
+            <w:tcW w:type="dxa" w:w="1728"/>
+          </w:tcPr>
+          <w:p>
+            <w:r>
+              <w:rPr>
+                <w:sz w:val="18"/>
+              </w:rPr>
+              <w:t>0</w:t>
+            </w:r>
+          </w:p>
+        </w:tc>
+        <w:tc>
+          <w:tcPr>
+            <w:tcW w:type="dxa" w:w="1728"/>
+          </w:tcPr>
+          <w:p>
+            <w:r>
+              <w:rPr>
+                <w:sz w:val="18"/>
+              </w:rPr>
+              <w:t>0</w:t>
+            </w:r>
+          </w:p>
+        </w:tc>
+      </w:tr>
+      <w:tr>
+        <w:tc>
+          <w:tcPr>
+            <w:tcW w:type="dxa" w:w="1728"/>
+          </w:tcPr>
+          <w:p>
+            <w:r>
+              <w:rPr>
+                <w:sz w:val="18"/>
+              </w:rPr>
+              <w:t>Suzanne Atkins Hawkins</w:t>
+            </w:r>
+          </w:p>
+        </w:tc>
+        <w:tc>
+          <w:tcPr>
+            <w:tcW w:type="dxa" w:w="1728"/>
+          </w:tcPr>
+          <w:p>
+            <w:r>
+              <w:rPr>
+                <w:sz w:val="18"/>
+              </w:rPr>
+              <w:t>Attorney</w:t>
+            </w:r>
+          </w:p>
+        </w:tc>
+        <w:tc>
+          <w:tcPr>
+            <w:tcW w:type="dxa" w:w="1728"/>
+          </w:tcPr>
+          <w:p>
+            <w:r>
+              <w:rPr>
+                <w:sz w:val="18"/>
+              </w:rPr>
+              <w:t>0</w:t>
+            </w:r>
+          </w:p>
+        </w:tc>
+        <w:tc>
+          <w:tcPr>
+            <w:tcW w:type="dxa" w:w="1728"/>
+          </w:tcPr>
+          <w:p>
+            <w:r>
+              <w:rPr>
+                <w:sz w:val="18"/>
+              </w:rPr>
+              <w:t>0</w:t>
+            </w:r>
+          </w:p>
+        </w:tc>
+        <w:tc>
+          <w:tcPr>
+            <w:tcW w:type="dxa" w:w="1728"/>
+          </w:tcPr>
+          <w:p>
+            <w:r>
+              <w:rPr>
+                <w:sz w:val="18"/>
+              </w:rPr>
+              <w:t>0</w:t>
+            </w:r>
+          </w:p>
+        </w:tc>
+      </w:tr>
+      <w:tr>
+        <w:tc>
+          <w:tcPr>
+            <w:tcW w:type="dxa" w:w="1728"/>
+          </w:tcPr>
+          <w:p>
+            <w:r>
+              <w:rPr>
+                <w:sz w:val="18"/>
+              </w:rPr>
+              <w:t>Lawrence Dale Turner</w:t>
+            </w:r>
+          </w:p>
+        </w:tc>
+        <w:tc>
+          <w:tcPr>
+            <w:tcW w:type="dxa" w:w="1728"/>
+          </w:tcPr>
+          <w:p>
+            <w:r>
+              <w:rPr>
+                <w:sz w:val="18"/>
+              </w:rPr>
+              <w:t>Attorney (Plaintiff)</w:t>
+            </w:r>
+          </w:p>
+        </w:tc>
+        <w:tc>
+          <w:tcPr>
+            <w:tcW w:type="dxa" w:w="1728"/>
+          </w:tcPr>
+          <w:p>
+            <w:r>
+              <w:rPr>
+                <w:sz w:val="18"/>
+              </w:rPr>
+              <w:t>0</w:t>
+            </w:r>
+          </w:p>
+        </w:tc>
+        <w:tc>
+          <w:tcPr>
+            <w:tcW w:type="dxa" w:w="1728"/>
+          </w:tcPr>
+          <w:p>
+            <w:r>
+              <w:rPr>
+                <w:sz w:val="18"/>
+              </w:rPr>
+              <w:t>0</w:t>
+            </w:r>
+          </w:p>
+        </w:tc>
+        <w:tc>
+          <w:tcPr>
+            <w:tcW w:type="dxa" w:w="1728"/>
+          </w:tcPr>
+          <w:p>
+            <w:r>
+              <w:rPr>
+                <w:sz w:val="18"/>
+              </w:rPr>
+              <w:t>0</w:t>
+            </w:r>
+          </w:p>
+        </w:tc>
+      </w:tr>
+      <w:tr>
+        <w:tc>
+          <w:tcPr>
+            <w:tcW w:type="dxa" w:w="1728"/>
+          </w:tcPr>
+          <w:p>
+            <w:r>
+              <w:rPr>
+                <w:sz w:val="18"/>
+              </w:rPr>
+              <w:t>Melissa Atwood</w:t>
+            </w:r>
+          </w:p>
+        </w:tc>
+        <w:tc>
+          <w:tcPr>
+            <w:tcW w:type="dxa" w:w="1728"/>
+          </w:tcPr>
+          <w:p>
+            <w:r>
+              <w:rPr>
+                <w:sz w:val="18"/>
+              </w:rPr>
+              <w:t>Notary</w:t>
+            </w:r>
+          </w:p>
+        </w:tc>
+        <w:tc>
+          <w:tcPr>
+            <w:tcW w:type="dxa" w:w="1728"/>
+          </w:tcPr>
+          <w:p>
+            <w:r>
+              <w:rPr>
+                <w:sz w:val="18"/>
+              </w:rPr>
+              <w:t>0</w:t>
+            </w:r>
+          </w:p>
+        </w:tc>
+        <w:tc>
+          <w:tcPr>
+            <w:tcW w:type="dxa" w:w="1728"/>
+          </w:tcPr>
+          <w:p>
+            <w:r>
+              <w:rPr>
+                <w:sz w:val="18"/>
+              </w:rPr>
+              <w:t>0</w:t>
+            </w:r>
+          </w:p>
+        </w:tc>
+        <w:tc>
+          <w:tcPr>
+            <w:tcW w:type="dxa" w:w="1728"/>
+          </w:tcPr>
+          <w:p>
+            <w:r>
+              <w:rPr>
+                <w:sz w:val="18"/>
+              </w:rPr>
+              <w:t>0</w:t>
+            </w:r>
+          </w:p>
+        </w:tc>
+      </w:tr>
+      <w:tr>
+        <w:tc>
+          <w:tcPr>
+            <w:tcW w:type="dxa" w:w="1728"/>
+          </w:tcPr>
+          <w:p>
+            <w:r>
+              <w:rPr>
+                <w:sz w:val="18"/>
+              </w:rPr>
+              <w:t>Donna Strom</w:t>
+            </w:r>
+          </w:p>
+        </w:tc>
+        <w:tc>
+          <w:tcPr>
+            <w:tcW w:type="dxa" w:w="1728"/>
+          </w:tcPr>
+          <w:p>
+            <w:r>
+              <w:rPr>
+                <w:sz w:val="18"/>
+              </w:rPr>
+              <w:t>Notary</w:t>
+            </w:r>
+          </w:p>
+        </w:tc>
+        <w:tc>
+          <w:tcPr>
+            <w:tcW w:type="dxa" w:w="1728"/>
+          </w:tcPr>
+          <w:p>
+            <w:r>
+              <w:rPr>
+                <w:sz w:val="18"/>
+              </w:rPr>
+              <w:t>0</w:t>
+            </w:r>
+          </w:p>
+        </w:tc>
+        <w:tc>
+          <w:tcPr>
+            <w:tcW w:type="dxa" w:w="1728"/>
+          </w:tcPr>
+          <w:p>
+            <w:r>
+              <w:rPr>
+                <w:sz w:val="18"/>
+              </w:rPr>
+              <w:t>0</w:t>
+            </w:r>
+          </w:p>
+        </w:tc>
+        <w:tc>
+          <w:tcPr>
+            <w:tcW w:type="dxa" w:w="1728"/>
+          </w:tcPr>
+          <w:p>
+            <w:r>
+              <w:rPr>
+                <w:sz w:val="18"/>
+              </w:rPr>
+              <w:t>0</w:t>
+            </w:r>
+          </w:p>
+        </w:tc>
+      </w:tr>
+      <w:tr>
+        <w:tc>
+          <w:tcPr>
+            <w:tcW w:type="dxa" w:w="1728"/>
+          </w:tcPr>
+          <w:p>
+            <w:r>
+              <w:rPr>
+                <w:sz w:val="18"/>
+              </w:rPr>
+              <w:t>Mindy Zimmerman</w:t>
+            </w:r>
+          </w:p>
+        </w:tc>
+        <w:tc>
+          <w:tcPr>
+            <w:tcW w:type="dxa" w:w="1728"/>
+          </w:tcPr>
+          <w:p>
+            <w:r>
+              <w:rPr>
+                <w:sz w:val="18"/>
+              </w:rPr>
+              <w:t>Connected Party</w:t>
+            </w:r>
+          </w:p>
+        </w:tc>
+        <w:tc>
+          <w:tcPr>
+            <w:tcW w:type="dxa" w:w="1728"/>
+          </w:tcPr>
+          <w:p>
+            <w:r>
+              <w:rPr>
+                <w:sz w:val="18"/>
+              </w:rPr>
+              <w:t>0</w:t>
+            </w:r>
+          </w:p>
+        </w:tc>
+        <w:tc>
+          <w:tcPr>
+            <w:tcW w:type="dxa" w:w="1728"/>
+          </w:tcPr>
+          <w:p>
+            <w:r>
+              <w:rPr>
+                <w:sz w:val="18"/>
+              </w:rPr>
+              <w:t>0</w:t>
+            </w:r>
+          </w:p>
+        </w:tc>
+        <w:tc>
+          <w:tcPr>
+            <w:tcW w:type="dxa" w:w="1728"/>
+          </w:tcPr>
+          <w:p>
+            <w:r>
+              <w:rPr>
+                <w:sz w:val="18"/>
+              </w:rPr>
+              <w:t>0</w:t>
+            </w:r>
+          </w:p>
+        </w:tc>
+      </w:tr>
+      <w:tr>
+        <w:tc>
+          <w:tcPr>
+            <w:tcW w:type="dxa" w:w="1728"/>
+          </w:tcPr>
+          <w:p>
+            <w:r>
+              <w:rPr>
+                <w:sz w:val="18"/>
+              </w:rPr>
+              <w:t>Tresa B. Wolfe</w:t>
+            </w:r>
+          </w:p>
+        </w:tc>
+        <w:tc>
+          <w:tcPr>
+            <w:tcW w:type="dxa" w:w="1728"/>
+          </w:tcPr>
+          <w:p>
+            <w:r>
+              <w:rPr>
+                <w:sz w:val="18"/>
+              </w:rPr>
+              <w:t>Notary</w:t>
+            </w:r>
+          </w:p>
+        </w:tc>
+        <w:tc>
+          <w:tcPr>
+            <w:tcW w:type="dxa" w:w="1728"/>
+          </w:tcPr>
+          <w:p>
+            <w:r>
+              <w:rPr>
+                <w:sz w:val="18"/>
+              </w:rPr>
+              <w:t>0</w:t>
+            </w:r>
+          </w:p>
+        </w:tc>
+        <w:tc>
+          <w:tcPr>
+            <w:tcW w:type="dxa" w:w="1728"/>
+          </w:tcPr>
+          <w:p>
+            <w:r>
+              <w:rPr>
+                <w:sz w:val="18"/>
+              </w:rPr>
+              <w:t>0</w:t>
+            </w:r>
+          </w:p>
+        </w:tc>
+        <w:tc>
+          <w:tcPr>
+            <w:tcW w:type="dxa" w:w="1728"/>
+          </w:tcPr>
+          <w:p>
+            <w:r>
+              <w:rPr>
+                <w:sz w:val="18"/>
+              </w:rPr>
+              <w:t>0</w:t>
+            </w:r>
+          </w:p>
+        </w:tc>
+      </w:tr>
+      <w:tr>
+        <w:tc>
+          <w:tcPr>
+            <w:tcW w:type="dxa" w:w="1728"/>
+          </w:tcPr>
+          <w:p>
+            <w:r>
+              <w:rPr>
+                <w:sz w:val="18"/>
+              </w:rPr>
+              <w:t>Stephanie Fajardo</w:t>
+            </w:r>
+          </w:p>
+        </w:tc>
+        <w:tc>
+          <w:tcPr>
+            <w:tcW w:type="dxa" w:w="1728"/>
+          </w:tcPr>
+          <w:p>
+            <w:r>
+              <w:rPr>
+                <w:sz w:val="18"/>
+              </w:rPr>
+              <w:t>Conflict</w:t>
+            </w:r>
+          </w:p>
+        </w:tc>
+        <w:tc>
+          <w:tcPr>
+            <w:tcW w:type="dxa" w:w="1728"/>
+          </w:tcPr>
+          <w:p>
+            <w:r>
+              <w:rPr>
+                <w:sz w:val="18"/>
+              </w:rPr>
+              <w:t>0</w:t>
+            </w:r>
+          </w:p>
+        </w:tc>
+        <w:tc>
+          <w:tcPr>
+            <w:tcW w:type="dxa" w:w="1728"/>
+          </w:tcPr>
+          <w:p>
+            <w:r>
+              <w:rPr>
+                <w:sz w:val="18"/>
+              </w:rPr>
+              <w:t>0</w:t>
+            </w:r>
+          </w:p>
+        </w:tc>
+        <w:tc>
+          <w:tcPr>
+            <w:tcW w:type="dxa" w:w="1728"/>
+          </w:tcPr>
+          <w:p>
+            <w:r>
+              <w:rPr>
+                <w:sz w:val="18"/>
+              </w:rPr>
+              <w:t>0</w:t>
+            </w:r>
+          </w:p>
+        </w:tc>
+      </w:tr>
+      <w:tr>
+        <w:tc>
+          <w:tcPr>
+            <w:tcW w:type="dxa" w:w="1728"/>
+          </w:tcPr>
+          <w:p>
+            <w:r>
+              <w:rPr>
+                <w:sz w:val="18"/>
+              </w:rPr>
+              <w:t>Jewitte Dooley</w:t>
+            </w:r>
+          </w:p>
+        </w:tc>
+        <w:tc>
+          <w:tcPr>
+            <w:tcW w:type="dxa" w:w="1728"/>
+          </w:tcPr>
+          <w:p>
+            <w:r>
+              <w:rPr>
+                <w:sz w:val="18"/>
+              </w:rPr>
+              <w:t>Conflict</w:t>
+            </w:r>
+          </w:p>
+        </w:tc>
+        <w:tc>
+          <w:tcPr>
+            <w:tcW w:type="dxa" w:w="1728"/>
+          </w:tcPr>
+          <w:p>
+            <w:r>
+              <w:rPr>
+                <w:sz w:val="18"/>
+              </w:rPr>
+              <w:t>0</w:t>
+            </w:r>
+          </w:p>
+        </w:tc>
+        <w:tc>
+          <w:tcPr>
+            <w:tcW w:type="dxa" w:w="1728"/>
+          </w:tcPr>
+          <w:p>
+            <w:r>
+              <w:rPr>
+                <w:sz w:val="18"/>
+              </w:rPr>
+              <w:t>0</w:t>
+            </w:r>
+          </w:p>
+        </w:tc>
+        <w:tc>
+          <w:tcPr>
+            <w:tcW w:type="dxa" w:w="1728"/>
+          </w:tcPr>
+          <w:p>
+            <w:r>
+              <w:rPr>
+                <w:sz w:val="18"/>
+              </w:rPr>
+              <w:t>0</w:t>
+            </w:r>
+          </w:p>
+        </w:tc>
+      </w:tr>
+      <w:tr>
+        <w:tc>
+          <w:tcPr>
+            <w:tcW w:type="dxa" w:w="1728"/>
+          </w:tcPr>
+          <w:p>
+            <w:r>
+              <w:rPr>
+                <w:sz w:val="18"/>
+              </w:rPr>
+              <w:t>Kenneth Wiggins</w:t>
+            </w:r>
+          </w:p>
+        </w:tc>
+        <w:tc>
+          <w:tcPr>
+            <w:tcW w:type="dxa" w:w="1728"/>
+          </w:tcPr>
+          <w:p>
+            <w:r>
+              <w:rPr>
+                <w:sz w:val="18"/>
+              </w:rPr>
+              <w:t>Attorney (FL)</w:t>
             </w:r>
           </w:p>
         </w:tc>
@@ -15154,7 +16505,7 @@
               <w:rPr>
                 <w:sz w:val="18"/>
               </w:rPr>
-              <w:t>Hon. Tonya Newton</w:t>
+              <w:t>Robert Kent Cales IV</w:t>
             </w:r>
           </w:p>
         </w:tc>
@@ -15167,7 +16518,7 @@
               <w:rPr>
                 <w:sz w:val="18"/>
               </w:rPr>
-              <w:t>Judge</w:t>
+              <w:t>Defendant</w:t>
             </w:r>
           </w:p>
         </w:tc>
@@ -15193,7 +16544,7 @@
               <w:rPr>
                 <w:sz w:val="18"/>
               </w:rPr>
-              <w:t>0</w:t>
+              <w:t>250</w:t>
             </w:r>
           </w:p>
         </w:tc>
@@ -15234,7 +16585,7 @@
               <w:rPr>
                 <w:sz w:val="18"/>
               </w:rPr>
-              <w:t>Hon. Donna Seigler Crouch</w:t>
+              <w:t>Megan Cales</w:t>
             </w:r>
           </w:p>
         </w:tc>
@@ -15247,7 +16598,7 @@
               <w:rPr>
                 <w:sz w:val="18"/>
               </w:rPr>
-              <w:t>Judge</w:t>
+              <w:t>Plaintiff</w:t>
             </w:r>
           </w:p>
         </w:tc>
@@ -15273,7 +16624,7 @@
               <w:rPr>
                 <w:sz w:val="18"/>
               </w:rPr>
-              <w:t>0</w:t>
+              <w:t>250</w:t>
             </w:r>
           </w:p>
         </w:tc>
@@ -15314,7 +16665,7 @@
               <w:rPr>
                 <w:sz w:val="18"/>
               </w:rPr>
-              <w:t>Hon. Seigler</w:t>
+              <w:t>Robert Kent Cales III</w:t>
             </w:r>
           </w:p>
         </w:tc>
@@ -15327,7 +16678,7 @@
               <w:rPr>
                 <w:sz w:val="18"/>
               </w:rPr>
-              <w:t>Judge</w:t>
+              <w:t>Family (Defendant)</w:t>
             </w:r>
           </w:p>
         </w:tc>
@@ -15353,7 +16704,7 @@
               <w:rPr>
                 <w:sz w:val="18"/>
               </w:rPr>
-              <w:t>0</w:t>
+              <w:t>250</w:t>
             </w:r>
           </w:p>
         </w:tc>
@@ -15394,7 +16745,7 @@
               <w:rPr>
                 <w:sz w:val="18"/>
               </w:rPr>
-              <w:t>Hon. Zimmerman</w:t>
+              <w:t>Jane Grugan McManus</w:t>
             </w:r>
           </w:p>
         </w:tc>
@@ -15407,7 +16758,7 @@
               <w:rPr>
                 <w:sz w:val="18"/>
               </w:rPr>
-              <w:t>Judge</w:t>
+              <w:t>Family (Defendant)</w:t>
             </w:r>
           </w:p>
         </w:tc>
@@ -15433,7 +16784,7 @@
               <w:rPr>
                 <w:sz w:val="18"/>
               </w:rPr>
-              <w:t>0</w:t>
+              <w:t>250</w:t>
             </w:r>
           </w:p>
         </w:tc>
@@ -15474,7 +16825,7 @@
               <w:rPr>
                 <w:sz w:val="18"/>
               </w:rPr>
-              <w:t>Hon. Hurley</w:t>
+              <w:t>Johnny Alton McManus</w:t>
             </w:r>
           </w:p>
         </w:tc>
@@ -15487,7 +16838,7 @@
               <w:rPr>
                 <w:sz w:val="18"/>
               </w:rPr>
-              <w:t>Judge</w:t>
+              <w:t>Stepfather (Defendant)</w:t>
             </w:r>
           </w:p>
         </w:tc>
@@ -15513,7 +16864,7 @@
               <w:rPr>
                 <w:sz w:val="18"/>
               </w:rPr>
-              <w:t>0</w:t>
+              <w:t>250</w:t>
             </w:r>
           </w:p>
         </w:tc>
@@ -15554,7 +16905,7 @@
               <w:rPr>
                 <w:sz w:val="18"/>
               </w:rPr>
-              <w:t>Suzanne L. Hawkins</w:t>
+              <w:t>Kerri Cales</w:t>
             </w:r>
           </w:p>
         </w:tc>
@@ -15567,7 +16918,7 @@
               <w:rPr>
                 <w:sz w:val="18"/>
               </w:rPr>
-              <w:t>Attorney (Plaintiff)</w:t>
+              <w:t>Family (Defendant)</w:t>
             </w:r>
           </w:p>
         </w:tc>
@@ -15634,7 +16985,7 @@
               <w:rPr>
                 <w:sz w:val="18"/>
               </w:rPr>
-              <w:t>Lawrence Dale Turner</w:t>
+              <w:t>AnnMarie McManus</w:t>
             </w:r>
           </w:p>
         </w:tc>
@@ -15647,7 +16998,7 @@
               <w:rPr>
                 <w:sz w:val="18"/>
               </w:rPr>
-              <w:t>Attorney (Plaintiff)</w:t>
+              <w:t>Family (Defendant)</w:t>
             </w:r>
           </w:p>
         </w:tc>
@@ -15714,7 +17065,7 @@
               <w:rPr>
                 <w:sz w:val="18"/>
               </w:rPr>
-              <w:t>Joshua Edwin Noah Pozsik</w:t>
+              <w:t>Jaxson Cales</w:t>
             </w:r>
           </w:p>
         </w:tc>
@@ -15727,7 +17078,7 @@
               <w:rPr>
                 <w:sz w:val="18"/>
               </w:rPr>
-              <w:t>Attorney (Defendant)</w:t>
+              <w:t>Family (Defendant)</w:t>
             </w:r>
           </w:p>
         </w:tc>
@@ -15794,7 +17145,7 @@
               <w:rPr>
                 <w:sz w:val="18"/>
               </w:rPr>
-              <w:t>Patricia Morr</w:t>
+              <w:t>Chief Magistrate Judge Matthew Johnson</w:t>
             </w:r>
           </w:p>
         </w:tc>
@@ -15807,7 +17158,7 @@
               <w:rPr>
                 <w:sz w:val="18"/>
               </w:rPr>
-              <w:t>Attorney (3rd Party)</w:t>
+              <w:t>Magistrate Judge</w:t>
             </w:r>
           </w:p>
         </w:tc>
@@ -15874,7 +17225,7 @@
               <w:rPr>
                 <w:sz w:val="18"/>
               </w:rPr>
-              <w:t>Amanda Smith Mueller</w:t>
+              <w:t>Judge Greg Seigler</w:t>
             </w:r>
           </w:p>
         </w:tc>
@@ -15887,7 +17238,7 @@
               <w:rPr>
                 <w:sz w:val="18"/>
               </w:rPr>
-              <w:t>Attorney (3rd Party)</w:t>
+              <w:t>Judge</w:t>
             </w:r>
           </w:p>
         </w:tc>
@@ -15913,7 +17264,7 @@
               <w:rPr>
                 <w:sz w:val="18"/>
               </w:rPr>
-              <w:t>250</w:t>
+              <w:t>0</w:t>
             </w:r>
           </w:p>
         </w:tc>
@@ -15954,7 +17305,7 @@
               <w:rPr>
                 <w:sz w:val="18"/>
               </w:rPr>
-              <w:t>Emily Hinson</w:t>
+              <w:t>Judge Huntley Crouch</w:t>
             </w:r>
           </w:p>
         </w:tc>
@@ -15967,7 +17318,7 @@
               <w:rPr>
                 <w:sz w:val="18"/>
               </w:rPr>
-              <w:t>Guardian Ad Litem</w:t>
+              <w:t>Judge</w:t>
             </w:r>
           </w:p>
         </w:tc>
@@ -15993,7 +17344,7 @@
               <w:rPr>
                 <w:sz w:val="18"/>
               </w:rPr>
-              <w:t>250</w:t>
+              <w:t>0</w:t>
             </w:r>
           </w:p>
         </w:tc>
@@ -16034,6 +17385,1366 @@
               <w:rPr>
                 <w:sz w:val="18"/>
               </w:rPr>
+              <w:t>Judge Robert Newton</w:t>
+            </w:r>
+          </w:p>
+        </w:tc>
+        <w:tc>
+          <w:tcPr>
+            <w:tcW w:type="dxa" w:w="1440"/>
+          </w:tcPr>
+          <w:p>
+            <w:r>
+              <w:rPr>
+                <w:sz w:val="18"/>
+              </w:rPr>
+              <w:t>Judge</w:t>
+            </w:r>
+          </w:p>
+        </w:tc>
+        <w:tc>
+          <w:tcPr>
+            <w:tcW w:type="dxa" w:w="1440"/>
+          </w:tcPr>
+          <w:p>
+            <w:r>
+              <w:rPr>
+                <w:sz w:val="18"/>
+              </w:rPr>
+              <w:t>0</w:t>
+            </w:r>
+          </w:p>
+        </w:tc>
+        <w:tc>
+          <w:tcPr>
+            <w:tcW w:type="dxa" w:w="1440"/>
+          </w:tcPr>
+          <w:p>
+            <w:r>
+              <w:rPr>
+                <w:sz w:val="18"/>
+              </w:rPr>
+              <w:t>0</w:t>
+            </w:r>
+          </w:p>
+        </w:tc>
+        <w:tc>
+          <w:tcPr>
+            <w:tcW w:type="dxa" w:w="1440"/>
+          </w:tcPr>
+          <w:p>
+            <w:r>
+              <w:rPr>
+                <w:sz w:val="18"/>
+              </w:rPr>
+              <w:t>0</w:t>
+            </w:r>
+          </w:p>
+        </w:tc>
+        <w:tc>
+          <w:tcPr>
+            <w:tcW w:type="dxa" w:w="1440"/>
+          </w:tcPr>
+          <w:p>
+            <w:r>
+              <w:rPr>
+                <w:sz w:val="18"/>
+              </w:rPr>
+              <w:t>0</w:t>
+            </w:r>
+          </w:p>
+        </w:tc>
+      </w:tr>
+      <w:tr>
+        <w:tc>
+          <w:tcPr>
+            <w:tcW w:type="dxa" w:w="1440"/>
+          </w:tcPr>
+          <w:p>
+            <w:r>
+              <w:rPr>
+                <w:sz w:val="18"/>
+              </w:rPr>
+              <w:t>Joshua Edwin Noah Pozsik</w:t>
+            </w:r>
+          </w:p>
+        </w:tc>
+        <w:tc>
+          <w:tcPr>
+            <w:tcW w:type="dxa" w:w="1440"/>
+          </w:tcPr>
+          <w:p>
+            <w:r>
+              <w:rPr>
+                <w:sz w:val="18"/>
+              </w:rPr>
+              <w:t>Attorney (Defendant)</w:t>
+            </w:r>
+          </w:p>
+        </w:tc>
+        <w:tc>
+          <w:tcPr>
+            <w:tcW w:type="dxa" w:w="1440"/>
+          </w:tcPr>
+          <w:p>
+            <w:r>
+              <w:rPr>
+                <w:sz w:val="18"/>
+              </w:rPr>
+              <w:t>0</w:t>
+            </w:r>
+          </w:p>
+        </w:tc>
+        <w:tc>
+          <w:tcPr>
+            <w:tcW w:type="dxa" w:w="1440"/>
+          </w:tcPr>
+          <w:p>
+            <w:r>
+              <w:rPr>
+                <w:sz w:val="18"/>
+              </w:rPr>
+              <w:t>250</w:t>
+            </w:r>
+          </w:p>
+        </w:tc>
+        <w:tc>
+          <w:tcPr>
+            <w:tcW w:type="dxa" w:w="1440"/>
+          </w:tcPr>
+          <w:p>
+            <w:r>
+              <w:rPr>
+                <w:sz w:val="18"/>
+              </w:rPr>
+              <w:t>0</w:t>
+            </w:r>
+          </w:p>
+        </w:tc>
+        <w:tc>
+          <w:tcPr>
+            <w:tcW w:type="dxa" w:w="1440"/>
+          </w:tcPr>
+          <w:p>
+            <w:r>
+              <w:rPr>
+                <w:sz w:val="18"/>
+              </w:rPr>
+              <w:t>0</w:t>
+            </w:r>
+          </w:p>
+        </w:tc>
+      </w:tr>
+      <w:tr>
+        <w:tc>
+          <w:tcPr>
+            <w:tcW w:type="dxa" w:w="1440"/>
+          </w:tcPr>
+          <w:p>
+            <w:r>
+              <w:rPr>
+                <w:sz w:val="18"/>
+              </w:rPr>
+              <w:t>Linda Carpenter</w:t>
+            </w:r>
+          </w:p>
+        </w:tc>
+        <w:tc>
+          <w:tcPr>
+            <w:tcW w:type="dxa" w:w="1440"/>
+          </w:tcPr>
+          <w:p>
+            <w:r>
+              <w:rPr>
+                <w:sz w:val="18"/>
+              </w:rPr>
+              <w:t>Attorney</w:t>
+            </w:r>
+          </w:p>
+        </w:tc>
+        <w:tc>
+          <w:tcPr>
+            <w:tcW w:type="dxa" w:w="1440"/>
+          </w:tcPr>
+          <w:p>
+            <w:r>
+              <w:rPr>
+                <w:sz w:val="18"/>
+              </w:rPr>
+              <w:t>0</w:t>
+            </w:r>
+          </w:p>
+        </w:tc>
+        <w:tc>
+          <w:tcPr>
+            <w:tcW w:type="dxa" w:w="1440"/>
+          </w:tcPr>
+          <w:p>
+            <w:r>
+              <w:rPr>
+                <w:sz w:val="18"/>
+              </w:rPr>
+              <w:t>350</w:t>
+            </w:r>
+          </w:p>
+        </w:tc>
+        <w:tc>
+          <w:tcPr>
+            <w:tcW w:type="dxa" w:w="1440"/>
+          </w:tcPr>
+          <w:p>
+            <w:r>
+              <w:rPr>
+                <w:sz w:val="18"/>
+              </w:rPr>
+              <w:t>0</w:t>
+            </w:r>
+          </w:p>
+        </w:tc>
+        <w:tc>
+          <w:tcPr>
+            <w:tcW w:type="dxa" w:w="1440"/>
+          </w:tcPr>
+          <w:p>
+            <w:r>
+              <w:rPr>
+                <w:sz w:val="18"/>
+              </w:rPr>
+              <w:t>0</w:t>
+            </w:r>
+          </w:p>
+        </w:tc>
+      </w:tr>
+      <w:tr>
+        <w:tc>
+          <w:tcPr>
+            <w:tcW w:type="dxa" w:w="1440"/>
+          </w:tcPr>
+          <w:p>
+            <w:r>
+              <w:rPr>
+                <w:sz w:val="18"/>
+              </w:rPr>
+              <w:t>Amanda Smith Mueller</w:t>
+            </w:r>
+          </w:p>
+        </w:tc>
+        <w:tc>
+          <w:tcPr>
+            <w:tcW w:type="dxa" w:w="1440"/>
+          </w:tcPr>
+          <w:p>
+            <w:r>
+              <w:rPr>
+                <w:sz w:val="18"/>
+              </w:rPr>
+              <w:t>Attorney (3rd Party)</w:t>
+            </w:r>
+          </w:p>
+        </w:tc>
+        <w:tc>
+          <w:tcPr>
+            <w:tcW w:type="dxa" w:w="1440"/>
+          </w:tcPr>
+          <w:p>
+            <w:r>
+              <w:rPr>
+                <w:sz w:val="18"/>
+              </w:rPr>
+              <w:t>0</w:t>
+            </w:r>
+          </w:p>
+        </w:tc>
+        <w:tc>
+          <w:tcPr>
+            <w:tcW w:type="dxa" w:w="1440"/>
+          </w:tcPr>
+          <w:p>
+            <w:r>
+              <w:rPr>
+                <w:sz w:val="18"/>
+              </w:rPr>
+              <w:t>250</w:t>
+            </w:r>
+          </w:p>
+        </w:tc>
+        <w:tc>
+          <w:tcPr>
+            <w:tcW w:type="dxa" w:w="1440"/>
+          </w:tcPr>
+          <w:p>
+            <w:r>
+              <w:rPr>
+                <w:sz w:val="18"/>
+              </w:rPr>
+              <w:t>0</w:t>
+            </w:r>
+          </w:p>
+        </w:tc>
+        <w:tc>
+          <w:tcPr>
+            <w:tcW w:type="dxa" w:w="1440"/>
+          </w:tcPr>
+          <w:p>
+            <w:r>
+              <w:rPr>
+                <w:sz w:val="18"/>
+              </w:rPr>
+              <w:t>0</w:t>
+            </w:r>
+          </w:p>
+        </w:tc>
+      </w:tr>
+      <w:tr>
+        <w:tc>
+          <w:tcPr>
+            <w:tcW w:type="dxa" w:w="1440"/>
+          </w:tcPr>
+          <w:p>
+            <w:r>
+              <w:rPr>
+                <w:sz w:val="18"/>
+              </w:rPr>
+              <w:t>Patricia Morr</w:t>
+            </w:r>
+          </w:p>
+        </w:tc>
+        <w:tc>
+          <w:tcPr>
+            <w:tcW w:type="dxa" w:w="1440"/>
+          </w:tcPr>
+          <w:p>
+            <w:r>
+              <w:rPr>
+                <w:sz w:val="18"/>
+              </w:rPr>
+              <w:t>Attorney (3rd Party)</w:t>
+            </w:r>
+          </w:p>
+        </w:tc>
+        <w:tc>
+          <w:tcPr>
+            <w:tcW w:type="dxa" w:w="1440"/>
+          </w:tcPr>
+          <w:p>
+            <w:r>
+              <w:rPr>
+                <w:sz w:val="18"/>
+              </w:rPr>
+              <w:t>0</w:t>
+            </w:r>
+          </w:p>
+        </w:tc>
+        <w:tc>
+          <w:tcPr>
+            <w:tcW w:type="dxa" w:w="1440"/>
+          </w:tcPr>
+          <w:p>
+            <w:r>
+              <w:rPr>
+                <w:sz w:val="18"/>
+              </w:rPr>
+              <w:t>250</w:t>
+            </w:r>
+          </w:p>
+        </w:tc>
+        <w:tc>
+          <w:tcPr>
+            <w:tcW w:type="dxa" w:w="1440"/>
+          </w:tcPr>
+          <w:p>
+            <w:r>
+              <w:rPr>
+                <w:sz w:val="18"/>
+              </w:rPr>
+              <w:t>0</w:t>
+            </w:r>
+          </w:p>
+        </w:tc>
+        <w:tc>
+          <w:tcPr>
+            <w:tcW w:type="dxa" w:w="1440"/>
+          </w:tcPr>
+          <w:p>
+            <w:r>
+              <w:rPr>
+                <w:sz w:val="18"/>
+              </w:rPr>
+              <w:t>0</w:t>
+            </w:r>
+          </w:p>
+        </w:tc>
+      </w:tr>
+      <w:tr>
+        <w:tc>
+          <w:tcPr>
+            <w:tcW w:type="dxa" w:w="1440"/>
+          </w:tcPr>
+          <w:p>
+            <w:r>
+              <w:rPr>
+                <w:sz w:val="18"/>
+              </w:rPr>
+              <w:t>Emily Hinson</w:t>
+            </w:r>
+          </w:p>
+        </w:tc>
+        <w:tc>
+          <w:tcPr>
+            <w:tcW w:type="dxa" w:w="1440"/>
+          </w:tcPr>
+          <w:p>
+            <w:r>
+              <w:rPr>
+                <w:sz w:val="18"/>
+              </w:rPr>
+              <w:t>Guardian Ad Litem</w:t>
+            </w:r>
+          </w:p>
+        </w:tc>
+        <w:tc>
+          <w:tcPr>
+            <w:tcW w:type="dxa" w:w="1440"/>
+          </w:tcPr>
+          <w:p>
+            <w:r>
+              <w:rPr>
+                <w:sz w:val="18"/>
+              </w:rPr>
+              <w:t>0</w:t>
+            </w:r>
+          </w:p>
+        </w:tc>
+        <w:tc>
+          <w:tcPr>
+            <w:tcW w:type="dxa" w:w="1440"/>
+          </w:tcPr>
+          <w:p>
+            <w:r>
+              <w:rPr>
+                <w:sz w:val="18"/>
+              </w:rPr>
+              <w:t>250</w:t>
+            </w:r>
+          </w:p>
+        </w:tc>
+        <w:tc>
+          <w:tcPr>
+            <w:tcW w:type="dxa" w:w="1440"/>
+          </w:tcPr>
+          <w:p>
+            <w:r>
+              <w:rPr>
+                <w:sz w:val="18"/>
+              </w:rPr>
+              <w:t>0</w:t>
+            </w:r>
+          </w:p>
+        </w:tc>
+        <w:tc>
+          <w:tcPr>
+            <w:tcW w:type="dxa" w:w="1440"/>
+          </w:tcPr>
+          <w:p>
+            <w:r>
+              <w:rPr>
+                <w:sz w:val="18"/>
+              </w:rPr>
+              <w:t>0</w:t>
+            </w:r>
+          </w:p>
+        </w:tc>
+      </w:tr>
+      <w:tr>
+        <w:tc>
+          <w:tcPr>
+            <w:tcW w:type="dxa" w:w="1440"/>
+          </w:tcPr>
+          <w:p>
+            <w:r>
+              <w:rPr>
+                <w:sz w:val="18"/>
+              </w:rPr>
+              <w:t>Suzanne Lorraine Hawkins</w:t>
+            </w:r>
+          </w:p>
+        </w:tc>
+        <w:tc>
+          <w:tcPr>
+            <w:tcW w:type="dxa" w:w="1440"/>
+          </w:tcPr>
+          <w:p>
+            <w:r>
+              <w:rPr>
+                <w:sz w:val="18"/>
+              </w:rPr>
+              <w:t>Attorney (Plaintiff)</w:t>
+            </w:r>
+          </w:p>
+        </w:tc>
+        <w:tc>
+          <w:tcPr>
+            <w:tcW w:type="dxa" w:w="1440"/>
+          </w:tcPr>
+          <w:p>
+            <w:r>
+              <w:rPr>
+                <w:sz w:val="18"/>
+              </w:rPr>
+              <w:t>0</w:t>
+            </w:r>
+          </w:p>
+        </w:tc>
+        <w:tc>
+          <w:tcPr>
+            <w:tcW w:type="dxa" w:w="1440"/>
+          </w:tcPr>
+          <w:p>
+            <w:r>
+              <w:rPr>
+                <w:sz w:val="18"/>
+              </w:rPr>
+              <w:t>250</w:t>
+            </w:r>
+          </w:p>
+        </w:tc>
+        <w:tc>
+          <w:tcPr>
+            <w:tcW w:type="dxa" w:w="1440"/>
+          </w:tcPr>
+          <w:p>
+            <w:r>
+              <w:rPr>
+                <w:sz w:val="18"/>
+              </w:rPr>
+              <w:t>0</w:t>
+            </w:r>
+          </w:p>
+        </w:tc>
+        <w:tc>
+          <w:tcPr>
+            <w:tcW w:type="dxa" w:w="1440"/>
+          </w:tcPr>
+          <w:p>
+            <w:r>
+              <w:rPr>
+                <w:sz w:val="18"/>
+              </w:rPr>
+              <w:t>0</w:t>
+            </w:r>
+          </w:p>
+        </w:tc>
+      </w:tr>
+      <w:tr>
+        <w:tc>
+          <w:tcPr>
+            <w:tcW w:type="dxa" w:w="1440"/>
+          </w:tcPr>
+          <w:p>
+            <w:r>
+              <w:rPr>
+                <w:sz w:val="18"/>
+              </w:rPr>
+              <w:t>Suzanne Atkins Hawkins</w:t>
+            </w:r>
+          </w:p>
+        </w:tc>
+        <w:tc>
+          <w:tcPr>
+            <w:tcW w:type="dxa" w:w="1440"/>
+          </w:tcPr>
+          <w:p>
+            <w:r>
+              <w:rPr>
+                <w:sz w:val="18"/>
+              </w:rPr>
+              <w:t>Attorney</w:t>
+            </w:r>
+          </w:p>
+        </w:tc>
+        <w:tc>
+          <w:tcPr>
+            <w:tcW w:type="dxa" w:w="1440"/>
+          </w:tcPr>
+          <w:p>
+            <w:r>
+              <w:rPr>
+                <w:sz w:val="18"/>
+              </w:rPr>
+              <w:t>0</w:t>
+            </w:r>
+          </w:p>
+        </w:tc>
+        <w:tc>
+          <w:tcPr>
+            <w:tcW w:type="dxa" w:w="1440"/>
+          </w:tcPr>
+          <w:p>
+            <w:r>
+              <w:rPr>
+                <w:sz w:val="18"/>
+              </w:rPr>
+              <w:t>350</w:t>
+            </w:r>
+          </w:p>
+        </w:tc>
+        <w:tc>
+          <w:tcPr>
+            <w:tcW w:type="dxa" w:w="1440"/>
+          </w:tcPr>
+          <w:p>
+            <w:r>
+              <w:rPr>
+                <w:sz w:val="18"/>
+              </w:rPr>
+              <w:t>0</w:t>
+            </w:r>
+          </w:p>
+        </w:tc>
+        <w:tc>
+          <w:tcPr>
+            <w:tcW w:type="dxa" w:w="1440"/>
+          </w:tcPr>
+          <w:p>
+            <w:r>
+              <w:rPr>
+                <w:sz w:val="18"/>
+              </w:rPr>
+              <w:t>0</w:t>
+            </w:r>
+          </w:p>
+        </w:tc>
+      </w:tr>
+      <w:tr>
+        <w:tc>
+          <w:tcPr>
+            <w:tcW w:type="dxa" w:w="1440"/>
+          </w:tcPr>
+          <w:p>
+            <w:r>
+              <w:rPr>
+                <w:sz w:val="18"/>
+              </w:rPr>
+              <w:t>Lawrence Dale Turner</w:t>
+            </w:r>
+          </w:p>
+        </w:tc>
+        <w:tc>
+          <w:tcPr>
+            <w:tcW w:type="dxa" w:w="1440"/>
+          </w:tcPr>
+          <w:p>
+            <w:r>
+              <w:rPr>
+                <w:sz w:val="18"/>
+              </w:rPr>
+              <w:t>Attorney (Plaintiff)</w:t>
+            </w:r>
+          </w:p>
+        </w:tc>
+        <w:tc>
+          <w:tcPr>
+            <w:tcW w:type="dxa" w:w="1440"/>
+          </w:tcPr>
+          <w:p>
+            <w:r>
+              <w:rPr>
+                <w:sz w:val="18"/>
+              </w:rPr>
+              <w:t>0</w:t>
+            </w:r>
+          </w:p>
+        </w:tc>
+        <w:tc>
+          <w:tcPr>
+            <w:tcW w:type="dxa" w:w="1440"/>
+          </w:tcPr>
+          <w:p>
+            <w:r>
+              <w:rPr>
+                <w:sz w:val="18"/>
+              </w:rPr>
+              <w:t>250</w:t>
+            </w:r>
+          </w:p>
+        </w:tc>
+        <w:tc>
+          <w:tcPr>
+            <w:tcW w:type="dxa" w:w="1440"/>
+          </w:tcPr>
+          <w:p>
+            <w:r>
+              <w:rPr>
+                <w:sz w:val="18"/>
+              </w:rPr>
+              <w:t>0</w:t>
+            </w:r>
+          </w:p>
+        </w:tc>
+        <w:tc>
+          <w:tcPr>
+            <w:tcW w:type="dxa" w:w="1440"/>
+          </w:tcPr>
+          <w:p>
+            <w:r>
+              <w:rPr>
+                <w:sz w:val="18"/>
+              </w:rPr>
+              <w:t>0</w:t>
+            </w:r>
+          </w:p>
+        </w:tc>
+      </w:tr>
+      <w:tr>
+        <w:tc>
+          <w:tcPr>
+            <w:tcW w:type="dxa" w:w="1440"/>
+          </w:tcPr>
+          <w:p>
+            <w:r>
+              <w:rPr>
+                <w:sz w:val="18"/>
+              </w:rPr>
+              <w:t>Gary Paul Pozsik</w:t>
+            </w:r>
+          </w:p>
+        </w:tc>
+        <w:tc>
+          <w:tcPr>
+            <w:tcW w:type="dxa" w:w="1440"/>
+          </w:tcPr>
+          <w:p>
+            <w:r>
+              <w:rPr>
+                <w:sz w:val="18"/>
+              </w:rPr>
+              <w:t>Notary</w:t>
+            </w:r>
+          </w:p>
+        </w:tc>
+        <w:tc>
+          <w:tcPr>
+            <w:tcW w:type="dxa" w:w="1440"/>
+          </w:tcPr>
+          <w:p>
+            <w:r>
+              <w:rPr>
+                <w:sz w:val="18"/>
+              </w:rPr>
+              <w:t>0</w:t>
+            </w:r>
+          </w:p>
+        </w:tc>
+        <w:tc>
+          <w:tcPr>
+            <w:tcW w:type="dxa" w:w="1440"/>
+          </w:tcPr>
+          <w:p>
+            <w:r>
+              <w:rPr>
+                <w:sz w:val="18"/>
+              </w:rPr>
+              <w:t>250</w:t>
+            </w:r>
+          </w:p>
+        </w:tc>
+        <w:tc>
+          <w:tcPr>
+            <w:tcW w:type="dxa" w:w="1440"/>
+          </w:tcPr>
+          <w:p>
+            <w:r>
+              <w:rPr>
+                <w:sz w:val="18"/>
+              </w:rPr>
+              <w:t>0</w:t>
+            </w:r>
+          </w:p>
+        </w:tc>
+        <w:tc>
+          <w:tcPr>
+            <w:tcW w:type="dxa" w:w="1440"/>
+          </w:tcPr>
+          <w:p>
+            <w:r>
+              <w:rPr>
+                <w:sz w:val="18"/>
+              </w:rPr>
+              <w:t>0</w:t>
+            </w:r>
+          </w:p>
+        </w:tc>
+      </w:tr>
+      <w:tr>
+        <w:tc>
+          <w:tcPr>
+            <w:tcW w:type="dxa" w:w="1440"/>
+          </w:tcPr>
+          <w:p>
+            <w:r>
+              <w:rPr>
+                <w:sz w:val="18"/>
+              </w:rPr>
+              <w:t>Mindy Zimmerman</w:t>
+            </w:r>
+          </w:p>
+        </w:tc>
+        <w:tc>
+          <w:tcPr>
+            <w:tcW w:type="dxa" w:w="1440"/>
+          </w:tcPr>
+          <w:p>
+            <w:r>
+              <w:rPr>
+                <w:sz w:val="18"/>
+              </w:rPr>
+              <w:t>Connected Party</w:t>
+            </w:r>
+          </w:p>
+        </w:tc>
+        <w:tc>
+          <w:tcPr>
+            <w:tcW w:type="dxa" w:w="1440"/>
+          </w:tcPr>
+          <w:p>
+            <w:r>
+              <w:rPr>
+                <w:sz w:val="18"/>
+              </w:rPr>
+              <w:t>0</w:t>
+            </w:r>
+          </w:p>
+        </w:tc>
+        <w:tc>
+          <w:tcPr>
+            <w:tcW w:type="dxa" w:w="1440"/>
+          </w:tcPr>
+          <w:p>
+            <w:r>
+              <w:rPr>
+                <w:sz w:val="18"/>
+              </w:rPr>
+              <w:t>250</w:t>
+            </w:r>
+          </w:p>
+        </w:tc>
+        <w:tc>
+          <w:tcPr>
+            <w:tcW w:type="dxa" w:w="1440"/>
+          </w:tcPr>
+          <w:p>
+            <w:r>
+              <w:rPr>
+                <w:sz w:val="18"/>
+              </w:rPr>
+              <w:t>0</w:t>
+            </w:r>
+          </w:p>
+        </w:tc>
+        <w:tc>
+          <w:tcPr>
+            <w:tcW w:type="dxa" w:w="1440"/>
+          </w:tcPr>
+          <w:p>
+            <w:r>
+              <w:rPr>
+                <w:sz w:val="18"/>
+              </w:rPr>
+              <w:t>0</w:t>
+            </w:r>
+          </w:p>
+        </w:tc>
+      </w:tr>
+      <w:tr>
+        <w:tc>
+          <w:tcPr>
+            <w:tcW w:type="dxa" w:w="1440"/>
+          </w:tcPr>
+          <w:p>
+            <w:r>
+              <w:rPr>
+                <w:sz w:val="18"/>
+              </w:rPr>
+              <w:t>Donna Strom</w:t>
+            </w:r>
+          </w:p>
+        </w:tc>
+        <w:tc>
+          <w:tcPr>
+            <w:tcW w:type="dxa" w:w="1440"/>
+          </w:tcPr>
+          <w:p>
+            <w:r>
+              <w:rPr>
+                <w:sz w:val="18"/>
+              </w:rPr>
+              <w:t>Notary</w:t>
+            </w:r>
+          </w:p>
+        </w:tc>
+        <w:tc>
+          <w:tcPr>
+            <w:tcW w:type="dxa" w:w="1440"/>
+          </w:tcPr>
+          <w:p>
+            <w:r>
+              <w:rPr>
+                <w:sz w:val="18"/>
+              </w:rPr>
+              <w:t>0</w:t>
+            </w:r>
+          </w:p>
+        </w:tc>
+        <w:tc>
+          <w:tcPr>
+            <w:tcW w:type="dxa" w:w="1440"/>
+          </w:tcPr>
+          <w:p>
+            <w:r>
+              <w:rPr>
+                <w:sz w:val="18"/>
+              </w:rPr>
+              <w:t>250</w:t>
+            </w:r>
+          </w:p>
+        </w:tc>
+        <w:tc>
+          <w:tcPr>
+            <w:tcW w:type="dxa" w:w="1440"/>
+          </w:tcPr>
+          <w:p>
+            <w:r>
+              <w:rPr>
+                <w:sz w:val="18"/>
+              </w:rPr>
+              <w:t>0</w:t>
+            </w:r>
+          </w:p>
+        </w:tc>
+        <w:tc>
+          <w:tcPr>
+            <w:tcW w:type="dxa" w:w="1440"/>
+          </w:tcPr>
+          <w:p>
+            <w:r>
+              <w:rPr>
+                <w:sz w:val="18"/>
+              </w:rPr>
+              <w:t>0</w:t>
+            </w:r>
+          </w:p>
+        </w:tc>
+      </w:tr>
+      <w:tr>
+        <w:tc>
+          <w:tcPr>
+            <w:tcW w:type="dxa" w:w="1440"/>
+          </w:tcPr>
+          <w:p>
+            <w:r>
+              <w:rPr>
+                <w:sz w:val="18"/>
+              </w:rPr>
+              <w:t>Melissa Atwood</w:t>
+            </w:r>
+          </w:p>
+        </w:tc>
+        <w:tc>
+          <w:tcPr>
+            <w:tcW w:type="dxa" w:w="1440"/>
+          </w:tcPr>
+          <w:p>
+            <w:r>
+              <w:rPr>
+                <w:sz w:val="18"/>
+              </w:rPr>
+              <w:t>Notary</w:t>
+            </w:r>
+          </w:p>
+        </w:tc>
+        <w:tc>
+          <w:tcPr>
+            <w:tcW w:type="dxa" w:w="1440"/>
+          </w:tcPr>
+          <w:p>
+            <w:r>
+              <w:rPr>
+                <w:sz w:val="18"/>
+              </w:rPr>
+              <w:t>0</w:t>
+            </w:r>
+          </w:p>
+        </w:tc>
+        <w:tc>
+          <w:tcPr>
+            <w:tcW w:type="dxa" w:w="1440"/>
+          </w:tcPr>
+          <w:p>
+            <w:r>
+              <w:rPr>
+                <w:sz w:val="18"/>
+              </w:rPr>
+              <w:t>250</w:t>
+            </w:r>
+          </w:p>
+        </w:tc>
+        <w:tc>
+          <w:tcPr>
+            <w:tcW w:type="dxa" w:w="1440"/>
+          </w:tcPr>
+          <w:p>
+            <w:r>
+              <w:rPr>
+                <w:sz w:val="18"/>
+              </w:rPr>
+              <w:t>0</w:t>
+            </w:r>
+          </w:p>
+        </w:tc>
+        <w:tc>
+          <w:tcPr>
+            <w:tcW w:type="dxa" w:w="1440"/>
+          </w:tcPr>
+          <w:p>
+            <w:r>
+              <w:rPr>
+                <w:sz w:val="18"/>
+              </w:rPr>
+              <w:t>0</w:t>
+            </w:r>
+          </w:p>
+        </w:tc>
+      </w:tr>
+      <w:tr>
+        <w:tc>
+          <w:tcPr>
+            <w:tcW w:type="dxa" w:w="1440"/>
+          </w:tcPr>
+          <w:p>
+            <w:r>
+              <w:rPr>
+                <w:sz w:val="18"/>
+              </w:rPr>
+              <w:t>Tresa B. Wolfe</w:t>
+            </w:r>
+          </w:p>
+        </w:tc>
+        <w:tc>
+          <w:tcPr>
+            <w:tcW w:type="dxa" w:w="1440"/>
+          </w:tcPr>
+          <w:p>
+            <w:r>
+              <w:rPr>
+                <w:sz w:val="18"/>
+              </w:rPr>
+              <w:t>Notary</w:t>
+            </w:r>
+          </w:p>
+        </w:tc>
+        <w:tc>
+          <w:tcPr>
+            <w:tcW w:type="dxa" w:w="1440"/>
+          </w:tcPr>
+          <w:p>
+            <w:r>
+              <w:rPr>
+                <w:sz w:val="18"/>
+              </w:rPr>
+              <w:t>0</w:t>
+            </w:r>
+          </w:p>
+        </w:tc>
+        <w:tc>
+          <w:tcPr>
+            <w:tcW w:type="dxa" w:w="1440"/>
+          </w:tcPr>
+          <w:p>
+            <w:r>
+              <w:rPr>
+                <w:sz w:val="18"/>
+              </w:rPr>
+              <w:t>250</w:t>
+            </w:r>
+          </w:p>
+        </w:tc>
+        <w:tc>
+          <w:tcPr>
+            <w:tcW w:type="dxa" w:w="1440"/>
+          </w:tcPr>
+          <w:p>
+            <w:r>
+              <w:rPr>
+                <w:sz w:val="18"/>
+              </w:rPr>
+              <w:t>0</w:t>
+            </w:r>
+          </w:p>
+        </w:tc>
+        <w:tc>
+          <w:tcPr>
+            <w:tcW w:type="dxa" w:w="1440"/>
+          </w:tcPr>
+          <w:p>
+            <w:r>
+              <w:rPr>
+                <w:sz w:val="18"/>
+              </w:rPr>
+              <w:t>0</w:t>
+            </w:r>
+          </w:p>
+        </w:tc>
+      </w:tr>
+      <w:tr>
+        <w:tc>
+          <w:tcPr>
+            <w:tcW w:type="dxa" w:w="1440"/>
+          </w:tcPr>
+          <w:p>
+            <w:r>
+              <w:rPr>
+                <w:sz w:val="18"/>
+              </w:rPr>
+              <w:t>Kenneth Wiggins</w:t>
+            </w:r>
+          </w:p>
+        </w:tc>
+        <w:tc>
+          <w:tcPr>
+            <w:tcW w:type="dxa" w:w="1440"/>
+          </w:tcPr>
+          <w:p>
+            <w:r>
+              <w:rPr>
+                <w:sz w:val="18"/>
+              </w:rPr>
+              <w:t>Attorney (FL)</w:t>
+            </w:r>
+          </w:p>
+        </w:tc>
+        <w:tc>
+          <w:tcPr>
+            <w:tcW w:type="dxa" w:w="1440"/>
+          </w:tcPr>
+          <w:p>
+            <w:r>
+              <w:rPr>
+                <w:sz w:val="18"/>
+              </w:rPr>
+              <w:t>0</w:t>
+            </w:r>
+          </w:p>
+        </w:tc>
+        <w:tc>
+          <w:tcPr>
+            <w:tcW w:type="dxa" w:w="1440"/>
+          </w:tcPr>
+          <w:p>
+            <w:r>
+              <w:rPr>
+                <w:sz w:val="18"/>
+              </w:rPr>
+              <w:t>250</w:t>
+            </w:r>
+          </w:p>
+        </w:tc>
+        <w:tc>
+          <w:tcPr>
+            <w:tcW w:type="dxa" w:w="1440"/>
+          </w:tcPr>
+          <w:p>
+            <w:r>
+              <w:rPr>
+                <w:sz w:val="18"/>
+              </w:rPr>
+              <w:t>0</w:t>
+            </w:r>
+          </w:p>
+        </w:tc>
+        <w:tc>
+          <w:tcPr>
+            <w:tcW w:type="dxa" w:w="1440"/>
+          </w:tcPr>
+          <w:p>
+            <w:r>
+              <w:rPr>
+                <w:sz w:val="18"/>
+              </w:rPr>
+              <w:t>0</w:t>
+            </w:r>
+          </w:p>
+        </w:tc>
+      </w:tr>
+      <w:tr>
+        <w:tc>
+          <w:tcPr>
+            <w:tcW w:type="dxa" w:w="1440"/>
+          </w:tcPr>
+          <w:p>
+            <w:r>
+              <w:rPr>
+                <w:sz w:val="18"/>
+              </w:rPr>
+              <w:t>Jewitte Dooley</w:t>
+            </w:r>
+          </w:p>
+        </w:tc>
+        <w:tc>
+          <w:tcPr>
+            <w:tcW w:type="dxa" w:w="1440"/>
+          </w:tcPr>
+          <w:p>
+            <w:r>
+              <w:rPr>
+                <w:sz w:val="18"/>
+              </w:rPr>
+              <w:t>Conflict</w:t>
+            </w:r>
+          </w:p>
+        </w:tc>
+        <w:tc>
+          <w:tcPr>
+            <w:tcW w:type="dxa" w:w="1440"/>
+          </w:tcPr>
+          <w:p>
+            <w:r>
+              <w:rPr>
+                <w:sz w:val="18"/>
+              </w:rPr>
+              <w:t>0</w:t>
+            </w:r>
+          </w:p>
+        </w:tc>
+        <w:tc>
+          <w:tcPr>
+            <w:tcW w:type="dxa" w:w="1440"/>
+          </w:tcPr>
+          <w:p>
+            <w:r>
+              <w:rPr>
+                <w:sz w:val="18"/>
+              </w:rPr>
+              <w:t>250</w:t>
+            </w:r>
+          </w:p>
+        </w:tc>
+        <w:tc>
+          <w:tcPr>
+            <w:tcW w:type="dxa" w:w="1440"/>
+          </w:tcPr>
+          <w:p>
+            <w:r>
+              <w:rPr>
+                <w:sz w:val="18"/>
+              </w:rPr>
+              <w:t>0</w:t>
+            </w:r>
+          </w:p>
+        </w:tc>
+        <w:tc>
+          <w:tcPr>
+            <w:tcW w:type="dxa" w:w="1440"/>
+          </w:tcPr>
+          <w:p>
+            <w:r>
+              <w:rPr>
+                <w:sz w:val="18"/>
+              </w:rPr>
+              <w:t>0</w:t>
+            </w:r>
+          </w:p>
+        </w:tc>
+      </w:tr>
+      <w:tr>
+        <w:tc>
+          <w:tcPr>
+            <w:tcW w:type="dxa" w:w="1440"/>
+          </w:tcPr>
+          <w:p>
+            <w:r>
+              <w:rPr>
+                <w:sz w:val="18"/>
+              </w:rPr>
+              <w:t>Stephanie Fajardo</w:t>
+            </w:r>
+          </w:p>
+        </w:tc>
+        <w:tc>
+          <w:tcPr>
+            <w:tcW w:type="dxa" w:w="1440"/>
+          </w:tcPr>
+          <w:p>
+            <w:r>
+              <w:rPr>
+                <w:sz w:val="18"/>
+              </w:rPr>
+              <w:t>Conflict</w:t>
+            </w:r>
+          </w:p>
+        </w:tc>
+        <w:tc>
+          <w:tcPr>
+            <w:tcW w:type="dxa" w:w="1440"/>
+          </w:tcPr>
+          <w:p>
+            <w:r>
+              <w:rPr>
+                <w:sz w:val="18"/>
+              </w:rPr>
+              <w:t>0</w:t>
+            </w:r>
+          </w:p>
+        </w:tc>
+        <w:tc>
+          <w:tcPr>
+            <w:tcW w:type="dxa" w:w="1440"/>
+          </w:tcPr>
+          <w:p>
+            <w:r>
+              <w:rPr>
+                <w:sz w:val="18"/>
+              </w:rPr>
+              <w:t>250</w:t>
+            </w:r>
+          </w:p>
+        </w:tc>
+        <w:tc>
+          <w:tcPr>
+            <w:tcW w:type="dxa" w:w="1440"/>
+          </w:tcPr>
+          <w:p>
+            <w:r>
+              <w:rPr>
+                <w:sz w:val="18"/>
+              </w:rPr>
+              <w:t>0</w:t>
+            </w:r>
+          </w:p>
+        </w:tc>
+        <w:tc>
+          <w:tcPr>
+            <w:tcW w:type="dxa" w:w="1440"/>
+          </w:tcPr>
+          <w:p>
+            <w:r>
+              <w:rPr>
+                <w:sz w:val="18"/>
+              </w:rPr>
+              <w:t>0</w:t>
+            </w:r>
+          </w:p>
+        </w:tc>
+      </w:tr>
+      <w:tr>
+        <w:tc>
+          <w:tcPr>
+            <w:tcW w:type="dxa" w:w="1440"/>
+          </w:tcPr>
+          <w:p>
+            <w:r>
+              <w:rPr>
+                <w:sz w:val="18"/>
+              </w:rPr>
               <w:t>Kailyn Slice</w:t>
             </w:r>
           </w:p>
@@ -16087,6 +18798,246 @@
                 <w:sz w:val="18"/>
               </w:rPr>
               <w:t>0</w:t>
+            </w:r>
+          </w:p>
+        </w:tc>
+        <w:tc>
+          <w:tcPr>
+            <w:tcW w:type="dxa" w:w="1440"/>
+          </w:tcPr>
+          <w:p>
+            <w:r>
+              <w:rPr>
+                <w:sz w:val="18"/>
+              </w:rPr>
+              <w:t>0</w:t>
+            </w:r>
+          </w:p>
+        </w:tc>
+      </w:tr>
+      <w:tr>
+        <w:tc>
+          <w:tcPr>
+            <w:tcW w:type="dxa" w:w="1440"/>
+          </w:tcPr>
+          <w:p>
+            <w:r>
+              <w:rPr>
+                <w:sz w:val="18"/>
+              </w:rPr>
+              <w:t>NaT</w:t>
+            </w:r>
+          </w:p>
+        </w:tc>
+        <w:tc>
+          <w:tcPr>
+            <w:tcW w:type="dxa" w:w="1440"/>
+          </w:tcPr>
+          <w:p>
+            <w:r>
+              <w:rPr>
+                <w:sz w:val="18"/>
+              </w:rPr>
+              <w:t>filed_by</w:t>
+            </w:r>
+          </w:p>
+        </w:tc>
+        <w:tc>
+          <w:tcPr>
+            <w:tcW w:type="dxa" w:w="1440"/>
+          </w:tcPr>
+          <w:p>
+            <w:r>
+              <w:rPr>
+                <w:sz w:val="18"/>
+              </w:rPr>
+              <w:t>139</w:t>
+            </w:r>
+          </w:p>
+        </w:tc>
+        <w:tc>
+          <w:tcPr>
+            <w:tcW w:type="dxa" w:w="1440"/>
+          </w:tcPr>
+          <w:p>
+            <w:r>
+              <w:rPr>
+                <w:sz w:val="18"/>
+              </w:rPr>
+              <w:t>250</w:t>
+            </w:r>
+          </w:p>
+        </w:tc>
+        <w:tc>
+          <w:tcPr>
+            <w:tcW w:type="dxa" w:w="1440"/>
+          </w:tcPr>
+          <w:p>
+            <w:r>
+              <w:rPr>
+                <w:sz w:val="18"/>
+              </w:rPr>
+              <w:t>417</w:t>
+            </w:r>
+          </w:p>
+        </w:tc>
+        <w:tc>
+          <w:tcPr>
+            <w:tcW w:type="dxa" w:w="1440"/>
+          </w:tcPr>
+          <w:p>
+            <w:r>
+              <w:rPr>
+                <w:sz w:val="18"/>
+              </w:rPr>
+              <w:t>104250</w:t>
+            </w:r>
+          </w:p>
+        </w:tc>
+      </w:tr>
+      <w:tr>
+        <w:tc>
+          <w:tcPr>
+            <w:tcW w:type="dxa" w:w="1440"/>
+          </w:tcPr>
+          <w:p>
+            <w:r>
+              <w:rPr>
+                <w:sz w:val="18"/>
+              </w:rPr>
+              <w:t>Newton</w:t>
+            </w:r>
+          </w:p>
+        </w:tc>
+        <w:tc>
+          <w:tcPr>
+            <w:tcW w:type="dxa" w:w="1440"/>
+          </w:tcPr>
+          <w:p>
+            <w:r>
+              <w:rPr>
+                <w:sz w:val="18"/>
+              </w:rPr>
+              <w:t>judge</w:t>
+            </w:r>
+          </w:p>
+        </w:tc>
+        <w:tc>
+          <w:tcPr>
+            <w:tcW w:type="dxa" w:w="1440"/>
+          </w:tcPr>
+          <w:p>
+            <w:r>
+              <w:rPr>
+                <w:sz w:val="18"/>
+              </w:rPr>
+              <w:t>1</w:t>
+            </w:r>
+          </w:p>
+        </w:tc>
+        <w:tc>
+          <w:tcPr>
+            <w:tcW w:type="dxa" w:w="1440"/>
+          </w:tcPr>
+          <w:p>
+            <w:r>
+              <w:rPr>
+                <w:sz w:val="18"/>
+              </w:rPr>
+              <w:t>0</w:t>
+            </w:r>
+          </w:p>
+        </w:tc>
+        <w:tc>
+          <w:tcPr>
+            <w:tcW w:type="dxa" w:w="1440"/>
+          </w:tcPr>
+          <w:p>
+            <w:r>
+              <w:rPr>
+                <w:sz w:val="18"/>
+              </w:rPr>
+              <w:t>3</w:t>
+            </w:r>
+          </w:p>
+        </w:tc>
+        <w:tc>
+          <w:tcPr>
+            <w:tcW w:type="dxa" w:w="1440"/>
+          </w:tcPr>
+          <w:p>
+            <w:r>
+              <w:rPr>
+                <w:sz w:val="18"/>
+              </w:rPr>
+              <w:t>0</w:t>
+            </w:r>
+          </w:p>
+        </w:tc>
+      </w:tr>
+      <w:tr>
+        <w:tc>
+          <w:tcPr>
+            <w:tcW w:type="dxa" w:w="1440"/>
+          </w:tcPr>
+          <w:p>
+            <w:r>
+              <w:rPr>
+                <w:sz w:val="18"/>
+              </w:rPr>
+              <w:t>Crouch</w:t>
+            </w:r>
+          </w:p>
+        </w:tc>
+        <w:tc>
+          <w:tcPr>
+            <w:tcW w:type="dxa" w:w="1440"/>
+          </w:tcPr>
+          <w:p>
+            <w:r>
+              <w:rPr>
+                <w:sz w:val="18"/>
+              </w:rPr>
+              <w:t>judge</w:t>
+            </w:r>
+          </w:p>
+        </w:tc>
+        <w:tc>
+          <w:tcPr>
+            <w:tcW w:type="dxa" w:w="1440"/>
+          </w:tcPr>
+          <w:p>
+            <w:r>
+              <w:rPr>
+                <w:sz w:val="18"/>
+              </w:rPr>
+              <w:t>10</w:t>
+            </w:r>
+          </w:p>
+        </w:tc>
+        <w:tc>
+          <w:tcPr>
+            <w:tcW w:type="dxa" w:w="1440"/>
+          </w:tcPr>
+          <w:p>
+            <w:r>
+              <w:rPr>
+                <w:sz w:val="18"/>
+              </w:rPr>
+              <w:t>0</w:t>
+            </w:r>
+          </w:p>
+        </w:tc>
+        <w:tc>
+          <w:tcPr>
+            <w:tcW w:type="dxa" w:w="1440"/>
+          </w:tcPr>
+          <w:p>
+            <w:r>
+              <w:rPr>
+                <w:sz w:val="18"/>
+              </w:rPr>
+              <w:t>30</w:t>
             </w:r>
           </w:p>
         </w:tc>
@@ -16118,12 +19069,12 @@
         <w:pStyle w:val="Heading3"/>
       </w:pPr>
       <w:r>
-        <w:t>Hon. Tonya Newton — Judge (Grade: F)</w:t>
+        <w:t>Robert Kent Cales IV — Attorney (Grade: F)</w:t>
       </w:r>
     </w:p>
     <w:p>
       <w:r>
-        <w:t>Judge Hon. Tonya Newton — Overall Grade: F (0.0/100). Performance indicators suggest potential issues with judicial conduct that may warrant formal review or complaint filing.</w:t>
+        <w:t>Attorney Robert Kent Cales IV — Overall Grade: F (0.0/100). Performance indicators suggest attorney involvement may be adversely affecting case outcomes.</w:t>
       </w:r>
     </w:p>
     <w:p>
@@ -16131,12 +19082,12 @@
         <w:pStyle w:val="Heading3"/>
       </w:pPr>
       <w:r>
-        <w:t>Hon. Donna Seigler Crouch — Judge (Grade: F)</w:t>
+        <w:t>Megan Cales — Attorney (Grade: F)</w:t>
       </w:r>
     </w:p>
     <w:p>
       <w:r>
-        <w:t>Judge Hon. Donna Seigler Crouch — Overall Grade: F (0.0/100). Performance indicators suggest potential issues with judicial conduct that may warrant formal review or complaint filing.</w:t>
+        <w:t>Attorney Megan Cales — Overall Grade: F (0.0/100). Performance indicators suggest attorney involvement may be adversely affecting case outcomes.</w:t>
       </w:r>
     </w:p>
     <w:p>
@@ -16144,12 +19095,12 @@
         <w:pStyle w:val="Heading3"/>
       </w:pPr>
       <w:r>
-        <w:t>Hon. Seigler — Judge (Grade: F)</w:t>
+        <w:t>Robert Kent Cales III — Attorney (Grade: F)</w:t>
       </w:r>
     </w:p>
     <w:p>
       <w:r>
-        <w:t>Judge Hon. Seigler — Overall Grade: F (0.0/100). Performance indicators suggest potential issues with judicial conduct that may warrant formal review or complaint filing.</w:t>
+        <w:t>Attorney Robert Kent Cales III — Overall Grade: F (0.0/100). Performance indicators suggest attorney involvement may be adversely affecting case outcomes.</w:t>
       </w:r>
     </w:p>
     <w:p>
@@ -16157,12 +19108,12 @@
         <w:pStyle w:val="Heading3"/>
       </w:pPr>
       <w:r>
-        <w:t>Hon. Zimmerman — Judge (Grade: F)</w:t>
+        <w:t>Jane Grugan McManus — Attorney (Grade: F)</w:t>
       </w:r>
     </w:p>
     <w:p>
       <w:r>
-        <w:t>Judge Hon. Zimmerman — Overall Grade: F (0.0/100). Performance indicators suggest potential issues with judicial conduct that may warrant formal review or complaint filing.</w:t>
+        <w:t>Attorney Jane Grugan McManus — Overall Grade: F (0.0/100). Performance indicators suggest attorney involvement may be adversely affecting case outcomes.</w:t>
       </w:r>
     </w:p>
     <w:p>
@@ -16170,12 +19121,12 @@
         <w:pStyle w:val="Heading3"/>
       </w:pPr>
       <w:r>
-        <w:t>Hon. Hurley — Judge (Grade: F)</w:t>
+        <w:t>Johnny Alton McManus — Attorney (Grade: F)</w:t>
       </w:r>
     </w:p>
     <w:p>
       <w:r>
-        <w:t>Judge Hon. Hurley — Overall Grade: F (0.0/100). Performance indicators suggest potential issues with judicial conduct that may warrant formal review or complaint filing.</w:t>
+        <w:t>Attorney Johnny Alton McManus — Overall Grade: F (0.0/100). Performance indicators suggest attorney involvement may be adversely affecting case outcomes.</w:t>
       </w:r>
     </w:p>
     <w:p>
@@ -16183,12 +19134,181 @@
         <w:pStyle w:val="Heading3"/>
       </w:pPr>
       <w:r>
-        <w:t>Suzanne L. Hawkins — Attorney (Grade: F)</w:t>
+        <w:t>Kerri Cales — Attorney (Grade: F)</w:t>
       </w:r>
     </w:p>
     <w:p>
       <w:r>
-        <w:t>Attorney Suzanne L. Hawkins — Overall Grade: F (0.0/100). Performance indicators suggest attorney involvement may be adversely affecting case outcomes.</w:t>
+        <w:t>Attorney Kerri Cales — Overall Grade: F (0.0/100). Performance indicators suggest attorney involvement may be adversely affecting case outcomes.</w:t>
+      </w:r>
+    </w:p>
+    <w:p>
+      <w:pPr>
+        <w:pStyle w:val="Heading3"/>
+      </w:pPr>
+      <w:r>
+        <w:t>AnnMarie McManus — Attorney (Grade: F)</w:t>
+      </w:r>
+    </w:p>
+    <w:p>
+      <w:r>
+        <w:t>Attorney AnnMarie McManus — Overall Grade: F (0.0/100). Performance indicators suggest attorney involvement may be adversely affecting case outcomes.</w:t>
+      </w:r>
+    </w:p>
+    <w:p>
+      <w:pPr>
+        <w:pStyle w:val="Heading3"/>
+      </w:pPr>
+      <w:r>
+        <w:t>Jaxson Cales — Attorney (Grade: F)</w:t>
+      </w:r>
+    </w:p>
+    <w:p>
+      <w:r>
+        <w:t>Attorney Jaxson Cales — Overall Grade: F (0.0/100). Performance indicators suggest attorney involvement may be adversely affecting case outcomes.</w:t>
+      </w:r>
+    </w:p>
+    <w:p>
+      <w:pPr>
+        <w:pStyle w:val="Heading3"/>
+      </w:pPr>
+      <w:r>
+        <w:t>Chief Magistrate Judge Matthew Johnson — Judge (Grade: F)</w:t>
+      </w:r>
+    </w:p>
+    <w:p>
+      <w:r>
+        <w:t>Judge Chief Magistrate Judge Matthew Johnson — Overall Grade: F (0.0/100). Performance indicators suggest potential issues with judicial conduct that may warrant formal review or complaint filing.</w:t>
+      </w:r>
+    </w:p>
+    <w:p>
+      <w:pPr>
+        <w:pStyle w:val="Heading3"/>
+      </w:pPr>
+      <w:r>
+        <w:t>Judge Greg Seigler — Judge (Grade: F)</w:t>
+      </w:r>
+    </w:p>
+    <w:p>
+      <w:r>
+        <w:t>Judge Judge Greg Seigler — Overall Grade: F (0.0/100). Performance indicators suggest potential issues with judicial conduct that may warrant formal review or complaint filing.</w:t>
+      </w:r>
+    </w:p>
+    <w:p>
+      <w:pPr>
+        <w:pStyle w:val="Heading3"/>
+      </w:pPr>
+      <w:r>
+        <w:t>Judge Huntley Crouch — Judge (Grade: F)</w:t>
+      </w:r>
+    </w:p>
+    <w:p>
+      <w:r>
+        <w:t>Judge Judge Huntley Crouch — Overall Grade: F (0.0/100). Performance indicators suggest potential issues with judicial conduct that may warrant formal review or complaint filing.</w:t>
+      </w:r>
+    </w:p>
+    <w:p>
+      <w:pPr>
+        <w:pStyle w:val="Heading3"/>
+      </w:pPr>
+      <w:r>
+        <w:t>Judge Robert Newton — Judge (Grade: F)</w:t>
+      </w:r>
+    </w:p>
+    <w:p>
+      <w:r>
+        <w:t>Judge Judge Robert Newton — Overall Grade: F (0.0/100). Performance indicators suggest potential issues with judicial conduct that may warrant formal review or complaint filing.</w:t>
+      </w:r>
+    </w:p>
+    <w:p>
+      <w:pPr>
+        <w:pStyle w:val="Heading3"/>
+      </w:pPr>
+      <w:r>
+        <w:t>Joshua Edwin Noah Pozsik — Attorney (Grade: F)</w:t>
+      </w:r>
+    </w:p>
+    <w:p>
+      <w:r>
+        <w:t>Attorney Joshua Edwin Noah Pozsik — Overall Grade: F (0.0/100). Performance indicators suggest attorney involvement may be adversely affecting case outcomes.</w:t>
+      </w:r>
+    </w:p>
+    <w:p>
+      <w:pPr>
+        <w:pStyle w:val="Heading3"/>
+      </w:pPr>
+      <w:r>
+        <w:t>Linda Carpenter — Attorney (Grade: F)</w:t>
+      </w:r>
+    </w:p>
+    <w:p>
+      <w:r>
+        <w:t>Attorney Linda Carpenter — Overall Grade: F (0.0/100). Performance indicators suggest attorney involvement may be adversely affecting case outcomes.</w:t>
+      </w:r>
+    </w:p>
+    <w:p>
+      <w:pPr>
+        <w:pStyle w:val="Heading3"/>
+      </w:pPr>
+      <w:r>
+        <w:t>Amanda Smith Mueller — Attorney (Grade: F)</w:t>
+      </w:r>
+    </w:p>
+    <w:p>
+      <w:r>
+        <w:t>Attorney Amanda Smith Mueller — Overall Grade: F (0.0/100). Performance indicators suggest attorney involvement may be adversely affecting case outcomes.</w:t>
+      </w:r>
+    </w:p>
+    <w:p>
+      <w:pPr>
+        <w:pStyle w:val="Heading3"/>
+      </w:pPr>
+      <w:r>
+        <w:t>Patricia Morr — Attorney (Grade: F)</w:t>
+      </w:r>
+    </w:p>
+    <w:p>
+      <w:r>
+        <w:t>Attorney Patricia Morr — Overall Grade: F (0.0/100). Performance indicators suggest attorney involvement may be adversely affecting case outcomes.</w:t>
+      </w:r>
+    </w:p>
+    <w:p>
+      <w:pPr>
+        <w:pStyle w:val="Heading3"/>
+      </w:pPr>
+      <w:r>
+        <w:t>Emily Hinson — Guardian ad Litem (Grade: F)</w:t>
+      </w:r>
+    </w:p>
+    <w:p>
+      <w:r>
+        <w:t>GAL Emily Hinson — Overall Grade: F (0.0/100). Performance indicators suggest gal involvement may be adversely affecting case outcomes.</w:t>
+      </w:r>
+    </w:p>
+    <w:p>
+      <w:pPr>
+        <w:pStyle w:val="Heading3"/>
+      </w:pPr>
+      <w:r>
+        <w:t>Suzanne Lorraine Hawkins — Attorney (Grade: F)</w:t>
+      </w:r>
+    </w:p>
+    <w:p>
+      <w:r>
+        <w:t>Attorney Suzanne Lorraine Hawkins — Overall Grade: F (0.0/100). Performance indicators suggest attorney involvement may be adversely affecting case outcomes.</w:t>
+      </w:r>
+    </w:p>
+    <w:p>
+      <w:pPr>
+        <w:pStyle w:val="Heading3"/>
+      </w:pPr>
+      <w:r>
+        <w:t>Suzanne Atkins Hawkins — Attorney (Grade: F)</w:t>
+      </w:r>
+    </w:p>
+    <w:p>
+      <w:r>
+        <w:t>Attorney Suzanne Atkins Hawkins — Overall Grade: F (0.0/100). Performance indicators suggest attorney involvement may be adversely affecting case outcomes.</w:t>
       </w:r>
     </w:p>
     <w:p>
@@ -16209,12 +19329,12 @@
         <w:pStyle w:val="Heading3"/>
       </w:pPr>
       <w:r>
-        <w:t>Joshua Edwin Noah Pozsik — Attorney (Grade: F)</w:t>
+        <w:t>Gary Paul Pozsik — Attorney (Grade: F)</w:t>
       </w:r>
     </w:p>
     <w:p>
       <w:r>
-        <w:t>Attorney Joshua Edwin Noah Pozsik — Overall Grade: F (0.0/100). Performance indicators suggest attorney involvement may be adversely affecting case outcomes.</w:t>
+        <w:t>Attorney Gary Paul Pozsik — Overall Grade: F (0.0/100). Performance indicators suggest attorney involvement may be adversely affecting case outcomes.</w:t>
       </w:r>
     </w:p>
     <w:p>
@@ -16222,12 +19342,12 @@
         <w:pStyle w:val="Heading3"/>
       </w:pPr>
       <w:r>
-        <w:t>Patricia Morr — Attorney (Grade: F)</w:t>
+        <w:t>Mindy Zimmerman — Attorney (Grade: F)</w:t>
       </w:r>
     </w:p>
     <w:p>
       <w:r>
-        <w:t>Attorney Patricia Morr — Overall Grade: F (0.0/100). Performance indicators suggest attorney involvement may be adversely affecting case outcomes.</w:t>
+        <w:t>Attorney Mindy Zimmerman — Overall Grade: F (0.0/100). Performance indicators suggest attorney involvement may be adversely affecting case outcomes.</w:t>
       </w:r>
     </w:p>
     <w:p>
@@ -16235,12 +19355,12 @@
         <w:pStyle w:val="Heading3"/>
       </w:pPr>
       <w:r>
-        <w:t>Amanda Smith Mueller — Attorney (Grade: F)</w:t>
+        <w:t>Donna Strom — Attorney (Grade: F)</w:t>
       </w:r>
     </w:p>
     <w:p>
       <w:r>
-        <w:t>Attorney Amanda Smith Mueller — Overall Grade: F (0.0/100). Performance indicators suggest attorney involvement may be adversely affecting case outcomes.</w:t>
+        <w:t>Attorney Donna Strom — Overall Grade: F (0.0/100). Performance indicators suggest attorney involvement may be adversely affecting case outcomes.</w:t>
       </w:r>
     </w:p>
     <w:p>
@@ -16248,12 +19368,64 @@
         <w:pStyle w:val="Heading3"/>
       </w:pPr>
       <w:r>
-        <w:t>Emily Hinson — Guardian ad Litem (Grade: F)</w:t>
+        <w:t>Melissa Atwood — Attorney (Grade: F)</w:t>
       </w:r>
     </w:p>
     <w:p>
       <w:r>
-        <w:t>GAL Emily Hinson — Overall Grade: F (0.0/100). Performance indicators suggest gal involvement may be adversely affecting case outcomes.</w:t>
+        <w:t>Attorney Melissa Atwood — Overall Grade: F (0.0/100). Performance indicators suggest attorney involvement may be adversely affecting case outcomes.</w:t>
+      </w:r>
+    </w:p>
+    <w:p>
+      <w:pPr>
+        <w:pStyle w:val="Heading3"/>
+      </w:pPr>
+      <w:r>
+        <w:t>Tresa B. Wolfe — Attorney (Grade: F)</w:t>
+      </w:r>
+    </w:p>
+    <w:p>
+      <w:r>
+        <w:t>Attorney Tresa B. Wolfe — Overall Grade: F (0.0/100). Performance indicators suggest attorney involvement may be adversely affecting case outcomes.</w:t>
+      </w:r>
+    </w:p>
+    <w:p>
+      <w:pPr>
+        <w:pStyle w:val="Heading3"/>
+      </w:pPr>
+      <w:r>
+        <w:t>Kenneth Wiggins — Attorney (Grade: F)</w:t>
+      </w:r>
+    </w:p>
+    <w:p>
+      <w:r>
+        <w:t>Attorney Kenneth Wiggins — Overall Grade: F (0.0/100). Performance indicators suggest attorney involvement may be adversely affecting case outcomes.</w:t>
+      </w:r>
+    </w:p>
+    <w:p>
+      <w:pPr>
+        <w:pStyle w:val="Heading3"/>
+      </w:pPr>
+      <w:r>
+        <w:t>Jewitte Dooley — Attorney (Grade: F)</w:t>
+      </w:r>
+    </w:p>
+    <w:p>
+      <w:r>
+        <w:t>Attorney Jewitte Dooley — Overall Grade: F (0.0/100). Performance indicators suggest attorney involvement may be adversely affecting case outcomes.</w:t>
+      </w:r>
+    </w:p>
+    <w:p>
+      <w:pPr>
+        <w:pStyle w:val="Heading3"/>
+      </w:pPr>
+      <w:r>
+        <w:t>Stephanie Fajardo — Attorney (Grade: F)</w:t>
+      </w:r>
+    </w:p>
+    <w:p>
+      <w:r>
+        <w:t>Attorney Stephanie Fajardo — Overall Grade: F (0.0/100). Performance indicators suggest attorney involvement may be adversely affecting case outcomes.</w:t>
       </w:r>
     </w:p>
     <w:p>
@@ -16271,6 +19443,61 @@
     </w:p>
     <w:p>
       <w:pPr>
+        <w:pStyle w:val="Heading3"/>
+      </w:pPr>
+      <w:r>
+        <w:t>NaT — Attorney (Grade: F)</w:t>
+      </w:r>
+    </w:p>
+    <w:p>
+      <w:r>
+        <w:t>Attorney NaT — Overall Grade: F (10.0/100). 1 concern(s) flagged. Performance indicators suggest attorney involvement may be adversely affecting case outcomes.</w:t>
+      </w:r>
+    </w:p>
+    <w:p>
+      <w:pPr>
+        <w:pStyle w:val="ListBullet"/>
+      </w:pPr>
+      <w:r>
+        <w:t>Flags:</w:t>
+      </w:r>
+    </w:p>
+    <w:p>
+      <w:pPr>
+        <w:pStyle w:val="ListBullet2"/>
+      </w:pPr>
+      <w:r>
+        <w:t>HIGH COST: Estimated $104,250 earned from this case</w:t>
+      </w:r>
+    </w:p>
+    <w:p>
+      <w:pPr>
+        <w:pStyle w:val="Heading3"/>
+      </w:pPr>
+      <w:r>
+        <w:t>Crouch — Judge (Grade: C)</w:t>
+      </w:r>
+    </w:p>
+    <w:p>
+      <w:r>
+        <w:t>Judge Crouch — Overall Grade: C (70.0/100). Performance indicators are within acceptable ranges.</w:t>
+      </w:r>
+    </w:p>
+    <w:p>
+      <w:pPr>
+        <w:pStyle w:val="Heading3"/>
+      </w:pPr>
+      <w:r>
+        <w:t>Newton — Judge (Grade: A)</w:t>
+      </w:r>
+    </w:p>
+    <w:p>
+      <w:r>
+        <w:t>Judge Newton — Overall Grade: A (97.0/100). Performance indicators are within acceptable ranges.</w:t>
+      </w:r>
+    </w:p>
+    <w:p>
+      <w:pPr>
         <w:pStyle w:val="Heading1"/>
       </w:pPr>
       <w:r>
@@ -16279,7 +19506,7 @@
     </w:p>
     <w:p>
       <w:r>
-        <w:t>Total violations identified: 1</w:t>
+        <w:t>Total violations identified: 2</w:t>
       </w:r>
     </w:p>
     <w:p>
@@ -16298,7 +19525,7 @@
         <w:t xml:space="preserve">Description: </w:t>
       </w:r>
       <w:r>
-        <w:t>Case has been ongoing for 25.49 years (9310 days)</w:t>
+        <w:t>Case has been ongoing for 26.21 years (9574 days)</w:t>
       </w:r>
     </w:p>
     <w:p>
@@ -16340,6 +19567,62 @@
     </w:p>
     <w:p>
       <w:pPr>
+        <w:pStyle w:val="Heading2"/>
+      </w:pPr>
+      <w:r>
+        <w:t>Violation #2: EXCESSIVE_RAPID_FILINGS</w:t>
+      </w:r>
+    </w:p>
+    <w:p>
+      <w:r>
+        <w:rPr>
+          <w:b/>
+        </w:rPr>
+        <w:t xml:space="preserve">Description: </w:t>
+      </w:r>
+      <w:r>
+        <w:t>110 filings made within 7 days of prior filings (81% of all filings)</w:t>
+      </w:r>
+    </w:p>
+    <w:p>
+      <w:r>
+        <w:rPr>
+          <w:b/>
+        </w:rPr>
+        <w:t xml:space="preserve">Applicable Law: </w:t>
+      </w:r>
+      <w:r>
+        <w:t>Vexatious Litigation Sanctions</w:t>
+      </w:r>
+    </w:p>
+    <w:p>
+      <w:r>
+        <w:rPr>
+          <w:b/>
+        </w:rPr>
+        <w:t xml:space="preserve">Citation: </w:t>
+      </w:r>
+      <w:r>
+        <w:t>28 U.S.C. § 1927; state equivalents</w:t>
+      </w:r>
+    </w:p>
+    <w:p>
+      <w:r>
+        <w:rPr>
+          <w:b/>
+        </w:rPr>
+        <w:t xml:space="preserve">Severity: </w:t>
+      </w:r>
+      <w:r>
+        <w:rPr>
+          <w:b/>
+          <w:color w:val="C00000"/>
+        </w:rPr>
+        <w:t>HIGH</w:t>
+      </w:r>
+    </w:p>
+    <w:p>
+      <w:pPr>
         <w:pStyle w:val="Heading1"/>
       </w:pPr>
       <w:r>
@@ -16348,7 +19631,7 @@
     </w:p>
     <w:p>
       <w:r>
-        <w:t>Total documented costs: $4,642.46</w:t>
+        <w:t>Total documented costs: $34,257.43</w:t>
       </w:r>
     </w:p>
     <w:p>
@@ -16357,6 +19640,14 @@
       </w:pPr>
       <w:r>
         <w:t>7.1 Costs by Party</w:t>
+      </w:r>
+    </w:p>
+    <w:p>
+      <w:pPr>
+        <w:pStyle w:val="ListBullet"/>
+      </w:pPr>
+      <w:r>
+        <w:t>Amanda Mueller: $10,912.50</w:t>
       </w:r>
     </w:p>
     <w:p>
@@ -16412,7 +19703,7 @@
         <w:pStyle w:val="ListBullet"/>
       </w:pPr>
       <w:r>
-        <w:t>Plaintiff: $225.00</w:t>
+        <w:t>Plaintiff: $18,927.47</w:t>
       </w:r>
     </w:p>
     <w:p>
@@ -16444,6 +19735,54 @@
         <w:pStyle w:val="ListBullet"/>
       </w:pPr>
       <w:r>
+        <w:t>ADA Advocate: $1,750.00</w:t>
+      </w:r>
+    </w:p>
+    <w:p>
+      <w:pPr>
+        <w:pStyle w:val="ListBullet"/>
+      </w:pPr>
+      <w:r>
+        <w:t>AirBnb/Visitation: $100.00</w:t>
+      </w:r>
+    </w:p>
+    <w:p>
+      <w:pPr>
+        <w:pStyle w:val="ListBullet"/>
+      </w:pPr>
+      <w:r>
+        <w:t>Attorney Fees Submitted to Court: $10,912.50</w:t>
+      </w:r>
+    </w:p>
+    <w:p>
+      <w:pPr>
+        <w:pStyle w:val="ListBullet"/>
+      </w:pPr>
+      <w:r>
+        <w:t>Attorney Retainer: $5,000.00</w:t>
+      </w:r>
+    </w:p>
+    <w:p>
+      <w:pPr>
+        <w:pStyle w:val="ListBullet"/>
+      </w:pPr>
+      <w:r>
+        <w:t>BCBS Insurance Claim: $557.00</w:t>
+      </w:r>
+    </w:p>
+    <w:p>
+      <w:pPr>
+        <w:pStyle w:val="ListBullet"/>
+      </w:pPr>
+      <w:r>
+        <w:t>Carole Shealy: $411.65</w:t>
+      </w:r>
+    </w:p>
+    <w:p>
+      <w:pPr>
+        <w:pStyle w:val="ListBullet"/>
+      </w:pPr>
+      <w:r>
         <w:t>Court Filing Fees: $400.00</w:t>
       </w:r>
     </w:p>
@@ -16460,7 +19799,31 @@
         <w:pStyle w:val="ListBullet"/>
       </w:pPr>
       <w:r>
+        <w:t>FedEx: $17.44</w:t>
+      </w:r>
+    </w:p>
+    <w:p>
+      <w:pPr>
+        <w:pStyle w:val="ListBullet"/>
+      </w:pPr>
+      <w:r>
+        <w:t>Legal Fees: $400.00</w:t>
+      </w:r>
+    </w:p>
+    <w:p>
+      <w:pPr>
+        <w:pStyle w:val="ListBullet"/>
+      </w:pPr>
+      <w:r>
         <w:t>Lexington County: $583.95</w:t>
+      </w:r>
+    </w:p>
+    <w:p>
+      <w:pPr>
+        <w:pStyle w:val="ListBullet"/>
+      </w:pPr>
+      <w:r>
+        <w:t>Lost Wages: $100.00</w:t>
       </w:r>
     </w:p>
     <w:p>
@@ -16481,6 +19844,86 @@
     </w:p>
     <w:p>
       <w:pPr>
+        <w:pStyle w:val="ListBullet"/>
+      </w:pPr>
+      <w:r>
+        <w:t>Service Fees: $150.00</w:t>
+      </w:r>
+    </w:p>
+    <w:p>
+      <w:pPr>
+        <w:pStyle w:val="ListBullet"/>
+      </w:pPr>
+      <w:r>
+        <w:t>Subpoena/Mailing: $45.00</w:t>
+      </w:r>
+    </w:p>
+    <w:p>
+      <w:pPr>
+        <w:pStyle w:val="ListBullet"/>
+      </w:pPr>
+      <w:r>
+        <w:t>Travel/Court Docs: $500.00</w:t>
+      </w:r>
+    </w:p>
+    <w:p>
+      <w:pPr>
+        <w:pStyle w:val="ListBullet"/>
+      </w:pPr>
+      <w:r>
+        <w:t>Travel/Court Records: $1,100.00</w:t>
+      </w:r>
+    </w:p>
+    <w:p>
+      <w:pPr>
+        <w:pStyle w:val="ListBullet"/>
+      </w:pPr>
+      <w:r>
+        <w:t>Travel/Hearing Costs: $3,500.00</w:t>
+      </w:r>
+    </w:p>
+    <w:p>
+      <w:pPr>
+        <w:pStyle w:val="ListBullet"/>
+      </w:pPr>
+      <w:r>
+        <w:t>Travel/Visitation: $4,500.00</w:t>
+      </w:r>
+    </w:p>
+    <w:p>
+      <w:pPr>
+        <w:pStyle w:val="ListBullet"/>
+      </w:pPr>
+      <w:r>
+        <w:t>UPS: $19.08</w:t>
+      </w:r>
+    </w:p>
+    <w:p>
+      <w:pPr>
+        <w:pStyle w:val="ListBullet"/>
+      </w:pPr>
+      <w:r>
+        <w:t>UPS Service: $20.00</w:t>
+      </w:r>
+    </w:p>
+    <w:p>
+      <w:pPr>
+        <w:pStyle w:val="ListBullet"/>
+      </w:pPr>
+      <w:r>
+        <w:t>USPS: $29.00</w:t>
+      </w:r>
+    </w:p>
+    <w:p>
+      <w:pPr>
+        <w:pStyle w:val="ListBullet"/>
+      </w:pPr>
+      <w:r>
+        <w:t>Wendy Wise: $503.30</w:t>
+      </w:r>
+    </w:p>
+    <w:p>
+      <w:pPr>
         <w:pStyle w:val="Heading1"/>
       </w:pPr>
       <w:r>
@@ -16492,7 +19935,7 @@
         <w:rPr>
           <w:b/>
         </w:rPr>
-        <w:t xml:space="preserve">Hon. Tonya Newton (Judge) </w:t>
+        <w:t xml:space="preserve">NaT (filed_by) </w:t>
       </w:r>
       <w:r>
         <w:t xml:space="preserve">↔ </w:t>
@@ -16501,7 +19944,7 @@
         <w:rPr>
           <w:b/>
         </w:rPr>
-        <w:t>Hon. Donna Seigler Crouch (Judge)</w:t>
+        <w:t>Newton (judge)</w:t>
       </w:r>
     </w:p>
     <w:p>
@@ -16509,7 +19952,7 @@
         <w:pStyle w:val="ListBullet"/>
       </w:pPr>
       <w:r>
-        <w:t xml:space="preserve">  Connection: SHARED_LAW_FIRM — Both affiliated with: lexington family court</w:t>
+        <w:t xml:space="preserve">  Connection: CO_APPEARANCE — Appeared on same 1 dates</w:t>
       </w:r>
     </w:p>
     <w:p>
@@ -16517,7 +19960,7 @@
         <w:rPr>
           <w:b/>
         </w:rPr>
-        <w:t xml:space="preserve">Hon. Tonya Newton (Judge) </w:t>
+        <w:t xml:space="preserve">NaT (filed_by) </w:t>
       </w:r>
       <w:r>
         <w:t xml:space="preserve">↔ </w:t>
@@ -16526,7 +19969,7 @@
         <w:rPr>
           <w:b/>
         </w:rPr>
-        <w:t>Hon. Seigler (Judge)</w:t>
+        <w:t>Crouch (judge)</w:t>
       </w:r>
     </w:p>
     <w:p>
@@ -16534,7 +19977,7 @@
         <w:pStyle w:val="ListBullet"/>
       </w:pPr>
       <w:r>
-        <w:t xml:space="preserve">  Connection: SHARED_LAW_FIRM — Both affiliated with: lexington family court</w:t>
+        <w:t xml:space="preserve">  Connection: CO_APPEARANCE — Appeared on same 10 dates</w:t>
       </w:r>
     </w:p>
     <w:p>
@@ -16542,7 +19985,7 @@
         <w:rPr>
           <w:b/>
         </w:rPr>
-        <w:t xml:space="preserve">Hon. Tonya Newton (Judge) </w:t>
+        <w:t xml:space="preserve">Judge Greg Seigler (Judge) </w:t>
       </w:r>
       <w:r>
         <w:t xml:space="preserve">↔ </w:t>
@@ -16551,7 +19994,7 @@
         <w:rPr>
           <w:b/>
         </w:rPr>
-        <w:t>Hon. Zimmerman (Judge)</w:t>
+        <w:t>Judge Huntley Crouch (Judge)</w:t>
       </w:r>
     </w:p>
     <w:p>
@@ -16559,7 +20002,7 @@
         <w:pStyle w:val="ListBullet"/>
       </w:pPr>
       <w:r>
-        <w:t xml:space="preserve">  Connection: SHARED_LAW_FIRM — Both affiliated with: lexington family court</w:t>
+        <w:t xml:space="preserve">  Connection: SHARED_ORGANIZATION — Both affiliated with: lexington family court</w:t>
       </w:r>
     </w:p>
     <w:p>
@@ -16567,7 +20010,7 @@
         <w:rPr>
           <w:b/>
         </w:rPr>
-        <w:t xml:space="preserve">Hon. Tonya Newton (Judge) </w:t>
+        <w:t xml:space="preserve">Judge Greg Seigler (Judge) </w:t>
       </w:r>
       <w:r>
         <w:t xml:space="preserve">↔ </w:t>
@@ -16576,7 +20019,7 @@
         <w:rPr>
           <w:b/>
         </w:rPr>
-        <w:t>Hon. Hurley (Judge)</w:t>
+        <w:t>Judge Robert Newton (Judge)</w:t>
       </w:r>
     </w:p>
     <w:p>
@@ -16584,7 +20027,7 @@
         <w:pStyle w:val="ListBullet"/>
       </w:pPr>
       <w:r>
-        <w:t xml:space="preserve">  Connection: SHARED_LAW_FIRM — Both affiliated with: lexington family court</w:t>
+        <w:t xml:space="preserve">  Connection: SHARED_ORGANIZATION — Both affiliated with: lexington family court</w:t>
       </w:r>
     </w:p>
     <w:p>
@@ -16592,7 +20035,7 @@
         <w:rPr>
           <w:b/>
         </w:rPr>
-        <w:t xml:space="preserve">Hon. Donna Seigler Crouch (Judge) </w:t>
+        <w:t xml:space="preserve">Judge Huntley Crouch (Judge) </w:t>
       </w:r>
       <w:r>
         <w:t xml:space="preserve">↔ </w:t>
@@ -16601,7 +20044,7 @@
         <w:rPr>
           <w:b/>
         </w:rPr>
-        <w:t>Hon. Seigler (Judge)</w:t>
+        <w:t>Judge Robert Newton (Judge)</w:t>
       </w:r>
     </w:p>
     <w:p>
@@ -16609,7 +20052,7 @@
         <w:pStyle w:val="ListBullet"/>
       </w:pPr>
       <w:r>
-        <w:t xml:space="preserve">  Connection: SHARED_LAW_FIRM — Both affiliated with: lexington family court</w:t>
+        <w:t xml:space="preserve">  Connection: SHARED_ORGANIZATION — Both affiliated with: lexington family court</w:t>
       </w:r>
     </w:p>
     <w:p>
@@ -16617,7 +20060,7 @@
         <w:rPr>
           <w:b/>
         </w:rPr>
-        <w:t xml:space="preserve">Hon. Donna Seigler Crouch (Judge) </w:t>
+        <w:t xml:space="preserve">Joshua Edwin Noah Pozsik (Attorney (Defendant)) </w:t>
       </w:r>
       <w:r>
         <w:t xml:space="preserve">↔ </w:t>
@@ -16626,7 +20069,7 @@
         <w:rPr>
           <w:b/>
         </w:rPr>
-        <w:t>Hon. Zimmerman (Judge)</w:t>
+        <w:t>Linda Carpenter (Attorney)</w:t>
       </w:r>
     </w:p>
     <w:p>
@@ -16634,107 +20077,7 @@
         <w:pStyle w:val="ListBullet"/>
       </w:pPr>
       <w:r>
-        <w:t xml:space="preserve">  Connection: SHARED_LAW_FIRM — Both affiliated with: lexington family court</w:t>
-      </w:r>
-    </w:p>
-    <w:p>
-      <w:r>
-        <w:rPr>
-          <w:b/>
-        </w:rPr>
-        <w:t xml:space="preserve">Hon. Donna Seigler Crouch (Judge) </w:t>
-      </w:r>
-      <w:r>
-        <w:t xml:space="preserve">↔ </w:t>
-      </w:r>
-      <w:r>
-        <w:rPr>
-          <w:b/>
-        </w:rPr>
-        <w:t>Hon. Hurley (Judge)</w:t>
-      </w:r>
-    </w:p>
-    <w:p>
-      <w:pPr>
-        <w:pStyle w:val="ListBullet"/>
-      </w:pPr>
-      <w:r>
-        <w:t xml:space="preserve">  Connection: SHARED_LAW_FIRM — Both affiliated with: lexington family court</w:t>
-      </w:r>
-    </w:p>
-    <w:p>
-      <w:r>
-        <w:rPr>
-          <w:b/>
-        </w:rPr>
-        <w:t xml:space="preserve">Hon. Seigler (Judge) </w:t>
-      </w:r>
-      <w:r>
-        <w:t xml:space="preserve">↔ </w:t>
-      </w:r>
-      <w:r>
-        <w:rPr>
-          <w:b/>
-        </w:rPr>
-        <w:t>Hon. Zimmerman (Judge)</w:t>
-      </w:r>
-    </w:p>
-    <w:p>
-      <w:pPr>
-        <w:pStyle w:val="ListBullet"/>
-      </w:pPr>
-      <w:r>
-        <w:t xml:space="preserve">  Connection: SHARED_LAW_FIRM — Both affiliated with: lexington family court</w:t>
-      </w:r>
-    </w:p>
-    <w:p>
-      <w:r>
-        <w:rPr>
-          <w:b/>
-        </w:rPr>
-        <w:t xml:space="preserve">Hon. Seigler (Judge) </w:t>
-      </w:r>
-      <w:r>
-        <w:t xml:space="preserve">↔ </w:t>
-      </w:r>
-      <w:r>
-        <w:rPr>
-          <w:b/>
-        </w:rPr>
-        <w:t>Hon. Hurley (Judge)</w:t>
-      </w:r>
-    </w:p>
-    <w:p>
-      <w:pPr>
-        <w:pStyle w:val="ListBullet"/>
-      </w:pPr>
-      <w:r>
-        <w:t xml:space="preserve">  Connection: SHARED_LAW_FIRM — Both affiliated with: lexington family court</w:t>
-      </w:r>
-    </w:p>
-    <w:p>
-      <w:r>
-        <w:rPr>
-          <w:b/>
-        </w:rPr>
-        <w:t xml:space="preserve">Hon. Zimmerman (Judge) </w:t>
-      </w:r>
-      <w:r>
-        <w:t xml:space="preserve">↔ </w:t>
-      </w:r>
-      <w:r>
-        <w:rPr>
-          <w:b/>
-        </w:rPr>
-        <w:t>Hon. Hurley (Judge)</w:t>
-      </w:r>
-    </w:p>
-    <w:p>
-      <w:pPr>
-        <w:pStyle w:val="ListBullet"/>
-      </w:pPr>
-      <w:r>
-        <w:t xml:space="preserve">  Connection: SHARED_LAW_FIRM — Both affiliated with: lexington family court</w:t>
+        <w:t xml:space="preserve">  Connection: SHARED_ORGANIZATION — Both affiliated with: pozsik &amp; carpenter llc</w:t>
       </w:r>
     </w:p>
     <w:p>
@@ -16758,7 +20101,7 @@
         <w:pStyle w:val="ListBullet"/>
       </w:pPr>
       <w:r>
-        <w:t>Overall Score: 50.9</w:t>
+        <w:t>Overall Score: 41.1</w:t>
       </w:r>
     </w:p>
     <w:p>
@@ -16782,7 +20125,7 @@
         <w:pStyle w:val="ListBullet"/>
       </w:pPr>
       <w:r>
-        <w:t>Risk Level: MODERATE</w:t>
+        <w:t>Risk Level: HIGH</w:t>
       </w:r>
     </w:p>
     <w:p>
@@ -16790,7 +20133,7 @@
         <w:pStyle w:val="ListBullet"/>
       </w:pPr>
       <w:r>
-        <w:t>Factor Breakdown: {'case_duration': {'raw_score': 0, 'weight': 0.1, 'weighted_score': 0.0}, 'filing_volume': {'raw_score': 88.0, 'weight': 0.1, 'weighted_score': 8.8}, 'judge_history': {'raw_score': 50.0, 'weight': 0.2, 'weighted_score': 10.0}, 'attorney_experience': {'raw_score': 50.0, 'weight': 0.1, 'weighted_score': 5.0}, 'gal_involvement': {'raw_score': 50.0, 'weight': 0.1, 'weighted_score': 5.0}, 'abuse_severity': {'raw_score': 37.4, 'weight': 0.15, 'weighted_score': 5.61}, 'financial_disparity': {'raw_score': 50.0, 'weight': 0.1, 'weighted_score': 5.0}, 'children_involved': {'raw_score': 50.0, 'weight': 0.05, 'weighted_score': 2.5}, 'violation_count': {'raw_score': 90.0, 'weight': 0.1, 'weighted_score': 9.0}}</w:t>
+        <w:t>Factor Breakdown: {'case_duration': {'raw_score': 0, 'weight': 0.1, 'weighted_score': 0.0}, 'filing_volume': {'raw_score': 0, 'weight': 0.1, 'weighted_score': 0.0}, 'judge_history': {'raw_score': 50.0, 'weight': 0.2, 'weighted_score': 10.0}, 'attorney_experience': {'raw_score': 50.0, 'weight': 0.1, 'weighted_score': 5.0}, 'gal_involvement': {'raw_score': 50.0, 'weight': 0.1, 'weighted_score': 5.0}, 'abuse_severity': {'raw_score': 37.4, 'weight': 0.15, 'weighted_score': 5.61}, 'financial_disparity': {'raw_score': 50.0, 'weight': 0.1, 'weighted_score': 5.0}, 'children_involved': {'raw_score': 50.0, 'weight': 0.05, 'weighted_score': 2.5}, 'violation_count': {'raw_score': 80.0, 'weight': 0.1, 'weighted_score': 8.0}}</w:t>
       </w:r>
     </w:p>
     <w:p>
@@ -16798,7 +20141,7 @@
         <w:pStyle w:val="ListBullet"/>
       </w:pPr>
       <w:r>
-        <w:t>Recommendations: ['Case is excessively long. File motion for expedited resolution or raise with presiding judge.', 'High abuse severity documented. Ensure all incidents are formally reported and seek protective orders.']</w:t>
+        <w:t>Recommendations: ['Case is excessively long. File motion for expedited resolution or raise with presiding judge.', 'Excessive filing volume detected. Consider motion for vexatious litigant designation or filing restrictions.', 'High abuse severity documented. Ensure all incidents are formally reported and seek protective orders.']</w:t>
       </w:r>
     </w:p>
     <w:p>
@@ -16814,7 +20157,7 @@
         <w:pStyle w:val="ListBullet"/>
       </w:pPr>
       <w:r>
-        <w:t>Case Duration: {'case_start': '1996-08-09', 'most_recent_filing': '2022-02-04', 'duration_days': 9310, 'duration_months': 305.8, 'duration_years': 25.49, 'total_filings': 12, 'filings_per_month': 0.04}</w:t>
+        <w:t>Case Duration: {'case_start': '1996-08-09', 'most_recent_filing': '2022-10-26', 'duration_days': 9574, 'duration_months': 314.5, 'duration_years': 26.21, 'total_filings': 139, 'filings_per_month': 0.44}</w:t>
       </w:r>
     </w:p>
     <w:p>
@@ -16822,7 +20165,7 @@
         <w:pStyle w:val="ListBullet"/>
       </w:pPr>
       <w:r>
-        <w:t>Filing Rate Trend: 1.908</w:t>
+        <w:t>Filing Rate Trend: 47.313</w:t>
       </w:r>
     </w:p>
     <w:p>
@@ -16838,7 +20181,7 @@
         <w:pStyle w:val="ListBullet"/>
       </w:pPr>
       <w:r>
-        <w:t>Projected Additional Months: 22</w:t>
+        <w:t>Projected Additional Months: 567</w:t>
       </w:r>
     </w:p>
     <w:p>
@@ -16846,7 +20189,7 @@
         <w:pStyle w:val="ListBullet"/>
       </w:pPr>
       <w:r>
-        <w:t>Projected End Date: 2028-01-27</w:t>
+        <w:t>Projected End Date: 2072-11-03</w:t>
       </w:r>
     </w:p>
     <w:p>
@@ -16854,7 +20197,7 @@
         <w:pStyle w:val="ListBullet"/>
       </w:pPr>
       <w:r>
-        <w:t>Current Filing Rate Per Month: 0.04</w:t>
+        <w:t>Current Filing Rate Per Month: 0.44</w:t>
       </w:r>
     </w:p>
     <w:p>
@@ -16862,7 +20205,7 @@
         <w:pStyle w:val="ListBullet"/>
       </w:pPr>
       <w:r>
-        <w:t>Historical Outcome Distribution: {}</w:t>
+        <w:t>Historical Outcome Distribution: {'consent order': np.float64(0.2), 'continued to 4/11': np.float64(0.2), 'bench order - ex parte': np.float64(0.2), 'continued to 7/15': np.float64(0.2), 'continued to 7/27': np.float64(0.2)}</w:t>
       </w:r>
     </w:p>
     <w:p>
@@ -17033,7 +20376,7 @@
       <w:r>
         <w:drawing>
           <wp:inline xmlns:a="http://schemas.openxmlformats.org/drawingml/2006/main" xmlns:pic="http://schemas.openxmlformats.org/drawingml/2006/picture">
-            <wp:extent cx="5486400" cy="3881837"/>
+            <wp:extent cx="5486400" cy="3902317"/>
             <wp:docPr id="5" name="Picture 5"/>
             <wp:cNvGraphicFramePr>
               <a:graphicFrameLocks noChangeAspect="1"/>
@@ -17054,7 +20397,7 @@
                   <pic:spPr>
                     <a:xfrm>
                       <a:off x="0" y="0"/>
-                      <a:ext cx="5486400" cy="3881837"/>
+                      <a:ext cx="5486400" cy="3902317"/>
                     </a:xfrm>
                     <a:prstGeom prst="rect"/>
                   </pic:spPr>
@@ -17070,7 +20413,7 @@
       <w:r>
         <w:drawing>
           <wp:inline xmlns:a="http://schemas.openxmlformats.org/drawingml/2006/main" xmlns:pic="http://schemas.openxmlformats.org/drawingml/2006/picture">
-            <wp:extent cx="5486400" cy="895650"/>
+            <wp:extent cx="5486400" cy="3641171"/>
             <wp:docPr id="6" name="Picture 6"/>
             <wp:cNvGraphicFramePr>
               <a:graphicFrameLocks noChangeAspect="1"/>
@@ -17091,7 +20434,7 @@
                   <pic:spPr>
                     <a:xfrm>
                       <a:off x="0" y="0"/>
-                      <a:ext cx="5486400" cy="895650"/>
+                      <a:ext cx="5486400" cy="3641171"/>
                     </a:xfrm>
                     <a:prstGeom prst="rect"/>
                   </pic:spPr>
@@ -17107,7 +20450,7 @@
       <w:r>
         <w:drawing>
           <wp:inline xmlns:a="http://schemas.openxmlformats.org/drawingml/2006/main" xmlns:pic="http://schemas.openxmlformats.org/drawingml/2006/picture">
-            <wp:extent cx="5486400" cy="2334022"/>
+            <wp:extent cx="5486400" cy="2330669"/>
             <wp:docPr id="7" name="Picture 7"/>
             <wp:cNvGraphicFramePr>
               <a:graphicFrameLocks noChangeAspect="1"/>
@@ -17128,7 +20471,7 @@
                   <pic:spPr>
                     <a:xfrm>
                       <a:off x="0" y="0"/>
-                      <a:ext cx="5486400" cy="2334022"/>
+                      <a:ext cx="5486400" cy="2330669"/>
                     </a:xfrm>
                     <a:prstGeom prst="rect"/>
                   </pic:spPr>
@@ -17144,7 +20487,7 @@
       <w:r>
         <w:drawing>
           <wp:inline xmlns:a="http://schemas.openxmlformats.org/drawingml/2006/main" xmlns:pic="http://schemas.openxmlformats.org/drawingml/2006/picture">
-            <wp:extent cx="5486400" cy="2334022"/>
+            <wp:extent cx="5486400" cy="2335142"/>
             <wp:docPr id="8" name="Picture 8"/>
             <wp:cNvGraphicFramePr>
               <a:graphicFrameLocks noChangeAspect="1"/>
@@ -17165,7 +20508,7 @@
                   <pic:spPr>
                     <a:xfrm>
                       <a:off x="0" y="0"/>
-                      <a:ext cx="5486400" cy="2334022"/>
+                      <a:ext cx="5486400" cy="2335142"/>
                     </a:xfrm>
                     <a:prstGeom prst="rect"/>
                   </pic:spPr>
@@ -17181,7 +20524,7 @@
       <w:r>
         <w:drawing>
           <wp:inline xmlns:a="http://schemas.openxmlformats.org/drawingml/2006/main" xmlns:pic="http://schemas.openxmlformats.org/drawingml/2006/picture">
-            <wp:extent cx="5486400" cy="3264177"/>
+            <wp:extent cx="5486400" cy="8801613"/>
             <wp:docPr id="9" name="Picture 9"/>
             <wp:cNvGraphicFramePr>
               <a:graphicFrameLocks noChangeAspect="1"/>
@@ -17202,7 +20545,7 @@
                   <pic:spPr>
                     <a:xfrm>
                       <a:off x="0" y="0"/>
-                      <a:ext cx="5486400" cy="3264177"/>
+                      <a:ext cx="5486400" cy="8801613"/>
                     </a:xfrm>
                     <a:prstGeom prst="rect"/>
                   </pic:spPr>

</xml_diff>

<commit_message>
Add cases 2023DR3201058 and 2026DR3200579 from FCCMS portal
- 2023DR3201058: Megan Cales vs. John McManus et al. (Modification of
  Custody/Visitation, filed 5/26/2023, ended 8/22/2024) - 109 ROA entries,
  8 hearings, 4 judges (Newton, Crouch, Seigler, Frierson-Smith)
- 2026DR3200579: Robert Kent Cales IV vs. John McManus et al.
  (Modification filed 3/25/2026, pending) - 6 ROA entries
- New officials: Sheftman, Branham (GAL), von Keller, Frierson-Smith,
  Afman, Melanie Spears (clerk), Bryn Sarvis
- Updated analysis: 254 filings, 78 Rule 11 violations, 69 dismissal
  opportunities, 19 connections, 315 timeline events

https://claude.ai/code/session_01MXWhfSvCBpAktBnEa2jg5f
</commit_message>
<xml_diff>
--- a/output/analysis_report.docx
+++ b/output/analysis_report.docx
@@ -165,7 +165,7 @@
         <w:t xml:space="preserve">Report Date: </w:t>
       </w:r>
       <w:r>
-        <w:t>2026-04-09 01:26</w:t>
+        <w:t>2026-04-09 01:36</w:t>
       </w:r>
     </w:p>
     <w:p>
@@ -176,7 +176,7 @@
         <w:t xml:space="preserve">Data Sources: </w:t>
       </w:r>
       <w:r>
-        <w:t>20</w:t>
+        <w:t>22</w:t>
       </w:r>
     </w:p>
     <w:p>
@@ -217,7 +217,7 @@
         <w:t xml:space="preserve">Most Recent Filing: </w:t>
       </w:r>
       <w:r>
-        <w:t>2022-10-26</w:t>
+        <w:t>2026-04-08</w:t>
       </w:r>
     </w:p>
     <w:p>
@@ -228,7 +228,7 @@
         <w:t xml:space="preserve">Duration Days: </w:t>
       </w:r>
       <w:r>
-        <w:t>9574</w:t>
+        <w:t>10834</w:t>
       </w:r>
     </w:p>
     <w:p>
@@ -239,7 +239,7 @@
         <w:t xml:space="preserve">Duration Months: </w:t>
       </w:r>
       <w:r>
-        <w:t>314.5</w:t>
+        <w:t>355.9</w:t>
       </w:r>
     </w:p>
     <w:p>
@@ -250,7 +250,7 @@
         <w:t xml:space="preserve">Duration Years: </w:t>
       </w:r>
       <w:r>
-        <w:t>26.21</w:t>
+        <w:t>29.66</w:t>
       </w:r>
     </w:p>
     <w:p>
@@ -261,7 +261,7 @@
         <w:t xml:space="preserve">Total Filings: </w:t>
       </w:r>
       <w:r>
-        <w:t>139</w:t>
+        <w:t>254</w:t>
       </w:r>
     </w:p>
     <w:p>
@@ -272,7 +272,7 @@
         <w:t xml:space="preserve">Filings Per Month: </w:t>
       </w:r>
       <w:r>
-        <w:t>0.44</w:t>
+        <w:t>0.71</w:t>
       </w:r>
     </w:p>
     <w:p>
@@ -346,7 +346,7 @@
         <w:t xml:space="preserve">Officials Tracked: </w:t>
       </w:r>
       <w:r>
-        <w:t>32</w:t>
+        <w:t>39</w:t>
       </w:r>
     </w:p>
     <w:p>
@@ -357,7 +357,7 @@
         <w:t xml:space="preserve">Connections Found: </w:t>
       </w:r>
       <w:r>
-        <w:t>6</w:t>
+        <w:t>19</w:t>
       </w:r>
     </w:p>
     <w:p>
@@ -13996,7 +13996,7 @@
         <w:t xml:space="preserve">Most Recent Filing: </w:t>
       </w:r>
       <w:r>
-        <w:t>2022-10-26</w:t>
+        <w:t>2026-04-08</w:t>
       </w:r>
     </w:p>
     <w:p>
@@ -14007,7 +14007,7 @@
         <w:t xml:space="preserve">Duration Days: </w:t>
       </w:r>
       <w:r>
-        <w:t>9574</w:t>
+        <w:t>10834</w:t>
       </w:r>
     </w:p>
     <w:p>
@@ -14018,7 +14018,7 @@
         <w:t xml:space="preserve">Duration Months: </w:t>
       </w:r>
       <w:r>
-        <w:t>314.5</w:t>
+        <w:t>355.9</w:t>
       </w:r>
     </w:p>
     <w:p>
@@ -14029,7 +14029,7 @@
         <w:t xml:space="preserve">Duration Years: </w:t>
       </w:r>
       <w:r>
-        <w:t>26.21</w:t>
+        <w:t>29.66</w:t>
       </w:r>
     </w:p>
     <w:p>
@@ -14040,7 +14040,7 @@
         <w:t xml:space="preserve">Total Filings: </w:t>
       </w:r>
       <w:r>
-        <w:t>139</w:t>
+        <w:t>254</w:t>
       </w:r>
     </w:p>
     <w:p>
@@ -14051,7 +14051,7 @@
         <w:t xml:space="preserve">Filings Per Month: </w:t>
       </w:r>
       <w:r>
-        <w:t>0.44</w:t>
+        <w:t>0.71</w:t>
       </w:r>
     </w:p>
     <w:p>
@@ -14081,7 +14081,7 @@
         <w:t xml:space="preserve">Filings By Year: </w:t>
       </w:r>
       <w:r>
-        <w:t>{1996: 2, 2001: 1, 2011: 2, 2014: 1, 2020: 21, 2021: 10, 2022: 100}</w:t>
+        <w:t>{1996: 2, 2001: 1, 2011: 2, 2014: 1, 2020: 21, 2021: 10, 2022: 100, 2023: 89, 2024: 20, 2026: 6}</w:t>
       </w:r>
     </w:p>
     <w:p>
@@ -14092,7 +14092,7 @@
         <w:t xml:space="preserve">Filings By Month: </w:t>
       </w:r>
       <w:r>
-        <w:t>{'July': 32, 'April': 18, 'March': 15, 'December': 15, 'August': 13, 'January': 10, 'June': 9, 'November': 8, 'September': 5, 'May': 5, 'February': 4, 'October': 3}</w:t>
+        <w:t>{'June': 48, 'July': 39, 'August': 31, 'May': 30, 'April': 22, 'March': 20, 'December': 19, 'September': 13, 'January': 10, 'November': 9, 'October': 7, 'February': 4}</w:t>
       </w:r>
     </w:p>
     <w:p>
@@ -14103,7 +14103,7 @@
         <w:t xml:space="preserve">Avg Days Between Filings: </w:t>
       </w:r>
       <w:r>
-        <w:t>70.1</w:t>
+        <w:t>42.9</w:t>
       </w:r>
     </w:p>
     <w:p>
@@ -14125,7 +14125,7 @@
         <w:t xml:space="preserve">Rapid Filings Count: </w:t>
       </w:r>
       <w:r>
-        <w:t>110</w:t>
+        <w:t>207</w:t>
       </w:r>
     </w:p>
     <w:p>
@@ -14136,7 +14136,7 @@
         <w:t xml:space="preserve">Rapid Filing Ratio: </w:t>
       </w:r>
       <w:r>
-        <w:t>0.809</w:t>
+        <w:t>0.825</w:t>
       </w:r>
     </w:p>
     <w:p>
@@ -14277,7 +14277,7 @@
               <w:rPr>
                 <w:sz w:val="18"/>
               </w:rPr>
-              <w:t>139</w:t>
+              <w:t>254</w:t>
             </w:r>
           </w:p>
         </w:tc>
@@ -14290,7 +14290,7 @@
               <w:rPr>
                 <w:sz w:val="18"/>
               </w:rPr>
-              <w:t>139</w:t>
+              <w:t>254</w:t>
             </w:r>
           </w:p>
         </w:tc>
@@ -14303,7 +14303,7 @@
               <w:rPr>
                 <w:sz w:val="18"/>
               </w:rPr>
-              <w:t>139</w:t>
+              <w:t>254</w:t>
             </w:r>
           </w:p>
         </w:tc>
@@ -14452,7 +14452,7 @@
               <w:rPr>
                 <w:sz w:val="18"/>
               </w:rPr>
-              <w:t>Robert Kent Cales IV</w:t>
+              <w:t>Jane Grugan McManus</w:t>
             </w:r>
           </w:p>
         </w:tc>
@@ -14465,7 +14465,7 @@
               <w:rPr>
                 <w:sz w:val="18"/>
               </w:rPr>
-              <w:t>Defendant</w:t>
+              <w:t>Family (Defendant)</w:t>
             </w:r>
           </w:p>
         </w:tc>
@@ -14519,7 +14519,7 @@
               <w:rPr>
                 <w:sz w:val="18"/>
               </w:rPr>
-              <w:t>Johnny Alton McManus</w:t>
+              <w:t>Robert Kent Cales IV</w:t>
             </w:r>
           </w:p>
         </w:tc>
@@ -14532,7 +14532,7 @@
               <w:rPr>
                 <w:sz w:val="18"/>
               </w:rPr>
-              <w:t>Stepfather (Defendant)</w:t>
+              <w:t>Defendant</w:t>
             </w:r>
           </w:p>
         </w:tc>
@@ -14720,7 +14720,7 @@
               <w:rPr>
                 <w:sz w:val="18"/>
               </w:rPr>
-              <w:t>Jane Grugan McManus</w:t>
+              <w:t>AnnMarie McManus</w:t>
             </w:r>
           </w:p>
         </w:tc>
@@ -14787,7 +14787,7 @@
               <w:rPr>
                 <w:sz w:val="18"/>
               </w:rPr>
-              <w:t>Chief Magistrate Judge Matthew Johnson</w:t>
+              <w:t>Kerri Cales</w:t>
             </w:r>
           </w:p>
         </w:tc>
@@ -14800,7 +14800,7 @@
               <w:rPr>
                 <w:sz w:val="18"/>
               </w:rPr>
-              <w:t>Magistrate Judge</w:t>
+              <w:t>Family (Defendant)</w:t>
             </w:r>
           </w:p>
         </w:tc>
@@ -14854,7 +14854,7 @@
               <w:rPr>
                 <w:sz w:val="18"/>
               </w:rPr>
-              <w:t>Judge Greg Seigler</w:t>
+              <w:t>Johnny Alton McManus</w:t>
             </w:r>
           </w:p>
         </w:tc>
@@ -14867,7 +14867,7 @@
               <w:rPr>
                 <w:sz w:val="18"/>
               </w:rPr>
-              <w:t>Judge</w:t>
+              <w:t>Stepfather (Defendant)</w:t>
             </w:r>
           </w:p>
         </w:tc>
@@ -14921,7 +14921,7 @@
               <w:rPr>
                 <w:sz w:val="18"/>
               </w:rPr>
-              <w:t>Judge Huntley Crouch</w:t>
+              <w:t>Jaxson Cales</w:t>
             </w:r>
           </w:p>
         </w:tc>
@@ -14934,7 +14934,7 @@
               <w:rPr>
                 <w:sz w:val="18"/>
               </w:rPr>
-              <w:t>Judge</w:t>
+              <w:t>Family (Defendant)</w:t>
             </w:r>
           </w:p>
         </w:tc>
@@ -15055,7 +15055,7 @@
               <w:rPr>
                 <w:sz w:val="18"/>
               </w:rPr>
-              <w:t>Joshua Edwin Noah Pozsik</w:t>
+              <w:t>Chief Magistrate Judge Matthew Johnson</w:t>
             </w:r>
           </w:p>
         </w:tc>
@@ -15068,7 +15068,7 @@
               <w:rPr>
                 <w:sz w:val="18"/>
               </w:rPr>
-              <w:t>Attorney (Defendant)</w:t>
+              <w:t>Magistrate Judge</w:t>
             </w:r>
           </w:p>
         </w:tc>
@@ -15122,7 +15122,7 @@
               <w:rPr>
                 <w:sz w:val="18"/>
               </w:rPr>
-              <w:t>Kerri Cales</w:t>
+              <w:t>Judge Greg Seigler</w:t>
             </w:r>
           </w:p>
         </w:tc>
@@ -15135,7 +15135,7 @@
               <w:rPr>
                 <w:sz w:val="18"/>
               </w:rPr>
-              <w:t>Family (Defendant)</w:t>
+              <w:t>Judge</w:t>
             </w:r>
           </w:p>
         </w:tc>
@@ -15189,7 +15189,7 @@
               <w:rPr>
                 <w:sz w:val="18"/>
               </w:rPr>
-              <w:t>AnnMarie McManus</w:t>
+              <w:t>Judge Huntley Crouch</w:t>
             </w:r>
           </w:p>
         </w:tc>
@@ -15202,7 +15202,7 @@
               <w:rPr>
                 <w:sz w:val="18"/>
               </w:rPr>
-              <w:t>Family (Defendant)</w:t>
+              <w:t>Judge</w:t>
             </w:r>
           </w:p>
         </w:tc>
@@ -15256,7 +15256,7 @@
               <w:rPr>
                 <w:sz w:val="18"/>
               </w:rPr>
-              <w:t>Jaxson Cales</w:t>
+              <w:t>Patricia Morr</w:t>
             </w:r>
           </w:p>
         </w:tc>
@@ -15269,7 +15269,7 @@
               <w:rPr>
                 <w:sz w:val="18"/>
               </w:rPr>
-              <w:t>Family (Defendant)</w:t>
+              <w:t>Attorney (3rd Party)</w:t>
             </w:r>
           </w:p>
         </w:tc>
@@ -15323,7 +15323,7 @@
               <w:rPr>
                 <w:sz w:val="18"/>
               </w:rPr>
-              <w:t>Patricia Morr</w:t>
+              <w:t>Emily Hinson</w:t>
             </w:r>
           </w:p>
         </w:tc>
@@ -15336,7 +15336,7 @@
               <w:rPr>
                 <w:sz w:val="18"/>
               </w:rPr>
-              <w:t>Attorney (3rd Party)</w:t>
+              <w:t>Guardian Ad Litem</w:t>
             </w:r>
           </w:p>
         </w:tc>
@@ -15390,7 +15390,7 @@
               <w:rPr>
                 <w:sz w:val="18"/>
               </w:rPr>
-              <w:t>Amanda Smith Mueller</w:t>
+              <w:t>Suzanne Lorraine Hawkins</w:t>
             </w:r>
           </w:p>
         </w:tc>
@@ -15403,7 +15403,7 @@
               <w:rPr>
                 <w:sz w:val="18"/>
               </w:rPr>
-              <w:t>Attorney (3rd Party)</w:t>
+              <w:t>Attorney (Plaintiff)</w:t>
             </w:r>
           </w:p>
         </w:tc>
@@ -15457,7 +15457,7 @@
               <w:rPr>
                 <w:sz w:val="18"/>
               </w:rPr>
-              <w:t>Linda Carpenter</w:t>
+              <w:t>Suzanne Atkins Hawkins</w:t>
             </w:r>
           </w:p>
         </w:tc>
@@ -15524,7 +15524,7 @@
               <w:rPr>
                 <w:sz w:val="18"/>
               </w:rPr>
-              <w:t>Emily Hinson</w:t>
+              <w:t>Lawrence Dale Turner</w:t>
             </w:r>
           </w:p>
         </w:tc>
@@ -15537,7 +15537,7 @@
               <w:rPr>
                 <w:sz w:val="18"/>
               </w:rPr>
-              <w:t>Guardian Ad Litem</w:t>
+              <w:t>Attorney (Plaintiff)</w:t>
             </w:r>
           </w:p>
         </w:tc>
@@ -15591,7 +15591,7 @@
               <w:rPr>
                 <w:sz w:val="18"/>
               </w:rPr>
-              <w:t>Gary Paul Pozsik</w:t>
+              <w:t>Joshua Edwin Noah Pozsik</w:t>
             </w:r>
           </w:p>
         </w:tc>
@@ -15604,7 +15604,7 @@
               <w:rPr>
                 <w:sz w:val="18"/>
               </w:rPr>
-              <w:t>Notary</w:t>
+              <w:t>Attorney (Defendant)</w:t>
             </w:r>
           </w:p>
         </w:tc>
@@ -15658,7 +15658,7 @@
               <w:rPr>
                 <w:sz w:val="18"/>
               </w:rPr>
-              <w:t>Suzanne Lorraine Hawkins</w:t>
+              <w:t>Linda Carpenter</w:t>
             </w:r>
           </w:p>
         </w:tc>
@@ -15671,7 +15671,7 @@
               <w:rPr>
                 <w:sz w:val="18"/>
               </w:rPr>
-              <w:t>Attorney (Plaintiff)</w:t>
+              <w:t>Attorney</w:t>
             </w:r>
           </w:p>
         </w:tc>
@@ -15725,7 +15725,7 @@
               <w:rPr>
                 <w:sz w:val="18"/>
               </w:rPr>
-              <w:t>Suzanne Atkins Hawkins</w:t>
+              <w:t>Amanda Smith Mueller</w:t>
             </w:r>
           </w:p>
         </w:tc>
@@ -15738,7 +15738,7 @@
               <w:rPr>
                 <w:sz w:val="18"/>
               </w:rPr>
-              <w:t>Attorney</w:t>
+              <w:t>Attorney (3rd Party)</w:t>
             </w:r>
           </w:p>
         </w:tc>
@@ -15792,7 +15792,7 @@
               <w:rPr>
                 <w:sz w:val="18"/>
               </w:rPr>
-              <w:t>Lawrence Dale Turner</w:t>
+              <w:t>Donna Strom</w:t>
             </w:r>
           </w:p>
         </w:tc>
@@ -15805,7 +15805,7 @@
               <w:rPr>
                 <w:sz w:val="18"/>
               </w:rPr>
-              <w:t>Attorney (Plaintiff)</w:t>
+              <w:t>Notary</w:t>
             </w:r>
           </w:p>
         </w:tc>
@@ -15859,7 +15859,7 @@
               <w:rPr>
                 <w:sz w:val="18"/>
               </w:rPr>
-              <w:t>Melissa Atwood</w:t>
+              <w:t>Mindy Zimmerman</w:t>
             </w:r>
           </w:p>
         </w:tc>
@@ -15872,7 +15872,7 @@
               <w:rPr>
                 <w:sz w:val="18"/>
               </w:rPr>
-              <w:t>Notary</w:t>
+              <w:t>Connected Party</w:t>
             </w:r>
           </w:p>
         </w:tc>
@@ -15926,7 +15926,7 @@
               <w:rPr>
                 <w:sz w:val="18"/>
               </w:rPr>
-              <w:t>Donna Strom</w:t>
+              <w:t>Gary Paul Pozsik</w:t>
             </w:r>
           </w:p>
         </w:tc>
@@ -15993,7 +15993,7 @@
               <w:rPr>
                 <w:sz w:val="18"/>
               </w:rPr>
-              <w:t>Mindy Zimmerman</w:t>
+              <w:t>Melissa Atwood</w:t>
             </w:r>
           </w:p>
         </w:tc>
@@ -16006,7 +16006,7 @@
               <w:rPr>
                 <w:sz w:val="18"/>
               </w:rPr>
-              <w:t>Connected Party</w:t>
+              <w:t>Notary</w:t>
             </w:r>
           </w:p>
         </w:tc>
@@ -16060,7 +16060,7 @@
               <w:rPr>
                 <w:sz w:val="18"/>
               </w:rPr>
-              <w:t>Tresa B. Wolfe</w:t>
+              <w:t>Stephanie Fajardo</w:t>
             </w:r>
           </w:p>
         </w:tc>
@@ -16073,7 +16073,7 @@
               <w:rPr>
                 <w:sz w:val="18"/>
               </w:rPr>
-              <w:t>Notary</w:t>
+              <w:t>Conflict</w:t>
             </w:r>
           </w:p>
         </w:tc>
@@ -16127,7 +16127,7 @@
               <w:rPr>
                 <w:sz w:val="18"/>
               </w:rPr>
-              <w:t>Stephanie Fajardo</w:t>
+              <w:t>Tresa B. Wolfe</w:t>
             </w:r>
           </w:p>
         </w:tc>
@@ -16140,7 +16140,7 @@
               <w:rPr>
                 <w:sz w:val="18"/>
               </w:rPr>
-              <w:t>Conflict</w:t>
+              <w:t>Notary</w:t>
             </w:r>
           </w:p>
         </w:tc>
@@ -16194,7 +16194,7 @@
               <w:rPr>
                 <w:sz w:val="18"/>
               </w:rPr>
-              <w:t>Jewitte Dooley</w:t>
+              <w:t>Kenneth Wiggins</w:t>
             </w:r>
           </w:p>
         </w:tc>
@@ -16207,7 +16207,7 @@
               <w:rPr>
                 <w:sz w:val="18"/>
               </w:rPr>
-              <w:t>Conflict</w:t>
+              <w:t>Attorney (FL)</w:t>
             </w:r>
           </w:p>
         </w:tc>
@@ -16261,7 +16261,7 @@
               <w:rPr>
                 <w:sz w:val="18"/>
               </w:rPr>
-              <w:t>Kenneth Wiggins</w:t>
+              <w:t>Jewitte Dooley</w:t>
             </w:r>
           </w:p>
         </w:tc>
@@ -16274,7 +16274,7 @@
               <w:rPr>
                 <w:sz w:val="18"/>
               </w:rPr>
-              <w:t>Attorney (FL)</w:t>
+              <w:t>Conflict</w:t>
             </w:r>
           </w:p>
         </w:tc>
@@ -16328,6 +16328,140 @@
               <w:rPr>
                 <w:sz w:val="18"/>
               </w:rPr>
+              <w:t>Nettie Elizabeth Branham</w:t>
+            </w:r>
+          </w:p>
+        </w:tc>
+        <w:tc>
+          <w:tcPr>
+            <w:tcW w:type="dxa" w:w="1728"/>
+          </w:tcPr>
+          <w:p>
+            <w:r>
+              <w:rPr>
+                <w:sz w:val="18"/>
+              </w:rPr>
+              <w:t>Guardian Ad Litem</w:t>
+            </w:r>
+          </w:p>
+        </w:tc>
+        <w:tc>
+          <w:tcPr>
+            <w:tcW w:type="dxa" w:w="1728"/>
+          </w:tcPr>
+          <w:p>
+            <w:r>
+              <w:rPr>
+                <w:sz w:val="18"/>
+              </w:rPr>
+              <w:t>0</w:t>
+            </w:r>
+          </w:p>
+        </w:tc>
+        <w:tc>
+          <w:tcPr>
+            <w:tcW w:type="dxa" w:w="1728"/>
+          </w:tcPr>
+          <w:p>
+            <w:r>
+              <w:rPr>
+                <w:sz w:val="18"/>
+              </w:rPr>
+              <w:t>0</w:t>
+            </w:r>
+          </w:p>
+        </w:tc>
+        <w:tc>
+          <w:tcPr>
+            <w:tcW w:type="dxa" w:w="1728"/>
+          </w:tcPr>
+          <w:p>
+            <w:r>
+              <w:rPr>
+                <w:sz w:val="18"/>
+              </w:rPr>
+              <w:t>0</w:t>
+            </w:r>
+          </w:p>
+        </w:tc>
+      </w:tr>
+      <w:tr>
+        <w:tc>
+          <w:tcPr>
+            <w:tcW w:type="dxa" w:w="1728"/>
+          </w:tcPr>
+          <w:p>
+            <w:r>
+              <w:rPr>
+                <w:sz w:val="18"/>
+              </w:rPr>
+              <w:t>Howard S. Sheftman</w:t>
+            </w:r>
+          </w:p>
+        </w:tc>
+        <w:tc>
+          <w:tcPr>
+            <w:tcW w:type="dxa" w:w="1728"/>
+          </w:tcPr>
+          <w:p>
+            <w:r>
+              <w:rPr>
+                <w:sz w:val="18"/>
+              </w:rPr>
+              <w:t>Attorney</w:t>
+            </w:r>
+          </w:p>
+        </w:tc>
+        <w:tc>
+          <w:tcPr>
+            <w:tcW w:type="dxa" w:w="1728"/>
+          </w:tcPr>
+          <w:p>
+            <w:r>
+              <w:rPr>
+                <w:sz w:val="18"/>
+              </w:rPr>
+              <w:t>0</w:t>
+            </w:r>
+          </w:p>
+        </w:tc>
+        <w:tc>
+          <w:tcPr>
+            <w:tcW w:type="dxa" w:w="1728"/>
+          </w:tcPr>
+          <w:p>
+            <w:r>
+              <w:rPr>
+                <w:sz w:val="18"/>
+              </w:rPr>
+              <w:t>0</w:t>
+            </w:r>
+          </w:p>
+        </w:tc>
+        <w:tc>
+          <w:tcPr>
+            <w:tcW w:type="dxa" w:w="1728"/>
+          </w:tcPr>
+          <w:p>
+            <w:r>
+              <w:rPr>
+                <w:sz w:val="18"/>
+              </w:rPr>
+              <w:t>0</w:t>
+            </w:r>
+          </w:p>
+        </w:tc>
+      </w:tr>
+      <w:tr>
+        <w:tc>
+          <w:tcPr>
+            <w:tcW w:type="dxa" w:w="1728"/>
+          </w:tcPr>
+          <w:p>
+            <w:r>
+              <w:rPr>
+                <w:sz w:val="18"/>
+              </w:rPr>
               <w:t>Kailyn Slice</w:t>
             </w:r>
           </w:p>
@@ -16342,6 +16476,341 @@
                 <w:sz w:val="18"/>
               </w:rPr>
               <w:t>Unknown</w:t>
+            </w:r>
+          </w:p>
+        </w:tc>
+        <w:tc>
+          <w:tcPr>
+            <w:tcW w:type="dxa" w:w="1728"/>
+          </w:tcPr>
+          <w:p>
+            <w:r>
+              <w:rPr>
+                <w:sz w:val="18"/>
+              </w:rPr>
+              <w:t>0</w:t>
+            </w:r>
+          </w:p>
+        </w:tc>
+        <w:tc>
+          <w:tcPr>
+            <w:tcW w:type="dxa" w:w="1728"/>
+          </w:tcPr>
+          <w:p>
+            <w:r>
+              <w:rPr>
+                <w:sz w:val="18"/>
+              </w:rPr>
+              <w:t>0</w:t>
+            </w:r>
+          </w:p>
+        </w:tc>
+        <w:tc>
+          <w:tcPr>
+            <w:tcW w:type="dxa" w:w="1728"/>
+          </w:tcPr>
+          <w:p>
+            <w:r>
+              <w:rPr>
+                <w:sz w:val="18"/>
+              </w:rPr>
+              <w:t>0</w:t>
+            </w:r>
+          </w:p>
+        </w:tc>
+      </w:tr>
+      <w:tr>
+        <w:tc>
+          <w:tcPr>
+            <w:tcW w:type="dxa" w:w="1728"/>
+          </w:tcPr>
+          <w:p>
+            <w:r>
+              <w:rPr>
+                <w:sz w:val="18"/>
+              </w:rPr>
+              <w:t>Elizabeth Kipling von Keller</w:t>
+            </w:r>
+          </w:p>
+        </w:tc>
+        <w:tc>
+          <w:tcPr>
+            <w:tcW w:type="dxa" w:w="1728"/>
+          </w:tcPr>
+          <w:p>
+            <w:r>
+              <w:rPr>
+                <w:sz w:val="18"/>
+              </w:rPr>
+              <w:t>Attorney</w:t>
+            </w:r>
+          </w:p>
+        </w:tc>
+        <w:tc>
+          <w:tcPr>
+            <w:tcW w:type="dxa" w:w="1728"/>
+          </w:tcPr>
+          <w:p>
+            <w:r>
+              <w:rPr>
+                <w:sz w:val="18"/>
+              </w:rPr>
+              <w:t>0</w:t>
+            </w:r>
+          </w:p>
+        </w:tc>
+        <w:tc>
+          <w:tcPr>
+            <w:tcW w:type="dxa" w:w="1728"/>
+          </w:tcPr>
+          <w:p>
+            <w:r>
+              <w:rPr>
+                <w:sz w:val="18"/>
+              </w:rPr>
+              <w:t>0</w:t>
+            </w:r>
+          </w:p>
+        </w:tc>
+        <w:tc>
+          <w:tcPr>
+            <w:tcW w:type="dxa" w:w="1728"/>
+          </w:tcPr>
+          <w:p>
+            <w:r>
+              <w:rPr>
+                <w:sz w:val="18"/>
+              </w:rPr>
+              <w:t>0</w:t>
+            </w:r>
+          </w:p>
+        </w:tc>
+      </w:tr>
+      <w:tr>
+        <w:tc>
+          <w:tcPr>
+            <w:tcW w:type="dxa" w:w="1728"/>
+          </w:tcPr>
+          <w:p>
+            <w:r>
+              <w:rPr>
+                <w:sz w:val="18"/>
+              </w:rPr>
+              <w:t>Melanie Spears</w:t>
+            </w:r>
+          </w:p>
+        </w:tc>
+        <w:tc>
+          <w:tcPr>
+            <w:tcW w:type="dxa" w:w="1728"/>
+          </w:tcPr>
+          <w:p>
+            <w:r>
+              <w:rPr>
+                <w:sz w:val="18"/>
+              </w:rPr>
+              <w:t>Court Staff/Clerk</w:t>
+            </w:r>
+          </w:p>
+        </w:tc>
+        <w:tc>
+          <w:tcPr>
+            <w:tcW w:type="dxa" w:w="1728"/>
+          </w:tcPr>
+          <w:p>
+            <w:r>
+              <w:rPr>
+                <w:sz w:val="18"/>
+              </w:rPr>
+              <w:t>0</w:t>
+            </w:r>
+          </w:p>
+        </w:tc>
+        <w:tc>
+          <w:tcPr>
+            <w:tcW w:type="dxa" w:w="1728"/>
+          </w:tcPr>
+          <w:p>
+            <w:r>
+              <w:rPr>
+                <w:sz w:val="18"/>
+              </w:rPr>
+              <w:t>0</w:t>
+            </w:r>
+          </w:p>
+        </w:tc>
+        <w:tc>
+          <w:tcPr>
+            <w:tcW w:type="dxa" w:w="1728"/>
+          </w:tcPr>
+          <w:p>
+            <w:r>
+              <w:rPr>
+                <w:sz w:val="18"/>
+              </w:rPr>
+              <w:t>0</w:t>
+            </w:r>
+          </w:p>
+        </w:tc>
+      </w:tr>
+      <w:tr>
+        <w:tc>
+          <w:tcPr>
+            <w:tcW w:type="dxa" w:w="1728"/>
+          </w:tcPr>
+          <w:p>
+            <w:r>
+              <w:rPr>
+                <w:sz w:val="18"/>
+              </w:rPr>
+              <w:t>Jon Afman</w:t>
+            </w:r>
+          </w:p>
+        </w:tc>
+        <w:tc>
+          <w:tcPr>
+            <w:tcW w:type="dxa" w:w="1728"/>
+          </w:tcPr>
+          <w:p>
+            <w:r>
+              <w:rPr>
+                <w:sz w:val="18"/>
+              </w:rPr>
+              <w:t>Third Party/Witness</w:t>
+            </w:r>
+          </w:p>
+        </w:tc>
+        <w:tc>
+          <w:tcPr>
+            <w:tcW w:type="dxa" w:w="1728"/>
+          </w:tcPr>
+          <w:p>
+            <w:r>
+              <w:rPr>
+                <w:sz w:val="18"/>
+              </w:rPr>
+              <w:t>0</w:t>
+            </w:r>
+          </w:p>
+        </w:tc>
+        <w:tc>
+          <w:tcPr>
+            <w:tcW w:type="dxa" w:w="1728"/>
+          </w:tcPr>
+          <w:p>
+            <w:r>
+              <w:rPr>
+                <w:sz w:val="18"/>
+              </w:rPr>
+              <w:t>0</w:t>
+            </w:r>
+          </w:p>
+        </w:tc>
+        <w:tc>
+          <w:tcPr>
+            <w:tcW w:type="dxa" w:w="1728"/>
+          </w:tcPr>
+          <w:p>
+            <w:r>
+              <w:rPr>
+                <w:sz w:val="18"/>
+              </w:rPr>
+              <w:t>0</w:t>
+            </w:r>
+          </w:p>
+        </w:tc>
+      </w:tr>
+      <w:tr>
+        <w:tc>
+          <w:tcPr>
+            <w:tcW w:type="dxa" w:w="1728"/>
+          </w:tcPr>
+          <w:p>
+            <w:r>
+              <w:rPr>
+                <w:sz w:val="18"/>
+              </w:rPr>
+              <w:t>Rosalyn Frierson-Smith</w:t>
+            </w:r>
+          </w:p>
+        </w:tc>
+        <w:tc>
+          <w:tcPr>
+            <w:tcW w:type="dxa" w:w="1728"/>
+          </w:tcPr>
+          <w:p>
+            <w:r>
+              <w:rPr>
+                <w:sz w:val="18"/>
+              </w:rPr>
+              <w:t>Judge</w:t>
+            </w:r>
+          </w:p>
+        </w:tc>
+        <w:tc>
+          <w:tcPr>
+            <w:tcW w:type="dxa" w:w="1728"/>
+          </w:tcPr>
+          <w:p>
+            <w:r>
+              <w:rPr>
+                <w:sz w:val="18"/>
+              </w:rPr>
+              <w:t>0</w:t>
+            </w:r>
+          </w:p>
+        </w:tc>
+        <w:tc>
+          <w:tcPr>
+            <w:tcW w:type="dxa" w:w="1728"/>
+          </w:tcPr>
+          <w:p>
+            <w:r>
+              <w:rPr>
+                <w:sz w:val="18"/>
+              </w:rPr>
+              <w:t>0</w:t>
+            </w:r>
+          </w:p>
+        </w:tc>
+        <w:tc>
+          <w:tcPr>
+            <w:tcW w:type="dxa" w:w="1728"/>
+          </w:tcPr>
+          <w:p>
+            <w:r>
+              <w:rPr>
+                <w:sz w:val="18"/>
+              </w:rPr>
+              <w:t>0</w:t>
+            </w:r>
+          </w:p>
+        </w:tc>
+      </w:tr>
+      <w:tr>
+        <w:tc>
+          <w:tcPr>
+            <w:tcW w:type="dxa" w:w="1728"/>
+          </w:tcPr>
+          <w:p>
+            <w:r>
+              <w:rPr>
+                <w:sz w:val="18"/>
+              </w:rPr>
+              <w:t>Bryn Colette Sarvis</w:t>
+            </w:r>
+          </w:p>
+        </w:tc>
+        <w:tc>
+          <w:tcPr>
+            <w:tcW w:type="dxa" w:w="1728"/>
+          </w:tcPr>
+          <w:p>
+            <w:r>
+              <w:rPr>
+                <w:sz w:val="18"/>
+              </w:rPr>
+              <w:t>Attorney (Plaintiff in 2026DR3200579)</w:t>
             </w:r>
           </w:p>
         </w:tc>
@@ -18825,6 +19294,566 @@
               <w:rPr>
                 <w:sz w:val="18"/>
               </w:rPr>
+              <w:t>Howard S. Sheftman</w:t>
+            </w:r>
+          </w:p>
+        </w:tc>
+        <w:tc>
+          <w:tcPr>
+            <w:tcW w:type="dxa" w:w="1440"/>
+          </w:tcPr>
+          <w:p>
+            <w:r>
+              <w:rPr>
+                <w:sz w:val="18"/>
+              </w:rPr>
+              <w:t>Attorney</w:t>
+            </w:r>
+          </w:p>
+        </w:tc>
+        <w:tc>
+          <w:tcPr>
+            <w:tcW w:type="dxa" w:w="1440"/>
+          </w:tcPr>
+          <w:p>
+            <w:r>
+              <w:rPr>
+                <w:sz w:val="18"/>
+              </w:rPr>
+              <w:t>0</w:t>
+            </w:r>
+          </w:p>
+        </w:tc>
+        <w:tc>
+          <w:tcPr>
+            <w:tcW w:type="dxa" w:w="1440"/>
+          </w:tcPr>
+          <w:p>
+            <w:r>
+              <w:rPr>
+                <w:sz w:val="18"/>
+              </w:rPr>
+              <w:t>350</w:t>
+            </w:r>
+          </w:p>
+        </w:tc>
+        <w:tc>
+          <w:tcPr>
+            <w:tcW w:type="dxa" w:w="1440"/>
+          </w:tcPr>
+          <w:p>
+            <w:r>
+              <w:rPr>
+                <w:sz w:val="18"/>
+              </w:rPr>
+              <w:t>0</w:t>
+            </w:r>
+          </w:p>
+        </w:tc>
+        <w:tc>
+          <w:tcPr>
+            <w:tcW w:type="dxa" w:w="1440"/>
+          </w:tcPr>
+          <w:p>
+            <w:r>
+              <w:rPr>
+                <w:sz w:val="18"/>
+              </w:rPr>
+              <w:t>0</w:t>
+            </w:r>
+          </w:p>
+        </w:tc>
+      </w:tr>
+      <w:tr>
+        <w:tc>
+          <w:tcPr>
+            <w:tcW w:type="dxa" w:w="1440"/>
+          </w:tcPr>
+          <w:p>
+            <w:r>
+              <w:rPr>
+                <w:sz w:val="18"/>
+              </w:rPr>
+              <w:t>Nettie Elizabeth Branham</w:t>
+            </w:r>
+          </w:p>
+        </w:tc>
+        <w:tc>
+          <w:tcPr>
+            <w:tcW w:type="dxa" w:w="1440"/>
+          </w:tcPr>
+          <w:p>
+            <w:r>
+              <w:rPr>
+                <w:sz w:val="18"/>
+              </w:rPr>
+              <w:t>Guardian Ad Litem</w:t>
+            </w:r>
+          </w:p>
+        </w:tc>
+        <w:tc>
+          <w:tcPr>
+            <w:tcW w:type="dxa" w:w="1440"/>
+          </w:tcPr>
+          <w:p>
+            <w:r>
+              <w:rPr>
+                <w:sz w:val="18"/>
+              </w:rPr>
+              <w:t>0</w:t>
+            </w:r>
+          </w:p>
+        </w:tc>
+        <w:tc>
+          <w:tcPr>
+            <w:tcW w:type="dxa" w:w="1440"/>
+          </w:tcPr>
+          <w:p>
+            <w:r>
+              <w:rPr>
+                <w:sz w:val="18"/>
+              </w:rPr>
+              <w:t>250</w:t>
+            </w:r>
+          </w:p>
+        </w:tc>
+        <w:tc>
+          <w:tcPr>
+            <w:tcW w:type="dxa" w:w="1440"/>
+          </w:tcPr>
+          <w:p>
+            <w:r>
+              <w:rPr>
+                <w:sz w:val="18"/>
+              </w:rPr>
+              <w:t>0</w:t>
+            </w:r>
+          </w:p>
+        </w:tc>
+        <w:tc>
+          <w:tcPr>
+            <w:tcW w:type="dxa" w:w="1440"/>
+          </w:tcPr>
+          <w:p>
+            <w:r>
+              <w:rPr>
+                <w:sz w:val="18"/>
+              </w:rPr>
+              <w:t>0</w:t>
+            </w:r>
+          </w:p>
+        </w:tc>
+      </w:tr>
+      <w:tr>
+        <w:tc>
+          <w:tcPr>
+            <w:tcW w:type="dxa" w:w="1440"/>
+          </w:tcPr>
+          <w:p>
+            <w:r>
+              <w:rPr>
+                <w:sz w:val="18"/>
+              </w:rPr>
+              <w:t>Elizabeth Kipling von Keller</w:t>
+            </w:r>
+          </w:p>
+        </w:tc>
+        <w:tc>
+          <w:tcPr>
+            <w:tcW w:type="dxa" w:w="1440"/>
+          </w:tcPr>
+          <w:p>
+            <w:r>
+              <w:rPr>
+                <w:sz w:val="18"/>
+              </w:rPr>
+              <w:t>Attorney</w:t>
+            </w:r>
+          </w:p>
+        </w:tc>
+        <w:tc>
+          <w:tcPr>
+            <w:tcW w:type="dxa" w:w="1440"/>
+          </w:tcPr>
+          <w:p>
+            <w:r>
+              <w:rPr>
+                <w:sz w:val="18"/>
+              </w:rPr>
+              <w:t>0</w:t>
+            </w:r>
+          </w:p>
+        </w:tc>
+        <w:tc>
+          <w:tcPr>
+            <w:tcW w:type="dxa" w:w="1440"/>
+          </w:tcPr>
+          <w:p>
+            <w:r>
+              <w:rPr>
+                <w:sz w:val="18"/>
+              </w:rPr>
+              <w:t>350</w:t>
+            </w:r>
+          </w:p>
+        </w:tc>
+        <w:tc>
+          <w:tcPr>
+            <w:tcW w:type="dxa" w:w="1440"/>
+          </w:tcPr>
+          <w:p>
+            <w:r>
+              <w:rPr>
+                <w:sz w:val="18"/>
+              </w:rPr>
+              <w:t>0</w:t>
+            </w:r>
+          </w:p>
+        </w:tc>
+        <w:tc>
+          <w:tcPr>
+            <w:tcW w:type="dxa" w:w="1440"/>
+          </w:tcPr>
+          <w:p>
+            <w:r>
+              <w:rPr>
+                <w:sz w:val="18"/>
+              </w:rPr>
+              <w:t>0</w:t>
+            </w:r>
+          </w:p>
+        </w:tc>
+      </w:tr>
+      <w:tr>
+        <w:tc>
+          <w:tcPr>
+            <w:tcW w:type="dxa" w:w="1440"/>
+          </w:tcPr>
+          <w:p>
+            <w:r>
+              <w:rPr>
+                <w:sz w:val="18"/>
+              </w:rPr>
+              <w:t>Rosalyn Frierson-Smith</w:t>
+            </w:r>
+          </w:p>
+        </w:tc>
+        <w:tc>
+          <w:tcPr>
+            <w:tcW w:type="dxa" w:w="1440"/>
+          </w:tcPr>
+          <w:p>
+            <w:r>
+              <w:rPr>
+                <w:sz w:val="18"/>
+              </w:rPr>
+              <w:t>Judge</w:t>
+            </w:r>
+          </w:p>
+        </w:tc>
+        <w:tc>
+          <w:tcPr>
+            <w:tcW w:type="dxa" w:w="1440"/>
+          </w:tcPr>
+          <w:p>
+            <w:r>
+              <w:rPr>
+                <w:sz w:val="18"/>
+              </w:rPr>
+              <w:t>0</w:t>
+            </w:r>
+          </w:p>
+        </w:tc>
+        <w:tc>
+          <w:tcPr>
+            <w:tcW w:type="dxa" w:w="1440"/>
+          </w:tcPr>
+          <w:p>
+            <w:r>
+              <w:rPr>
+                <w:sz w:val="18"/>
+              </w:rPr>
+              <w:t>0</w:t>
+            </w:r>
+          </w:p>
+        </w:tc>
+        <w:tc>
+          <w:tcPr>
+            <w:tcW w:type="dxa" w:w="1440"/>
+          </w:tcPr>
+          <w:p>
+            <w:r>
+              <w:rPr>
+                <w:sz w:val="18"/>
+              </w:rPr>
+              <w:t>0</w:t>
+            </w:r>
+          </w:p>
+        </w:tc>
+        <w:tc>
+          <w:tcPr>
+            <w:tcW w:type="dxa" w:w="1440"/>
+          </w:tcPr>
+          <w:p>
+            <w:r>
+              <w:rPr>
+                <w:sz w:val="18"/>
+              </w:rPr>
+              <w:t>0</w:t>
+            </w:r>
+          </w:p>
+        </w:tc>
+      </w:tr>
+      <w:tr>
+        <w:tc>
+          <w:tcPr>
+            <w:tcW w:type="dxa" w:w="1440"/>
+          </w:tcPr>
+          <w:p>
+            <w:r>
+              <w:rPr>
+                <w:sz w:val="18"/>
+              </w:rPr>
+              <w:t>Jon Afman</w:t>
+            </w:r>
+          </w:p>
+        </w:tc>
+        <w:tc>
+          <w:tcPr>
+            <w:tcW w:type="dxa" w:w="1440"/>
+          </w:tcPr>
+          <w:p>
+            <w:r>
+              <w:rPr>
+                <w:sz w:val="18"/>
+              </w:rPr>
+              <w:t>Third Party/Witness</w:t>
+            </w:r>
+          </w:p>
+        </w:tc>
+        <w:tc>
+          <w:tcPr>
+            <w:tcW w:type="dxa" w:w="1440"/>
+          </w:tcPr>
+          <w:p>
+            <w:r>
+              <w:rPr>
+                <w:sz w:val="18"/>
+              </w:rPr>
+              <w:t>0</w:t>
+            </w:r>
+          </w:p>
+        </w:tc>
+        <w:tc>
+          <w:tcPr>
+            <w:tcW w:type="dxa" w:w="1440"/>
+          </w:tcPr>
+          <w:p>
+            <w:r>
+              <w:rPr>
+                <w:sz w:val="18"/>
+              </w:rPr>
+              <w:t>250</w:t>
+            </w:r>
+          </w:p>
+        </w:tc>
+        <w:tc>
+          <w:tcPr>
+            <w:tcW w:type="dxa" w:w="1440"/>
+          </w:tcPr>
+          <w:p>
+            <w:r>
+              <w:rPr>
+                <w:sz w:val="18"/>
+              </w:rPr>
+              <w:t>0</w:t>
+            </w:r>
+          </w:p>
+        </w:tc>
+        <w:tc>
+          <w:tcPr>
+            <w:tcW w:type="dxa" w:w="1440"/>
+          </w:tcPr>
+          <w:p>
+            <w:r>
+              <w:rPr>
+                <w:sz w:val="18"/>
+              </w:rPr>
+              <w:t>0</w:t>
+            </w:r>
+          </w:p>
+        </w:tc>
+      </w:tr>
+      <w:tr>
+        <w:tc>
+          <w:tcPr>
+            <w:tcW w:type="dxa" w:w="1440"/>
+          </w:tcPr>
+          <w:p>
+            <w:r>
+              <w:rPr>
+                <w:sz w:val="18"/>
+              </w:rPr>
+              <w:t>Melanie Spears</w:t>
+            </w:r>
+          </w:p>
+        </w:tc>
+        <w:tc>
+          <w:tcPr>
+            <w:tcW w:type="dxa" w:w="1440"/>
+          </w:tcPr>
+          <w:p>
+            <w:r>
+              <w:rPr>
+                <w:sz w:val="18"/>
+              </w:rPr>
+              <w:t>Court Staff/Clerk</w:t>
+            </w:r>
+          </w:p>
+        </w:tc>
+        <w:tc>
+          <w:tcPr>
+            <w:tcW w:type="dxa" w:w="1440"/>
+          </w:tcPr>
+          <w:p>
+            <w:r>
+              <w:rPr>
+                <w:sz w:val="18"/>
+              </w:rPr>
+              <w:t>0</w:t>
+            </w:r>
+          </w:p>
+        </w:tc>
+        <w:tc>
+          <w:tcPr>
+            <w:tcW w:type="dxa" w:w="1440"/>
+          </w:tcPr>
+          <w:p>
+            <w:r>
+              <w:rPr>
+                <w:sz w:val="18"/>
+              </w:rPr>
+              <w:t>250</w:t>
+            </w:r>
+          </w:p>
+        </w:tc>
+        <w:tc>
+          <w:tcPr>
+            <w:tcW w:type="dxa" w:w="1440"/>
+          </w:tcPr>
+          <w:p>
+            <w:r>
+              <w:rPr>
+                <w:sz w:val="18"/>
+              </w:rPr>
+              <w:t>0</w:t>
+            </w:r>
+          </w:p>
+        </w:tc>
+        <w:tc>
+          <w:tcPr>
+            <w:tcW w:type="dxa" w:w="1440"/>
+          </w:tcPr>
+          <w:p>
+            <w:r>
+              <w:rPr>
+                <w:sz w:val="18"/>
+              </w:rPr>
+              <w:t>0</w:t>
+            </w:r>
+          </w:p>
+        </w:tc>
+      </w:tr>
+      <w:tr>
+        <w:tc>
+          <w:tcPr>
+            <w:tcW w:type="dxa" w:w="1440"/>
+          </w:tcPr>
+          <w:p>
+            <w:r>
+              <w:rPr>
+                <w:sz w:val="18"/>
+              </w:rPr>
+              <w:t>Bryn Colette Sarvis</w:t>
+            </w:r>
+          </w:p>
+        </w:tc>
+        <w:tc>
+          <w:tcPr>
+            <w:tcW w:type="dxa" w:w="1440"/>
+          </w:tcPr>
+          <w:p>
+            <w:r>
+              <w:rPr>
+                <w:sz w:val="18"/>
+              </w:rPr>
+              <w:t>Attorney (Plaintiff in 2026DR3200579)</w:t>
+            </w:r>
+          </w:p>
+        </w:tc>
+        <w:tc>
+          <w:tcPr>
+            <w:tcW w:type="dxa" w:w="1440"/>
+          </w:tcPr>
+          <w:p>
+            <w:r>
+              <w:rPr>
+                <w:sz w:val="18"/>
+              </w:rPr>
+              <w:t>0</w:t>
+            </w:r>
+          </w:p>
+        </w:tc>
+        <w:tc>
+          <w:tcPr>
+            <w:tcW w:type="dxa" w:w="1440"/>
+          </w:tcPr>
+          <w:p>
+            <w:r>
+              <w:rPr>
+                <w:sz w:val="18"/>
+              </w:rPr>
+              <w:t>250</w:t>
+            </w:r>
+          </w:p>
+        </w:tc>
+        <w:tc>
+          <w:tcPr>
+            <w:tcW w:type="dxa" w:w="1440"/>
+          </w:tcPr>
+          <w:p>
+            <w:r>
+              <w:rPr>
+                <w:sz w:val="18"/>
+              </w:rPr>
+              <w:t>0</w:t>
+            </w:r>
+          </w:p>
+        </w:tc>
+        <w:tc>
+          <w:tcPr>
+            <w:tcW w:type="dxa" w:w="1440"/>
+          </w:tcPr>
+          <w:p>
+            <w:r>
+              <w:rPr>
+                <w:sz w:val="18"/>
+              </w:rPr>
+              <w:t>0</w:t>
+            </w:r>
+          </w:p>
+        </w:tc>
+      </w:tr>
+      <w:tr>
+        <w:tc>
+          <w:tcPr>
+            <w:tcW w:type="dxa" w:w="1440"/>
+          </w:tcPr>
+          <w:p>
+            <w:r>
+              <w:rPr>
+                <w:sz w:val="18"/>
+              </w:rPr>
               <w:t>NaT</w:t>
             </w:r>
           </w:p>
@@ -18851,7 +19880,7 @@
               <w:rPr>
                 <w:sz w:val="18"/>
               </w:rPr>
-              <w:t>139</w:t>
+              <w:t>254</w:t>
             </w:r>
           </w:p>
         </w:tc>
@@ -18877,7 +19906,7 @@
               <w:rPr>
                 <w:sz w:val="18"/>
               </w:rPr>
-              <w:t>417</w:t>
+              <w:t>762</w:t>
             </w:r>
           </w:p>
         </w:tc>
@@ -18890,7 +19919,7 @@
               <w:rPr>
                 <w:sz w:val="18"/>
               </w:rPr>
-              <w:t>104250</w:t>
+              <w:t>190500</w:t>
             </w:r>
           </w:p>
         </w:tc>
@@ -19446,6 +20475,97 @@
         <w:pStyle w:val="Heading3"/>
       </w:pPr>
       <w:r>
+        <w:t>Howard S. Sheftman — Attorney (Grade: F)</w:t>
+      </w:r>
+    </w:p>
+    <w:p>
+      <w:r>
+        <w:t>Attorney Howard S. Sheftman — Overall Grade: F (0.0/100). Performance indicators suggest attorney involvement may be adversely affecting case outcomes.</w:t>
+      </w:r>
+    </w:p>
+    <w:p>
+      <w:pPr>
+        <w:pStyle w:val="Heading3"/>
+      </w:pPr>
+      <w:r>
+        <w:t>Nettie Elizabeth Branham — Guardian ad Litem (Grade: F)</w:t>
+      </w:r>
+    </w:p>
+    <w:p>
+      <w:r>
+        <w:t>GAL Nettie Elizabeth Branham — Overall Grade: F (0.0/100). Performance indicators suggest gal involvement may be adversely affecting case outcomes.</w:t>
+      </w:r>
+    </w:p>
+    <w:p>
+      <w:pPr>
+        <w:pStyle w:val="Heading3"/>
+      </w:pPr>
+      <w:r>
+        <w:t>Elizabeth Kipling von Keller — Attorney (Grade: F)</w:t>
+      </w:r>
+    </w:p>
+    <w:p>
+      <w:r>
+        <w:t>Attorney Elizabeth Kipling von Keller — Overall Grade: F (0.0/100). Performance indicators suggest attorney involvement may be adversely affecting case outcomes.</w:t>
+      </w:r>
+    </w:p>
+    <w:p>
+      <w:pPr>
+        <w:pStyle w:val="Heading3"/>
+      </w:pPr>
+      <w:r>
+        <w:t>Rosalyn Frierson-Smith — Judge (Grade: F)</w:t>
+      </w:r>
+    </w:p>
+    <w:p>
+      <w:r>
+        <w:t>Judge Rosalyn Frierson-Smith — Overall Grade: F (0.0/100). Performance indicators suggest potential issues with judicial conduct that may warrant formal review or complaint filing.</w:t>
+      </w:r>
+    </w:p>
+    <w:p>
+      <w:pPr>
+        <w:pStyle w:val="Heading3"/>
+      </w:pPr>
+      <w:r>
+        <w:t>Jon Afman — Attorney (Grade: F)</w:t>
+      </w:r>
+    </w:p>
+    <w:p>
+      <w:r>
+        <w:t>Attorney Jon Afman — Overall Grade: F (0.0/100). Performance indicators suggest attorney involvement may be adversely affecting case outcomes.</w:t>
+      </w:r>
+    </w:p>
+    <w:p>
+      <w:pPr>
+        <w:pStyle w:val="Heading3"/>
+      </w:pPr>
+      <w:r>
+        <w:t>Melanie Spears — Attorney (Grade: F)</w:t>
+      </w:r>
+    </w:p>
+    <w:p>
+      <w:r>
+        <w:t>Attorney Melanie Spears — Overall Grade: F (0.0/100). Performance indicators suggest attorney involvement may be adversely affecting case outcomes.</w:t>
+      </w:r>
+    </w:p>
+    <w:p>
+      <w:pPr>
+        <w:pStyle w:val="Heading3"/>
+      </w:pPr>
+      <w:r>
+        <w:t>Bryn Colette Sarvis — Attorney (Grade: F)</w:t>
+      </w:r>
+    </w:p>
+    <w:p>
+      <w:r>
+        <w:t>Attorney Bryn Colette Sarvis — Overall Grade: F (0.0/100). Performance indicators suggest attorney involvement may be adversely affecting case outcomes.</w:t>
+      </w:r>
+    </w:p>
+    <w:p>
+      <w:pPr>
+        <w:pStyle w:val="Heading3"/>
+      </w:pPr>
+      <w:r>
         <w:t>NaT — Attorney (Grade: F)</w:t>
       </w:r>
     </w:p>
@@ -19467,7 +20587,7 @@
         <w:pStyle w:val="ListBullet2"/>
       </w:pPr>
       <w:r>
-        <w:t>HIGH COST: Estimated $104,250 earned from this case</w:t>
+        <w:t>HIGH COST: Estimated $190,500 earned from this case</w:t>
       </w:r>
     </w:p>
     <w:p>
@@ -19525,7 +20645,7 @@
         <w:t xml:space="preserve">Description: </w:t>
       </w:r>
       <w:r>
-        <w:t>Case has been ongoing for 26.21 years (9574 days)</w:t>
+        <w:t>Case has been ongoing for 29.66 years (10834 days)</w:t>
       </w:r>
     </w:p>
     <w:p>
@@ -19581,7 +20701,7 @@
         <w:t xml:space="preserve">Description: </w:t>
       </w:r>
       <w:r>
-        <w:t>110 filings made within 7 days of prior filings (81% of all filings)</w:t>
+        <w:t>207 filings made within 7 days of prior filings (82% of all filings)</w:t>
       </w:r>
     </w:p>
     <w:p>
@@ -20035,6 +21155,56 @@
         <w:rPr>
           <w:b/>
         </w:rPr>
+        <w:t xml:space="preserve">Judge Greg Seigler (Judge) </w:t>
+      </w:r>
+      <w:r>
+        <w:t xml:space="preserve">↔ </w:t>
+      </w:r>
+      <w:r>
+        <w:rPr>
+          <w:b/>
+        </w:rPr>
+        <w:t>Rosalyn Frierson-Smith (Judge)</w:t>
+      </w:r>
+    </w:p>
+    <w:p>
+      <w:pPr>
+        <w:pStyle w:val="ListBullet"/>
+      </w:pPr>
+      <w:r>
+        <w:t xml:space="preserve">  Connection: SHARED_ORGANIZATION — Both affiliated with: lexington family court</w:t>
+      </w:r>
+    </w:p>
+    <w:p>
+      <w:r>
+        <w:rPr>
+          <w:b/>
+        </w:rPr>
+        <w:t xml:space="preserve">Judge Greg Seigler (Judge) </w:t>
+      </w:r>
+      <w:r>
+        <w:t xml:space="preserve">↔ </w:t>
+      </w:r>
+      <w:r>
+        <w:rPr>
+          <w:b/>
+        </w:rPr>
+        <w:t>Melanie Spears (Court Staff/Clerk)</w:t>
+      </w:r>
+    </w:p>
+    <w:p>
+      <w:pPr>
+        <w:pStyle w:val="ListBullet"/>
+      </w:pPr>
+      <w:r>
+        <w:t xml:space="preserve">  Connection: SHARED_ORGANIZATION — Both affiliated with: lexington family court</w:t>
+      </w:r>
+    </w:p>
+    <w:p>
+      <w:r>
+        <w:rPr>
+          <w:b/>
+        </w:rPr>
         <w:t xml:space="preserve">Judge Huntley Crouch (Judge) </w:t>
       </w:r>
       <w:r>
@@ -20045,6 +21215,131 @@
           <w:b/>
         </w:rPr>
         <w:t>Judge Robert Newton (Judge)</w:t>
+      </w:r>
+    </w:p>
+    <w:p>
+      <w:pPr>
+        <w:pStyle w:val="ListBullet"/>
+      </w:pPr>
+      <w:r>
+        <w:t xml:space="preserve">  Connection: SHARED_ORGANIZATION — Both affiliated with: lexington family court</w:t>
+      </w:r>
+    </w:p>
+    <w:p>
+      <w:r>
+        <w:rPr>
+          <w:b/>
+        </w:rPr>
+        <w:t xml:space="preserve">Judge Huntley Crouch (Judge) </w:t>
+      </w:r>
+      <w:r>
+        <w:t xml:space="preserve">↔ </w:t>
+      </w:r>
+      <w:r>
+        <w:rPr>
+          <w:b/>
+        </w:rPr>
+        <w:t>Rosalyn Frierson-Smith (Judge)</w:t>
+      </w:r>
+    </w:p>
+    <w:p>
+      <w:pPr>
+        <w:pStyle w:val="ListBullet"/>
+      </w:pPr>
+      <w:r>
+        <w:t xml:space="preserve">  Connection: SHARED_ORGANIZATION — Both affiliated with: lexington family court</w:t>
+      </w:r>
+    </w:p>
+    <w:p>
+      <w:r>
+        <w:rPr>
+          <w:b/>
+        </w:rPr>
+        <w:t xml:space="preserve">Judge Huntley Crouch (Judge) </w:t>
+      </w:r>
+      <w:r>
+        <w:t xml:space="preserve">↔ </w:t>
+      </w:r>
+      <w:r>
+        <w:rPr>
+          <w:b/>
+        </w:rPr>
+        <w:t>Melanie Spears (Court Staff/Clerk)</w:t>
+      </w:r>
+    </w:p>
+    <w:p>
+      <w:pPr>
+        <w:pStyle w:val="ListBullet"/>
+      </w:pPr>
+      <w:r>
+        <w:t xml:space="preserve">  Connection: SHARED_ORGANIZATION — Both affiliated with: lexington family court</w:t>
+      </w:r>
+    </w:p>
+    <w:p>
+      <w:r>
+        <w:rPr>
+          <w:b/>
+        </w:rPr>
+        <w:t xml:space="preserve">Judge Robert Newton (Judge) </w:t>
+      </w:r>
+      <w:r>
+        <w:t xml:space="preserve">↔ </w:t>
+      </w:r>
+      <w:r>
+        <w:rPr>
+          <w:b/>
+        </w:rPr>
+        <w:t>Rosalyn Frierson-Smith (Judge)</w:t>
+      </w:r>
+    </w:p>
+    <w:p>
+      <w:pPr>
+        <w:pStyle w:val="ListBullet"/>
+      </w:pPr>
+      <w:r>
+        <w:t xml:space="preserve">  Connection: SHARED_ORGANIZATION — Both affiliated with: lexington family court</w:t>
+      </w:r>
+    </w:p>
+    <w:p>
+      <w:r>
+        <w:rPr>
+          <w:b/>
+        </w:rPr>
+        <w:t xml:space="preserve">Judge Robert Newton (Judge) </w:t>
+      </w:r>
+      <w:r>
+        <w:t xml:space="preserve">↔ </w:t>
+      </w:r>
+      <w:r>
+        <w:rPr>
+          <w:b/>
+        </w:rPr>
+        <w:t>Melanie Spears (Court Staff/Clerk)</w:t>
+      </w:r>
+    </w:p>
+    <w:p>
+      <w:pPr>
+        <w:pStyle w:val="ListBullet"/>
+      </w:pPr>
+      <w:r>
+        <w:t xml:space="preserve">  Connection: SHARED_ORGANIZATION — Both affiliated with: lexington family court</w:t>
+      </w:r>
+    </w:p>
+    <w:p>
+      <w:r>
+        <w:rPr>
+          <w:b/>
+        </w:rPr>
+        <w:t xml:space="preserve">Rosalyn Frierson-Smith (Judge) </w:t>
+      </w:r>
+      <w:r>
+        <w:t xml:space="preserve">↔ </w:t>
+      </w:r>
+      <w:r>
+        <w:rPr>
+          <w:b/>
+        </w:rPr>
+        <w:t>Melanie Spears (Court Staff/Clerk)</w:t>
       </w:r>
     </w:p>
     <w:p>
@@ -20078,6 +21373,156 @@
       </w:pPr>
       <w:r>
         <w:t xml:space="preserve">  Connection: SHARED_ORGANIZATION — Both affiliated with: pozsik &amp; carpenter llc</w:t>
+      </w:r>
+    </w:p>
+    <w:p>
+      <w:r>
+        <w:rPr>
+          <w:b/>
+        </w:rPr>
+        <w:t xml:space="preserve">Howard S. Sheftman (Attorney) </w:t>
+      </w:r>
+      <w:r>
+        <w:t xml:space="preserve">↔ </w:t>
+      </w:r>
+      <w:r>
+        <w:rPr>
+          <w:b/>
+        </w:rPr>
+        <w:t>Nettie Elizabeth Branham (Guardian Ad Litem)</w:t>
+      </w:r>
+    </w:p>
+    <w:p>
+      <w:pPr>
+        <w:pStyle w:val="ListBullet"/>
+      </w:pPr>
+      <w:r>
+        <w:t xml:space="preserve">  Connection: SHARED_ORGANIZATION — Both affiliated with: sc bar</w:t>
+      </w:r>
+    </w:p>
+    <w:p>
+      <w:r>
+        <w:rPr>
+          <w:b/>
+        </w:rPr>
+        <w:t xml:space="preserve">Howard S. Sheftman (Attorney) </w:t>
+      </w:r>
+      <w:r>
+        <w:t xml:space="preserve">↔ </w:t>
+      </w:r>
+      <w:r>
+        <w:rPr>
+          <w:b/>
+        </w:rPr>
+        <w:t>Elizabeth Kipling von Keller (Attorney)</w:t>
+      </w:r>
+    </w:p>
+    <w:p>
+      <w:pPr>
+        <w:pStyle w:val="ListBullet"/>
+      </w:pPr>
+      <w:r>
+        <w:t xml:space="preserve">  Connection: SHARED_ORGANIZATION — Both affiliated with: sc bar</w:t>
+      </w:r>
+    </w:p>
+    <w:p>
+      <w:r>
+        <w:rPr>
+          <w:b/>
+        </w:rPr>
+        <w:t xml:space="preserve">Howard S. Sheftman (Attorney) </w:t>
+      </w:r>
+      <w:r>
+        <w:t xml:space="preserve">↔ </w:t>
+      </w:r>
+      <w:r>
+        <w:rPr>
+          <w:b/>
+        </w:rPr>
+        <w:t>Bryn Colette Sarvis (Attorney (Plaintiff in 2026DR3200579))</w:t>
+      </w:r>
+    </w:p>
+    <w:p>
+      <w:pPr>
+        <w:pStyle w:val="ListBullet"/>
+      </w:pPr>
+      <w:r>
+        <w:t xml:space="preserve">  Connection: SHARED_ORGANIZATION — Both affiliated with: sc bar</w:t>
+      </w:r>
+    </w:p>
+    <w:p>
+      <w:r>
+        <w:rPr>
+          <w:b/>
+        </w:rPr>
+        <w:t xml:space="preserve">Nettie Elizabeth Branham (Guardian Ad Litem) </w:t>
+      </w:r>
+      <w:r>
+        <w:t xml:space="preserve">↔ </w:t>
+      </w:r>
+      <w:r>
+        <w:rPr>
+          <w:b/>
+        </w:rPr>
+        <w:t>Elizabeth Kipling von Keller (Attorney)</w:t>
+      </w:r>
+    </w:p>
+    <w:p>
+      <w:pPr>
+        <w:pStyle w:val="ListBullet"/>
+      </w:pPr>
+      <w:r>
+        <w:t xml:space="preserve">  Connection: SHARED_ORGANIZATION — Both affiliated with: sc bar</w:t>
+      </w:r>
+    </w:p>
+    <w:p>
+      <w:r>
+        <w:rPr>
+          <w:b/>
+        </w:rPr>
+        <w:t xml:space="preserve">Nettie Elizabeth Branham (Guardian Ad Litem) </w:t>
+      </w:r>
+      <w:r>
+        <w:t xml:space="preserve">↔ </w:t>
+      </w:r>
+      <w:r>
+        <w:rPr>
+          <w:b/>
+        </w:rPr>
+        <w:t>Bryn Colette Sarvis (Attorney (Plaintiff in 2026DR3200579))</w:t>
+      </w:r>
+    </w:p>
+    <w:p>
+      <w:pPr>
+        <w:pStyle w:val="ListBullet"/>
+      </w:pPr>
+      <w:r>
+        <w:t xml:space="preserve">  Connection: SHARED_ORGANIZATION — Both affiliated with: sc bar</w:t>
+      </w:r>
+    </w:p>
+    <w:p>
+      <w:r>
+        <w:rPr>
+          <w:b/>
+        </w:rPr>
+        <w:t xml:space="preserve">Elizabeth Kipling von Keller (Attorney) </w:t>
+      </w:r>
+      <w:r>
+        <w:t xml:space="preserve">↔ </w:t>
+      </w:r>
+      <w:r>
+        <w:rPr>
+          <w:b/>
+        </w:rPr>
+        <w:t>Bryn Colette Sarvis (Attorney (Plaintiff in 2026DR3200579))</w:t>
+      </w:r>
+    </w:p>
+    <w:p>
+      <w:pPr>
+        <w:pStyle w:val="ListBullet"/>
+      </w:pPr>
+      <w:r>
+        <w:t xml:space="preserve">  Connection: SHARED_ORGANIZATION — Both affiliated with: sc bar</w:t>
       </w:r>
     </w:p>
     <w:p>
@@ -20157,7 +21602,7 @@
         <w:pStyle w:val="ListBullet"/>
       </w:pPr>
       <w:r>
-        <w:t>Case Duration: {'case_start': '1996-08-09', 'most_recent_filing': '2022-10-26', 'duration_days': 9574, 'duration_months': 314.5, 'duration_years': 26.21, 'total_filings': 139, 'filings_per_month': 0.44}</w:t>
+        <w:t>Case Duration: {'case_start': '1996-08-09', 'most_recent_filing': '2026-04-08', 'duration_days': 10834, 'duration_months': 355.9, 'duration_years': 29.66, 'total_filings': 254, 'filings_per_month': 0.71}</w:t>
       </w:r>
     </w:p>
     <w:p>
@@ -20165,7 +21610,7 @@
         <w:pStyle w:val="ListBullet"/>
       </w:pPr>
       <w:r>
-        <w:t>Filing Rate Trend: 47.313</w:t>
+        <w:t>Filing Rate Trend: 7.097</w:t>
       </w:r>
     </w:p>
     <w:p>
@@ -20181,7 +21626,7 @@
         <w:pStyle w:val="ListBullet"/>
       </w:pPr>
       <w:r>
-        <w:t>Projected Additional Months: 567</w:t>
+        <w:t>Projected Additional Months: 85</w:t>
       </w:r>
     </w:p>
     <w:p>
@@ -20189,7 +21634,7 @@
         <w:pStyle w:val="ListBullet"/>
       </w:pPr>
       <w:r>
-        <w:t>Projected End Date: 2072-11-03</w:t>
+        <w:t>Projected End Date: 2033-04-02</w:t>
       </w:r>
     </w:p>
     <w:p>
@@ -20197,7 +21642,7 @@
         <w:pStyle w:val="ListBullet"/>
       </w:pPr>
       <w:r>
-        <w:t>Current Filing Rate Per Month: 0.44</w:t>
+        <w:t>Current Filing Rate Per Month: 0.71</w:t>
       </w:r>
     </w:p>
     <w:p>
@@ -20413,7 +21858,7 @@
       <w:r>
         <w:drawing>
           <wp:inline xmlns:a="http://schemas.openxmlformats.org/drawingml/2006/main" xmlns:pic="http://schemas.openxmlformats.org/drawingml/2006/picture">
-            <wp:extent cx="5486400" cy="3641171"/>
+            <wp:extent cx="5486400" cy="3639127"/>
             <wp:docPr id="6" name="Picture 6"/>
             <wp:cNvGraphicFramePr>
               <a:graphicFrameLocks noChangeAspect="1"/>
@@ -20434,7 +21879,7 @@
                   <pic:spPr>
                     <a:xfrm>
                       <a:off x="0" y="0"/>
-                      <a:ext cx="5486400" cy="3641171"/>
+                      <a:ext cx="5486400" cy="3639127"/>
                     </a:xfrm>
                     <a:prstGeom prst="rect"/>
                   </pic:spPr>
@@ -20524,7 +21969,7 @@
       <w:r>
         <w:drawing>
           <wp:inline xmlns:a="http://schemas.openxmlformats.org/drawingml/2006/main" xmlns:pic="http://schemas.openxmlformats.org/drawingml/2006/picture">
-            <wp:extent cx="5486400" cy="8801613"/>
+            <wp:extent cx="5486400" cy="10739074"/>
             <wp:docPr id="9" name="Picture 9"/>
             <wp:cNvGraphicFramePr>
               <a:graphicFrameLocks noChangeAspect="1"/>
@@ -20545,7 +21990,7 @@
                   <pic:spPr>
                     <a:xfrm>
                       <a:off x="0" y="0"/>
-                      <a:ext cx="5486400" cy="8801613"/>
+                      <a:ext cx="5486400" cy="10739074"/>
                     </a:xfrm>
                     <a:prstGeom prst="rect"/>
                   </pic:spPr>

</xml_diff>